<commit_message>
Update Word thesis and PDF with Lyam regime-dependent findings
- generate_thesis_word.js: updated abstract, Ch1 (4 sub-questions/contributions),
  Ch3 (descriptive stats table, CDD=22C), Ch4 (feature importance corrected,
  new Section 4.7 with 2022 validation tables), Ch6 (regime-dependent narrative,
  why-crisis-breaks-redundancy), Ch7 (second finding rewritten)
- Thesis_FR_Power_Prices.docx: regenerated with all updates
- thesis/main.pdf: recompiled full 4-pass (pdflatex+bibtex), 63 pages

Co-Authored-By: Claude Sonnet 4.6 <noreply@anthropic.com>
</commit_message>
<xml_diff>
--- a/outputs/Thesis_FR_Power_Prices.docx
+++ b/outputs/Thesis_FR_Power_Prices.docx
@@ -318,7 +318,7 @@
           <w:sz w:val="24"/>
           <w:szCs w:val="24"/>
         </w:rPr>
-        <w:t xml:space="preserve">Four models are compared: a naive lag-168h benchmark (Model A), a Random Forest without weather features (Model B), a Random Forest with full weather features (Model C), and an XGBoost model with weather features (Model D). Models are evaluated on a strict out-of-sample test set covering May 2024 to April 2025 (8,640 hours).</w:t>
+        <w:t xml:space="preserve">Four models are compared: a naive lag-168h benchmark (Model A), a Random Forest without weather features (Model B), a Random Forest with full weather features (Model C), and an XGBoost model with weather features (Model D). Models are evaluated across two test periods: a primary stable-market test set covering May 2024 to April 2025 (8,640 hours), and a robustness validation on the full year 2022 (8,760 hours) — the height of the European energy crisis.</w:t>
       </w:r>
     </w:p>
     <w:p>
@@ -337,7 +337,7 @@
           <w:sz w:val="24"/>
           <w:szCs w:val="24"/>
         </w:rPr>
-        <w:t xml:space="preserve">Our central finding is that weather features do not significantly improve forecast accuracy over the enriched fundamental model, as confirmed by a Diebold-Mariano test (p = 0.572). Both Random Forest models achieve a Mean Absolute Error of approximately 16.9 EUR/MWh and R2 = 0.776, representing a 49% reduction in error over the naive benchmark. A day-ahead directional trading backtest confirms the economic value of these forecasts, with RF models generating net profits of approximately 136,700 EUR/MW over the test period with a maximum drawdown ten times smaller than the naive strategy.</w:t>
+        <w:t xml:space="preserve">Our central finding is that the marginal value of weather features is regime-dependent. In the stable 2024-25 period, weather features do not significantly improve forecast accuracy (Diebold-Mariano test p = 0.572). However, during the 2022 energy crisis, weather features become highly significant (DM = -13.27, p &lt; 0.001), reducing MAE by 0.73 EUR/MWh. Both Random Forest models achieve MAE of approximately 16.9 EUR/MWh and R2 = 0.776 in the stable period, representing a 49% reduction in error over the naive benchmark. A day-ahead directional trading backtest confirms the economic value of these forecasts, with RF models generating net profits of approximately 136,700 EUR/MW over the test period (Sharpe ratio 19.5) with a maximum drawdown ten times smaller than the naive strategy.</w:t>
       </w:r>
     </w:p>
     <w:p>
@@ -542,7 +542,7 @@
           <w:sz w:val="24"/>
           <w:szCs w:val="24"/>
         </w:rPr>
-        <w:t xml:space="preserve">This question is decomposed into three sub-questions:</w:t>
+        <w:t xml:space="preserve">This question is decomposed into four sub-questions:</w:t>
       </w:r>
     </w:p>
     <w:p>
@@ -580,7 +580,7 @@
           <w:sz w:val="24"/>
           <w:szCs w:val="24"/>
         </w:rPr>
-        <w:t xml:space="preserve">Does the addition of meteorological features produce a statistically significant improvement over a model built on market fundamentals alone?</w:t>
+        <w:t xml:space="preserve">Does the addition of meteorological features produce a statistically significant improvement over a model built on market fundamentals alone — and is that contribution stable across market regimes?</w:t>
       </w:r>
     </w:p>
     <w:p>
@@ -599,6 +599,25 @@
           <w:sz w:val="24"/>
           <w:szCs w:val="24"/>
         </w:rPr>
+        <w:t xml:space="preserve">Does the marginal value of weather features differ between the stable 2024-25 period and the 2022 energy crisis? What structural mechanisms explain any difference?</w:t>
+      </w:r>
+    </w:p>
+    <w:p>
+      <w:pPr>
+        <w:pStyle w:val="ListParagraph"/>
+        <w:numPr>
+          <w:ilvl w:val="0"/>
+          <w:numId w:val="2"/>
+        </w:numPr>
+        <w:spacing w:after="80" w:before="80"/>
+      </w:pPr>
+      <w:r>
+        <w:rPr>
+          <w:rFonts w:ascii="Calibri" w:cs="Calibri" w:eastAsia="Calibri" w:hAnsi="Calibri"/>
+          <w:color w:val="000000"/>
+          <w:sz w:val="24"/>
+          <w:szCs w:val="24"/>
+        </w:rPr>
         <w:t xml:space="preserve">Can the predictive improvement of these models be translated into economically meaningful returns through a day-ahead directional trading strategy?</w:t>
       </w:r>
     </w:p>
@@ -634,7 +653,7 @@
           <w:sz w:val="24"/>
           <w:szCs w:val="24"/>
         </w:rPr>
-        <w:t xml:space="preserve">This thesis makes three contributions to the electricity price forecasting literature:</w:t>
+        <w:t xml:space="preserve">This thesis makes four contributions to the electricity price forecasting literature:</w:t>
       </w:r>
     </w:p>
     <w:p>
@@ -672,7 +691,26 @@
           <w:sz w:val="24"/>
           <w:szCs w:val="24"/>
         </w:rPr>
-        <w:t xml:space="preserve">Rigorous ablation study: a four-model experiment (A/B/C/D) that isolates the marginal contribution of weather features using a Diebold-Mariano test with Harvey-Leybourne-Newbold correction.</w:t>
+        <w:t xml:space="preserve">Rigorous weather ablation with regime comparison: a four-model experiment (A/B/C/D) isolating the marginal contribution of weather features using Diebold-Mariano tests. Key finding: p = 0.572 in the stable 2024-25 regime; p &lt; 0.001 (DM = -13.27) in the 2022 crisis. This supports the information redundancy hypothesis.</w:t>
+      </w:r>
+    </w:p>
+    <w:p>
+      <w:pPr>
+        <w:pStyle w:val="ListParagraph"/>
+        <w:numPr>
+          <w:ilvl w:val="0"/>
+          <w:numId w:val="3"/>
+        </w:numPr>
+        <w:spacing w:after="60" w:before="60"/>
+      </w:pPr>
+      <w:r>
+        <w:rPr>
+          <w:rFonts w:ascii="Calibri" w:cs="Calibri" w:eastAsia="Calibri" w:hAnsi="Calibri"/>
+          <w:color w:val="000000"/>
+          <w:sz w:val="24"/>
+          <w:szCs w:val="24"/>
+        </w:rPr>
+        <w:t xml:space="preserve">The 2022 energy crisis as a natural experiment: models retrained on 2018-2021 and tested on full-year 2022, revealing that extreme market regimes break the indirect weather channels and make raw meteorological variables directly informative.</w:t>
       </w:r>
     </w:p>
     <w:p>
@@ -1540,7 +1578,7 @@
           <w:sz w:val="28"/>
           <w:szCs w:val="28"/>
         </w:rPr>
-        <w:t xml:space="preserve">3.3 Feature Engineering</w:t>
+        <w:t xml:space="preserve">3.3 Descriptive Statistics</w:t>
       </w:r>
     </w:p>
     <w:p>
@@ -1559,23 +1597,2187 @@
           <w:sz w:val="24"/>
           <w:szCs w:val="24"/>
         </w:rPr>
-        <w:t xml:space="preserve">From the raw data sources, we construct 35 features organised into five categories.</w:t>
-      </w:r>
-    </w:p>
-    <w:p>
-      <w:pPr>
-        <w:spacing w:after="100" w:before="200"/>
-      </w:pPr>
-      <w:r>
-        <w:rPr>
-          <w:rFonts w:ascii="Calibri" w:cs="Calibri" w:eastAsia="Calibri" w:hAnsi="Calibri"/>
-          <w:b/>
-          <w:bCs/>
-          <w:color w:val="000000"/>
-          <w:sz w:val="26"/>
-          <w:szCs w:val="26"/>
-        </w:rPr>
-        <w:t xml:space="preserve">3.3.1 Calendar Features</w:t>
+        <w:t xml:space="preserve">The full dataset comprises 64,056 hourly observations after merging all sources and removing incomplete records. Table 0 below reports summary statistics for key variables.</w:t>
+      </w:r>
+    </w:p>
+    <w:p>
+      <w:pPr>
+        <w:spacing w:after="120" w:before="120"/>
+      </w:pPr>
+      <w:r>
+        <w:rPr>
+          <w:rFonts w:ascii="Calibri" w:cs="Calibri" w:eastAsia="Calibri" w:hAnsi="Calibri"/>
+          <w:color w:val="000000"/>
+          <w:sz w:val="24"/>
+          <w:szCs w:val="24"/>
+        </w:rPr>
+        <w:t xml:space="preserve"/>
+      </w:r>
+    </w:p>
+    <w:tbl>
+      <w:tblPr>
+        <w:tblW w:type="dxa" w:w="8000"/>
+        <w:tblBorders>
+          <w:top w:val="single" w:color="auto" w:sz="4"/>
+          <w:left w:val="single" w:color="auto" w:sz="4"/>
+          <w:bottom w:val="single" w:color="auto" w:sz="4"/>
+          <w:right w:val="single" w:color="auto" w:sz="4"/>
+          <w:insideH w:val="single" w:color="auto" w:sz="4"/>
+          <w:insideV w:val="single" w:color="auto" w:sz="4"/>
+        </w:tblBorders>
+      </w:tblPr>
+      <w:tblGrid>
+        <w:gridCol w:w="2200"/>
+        <w:gridCol w:w="900"/>
+        <w:gridCol w:w="900"/>
+        <w:gridCol w:w="900"/>
+        <w:gridCol w:w="1000"/>
+        <w:gridCol w:w="900"/>
+        <w:gridCol w:w="1200"/>
+      </w:tblGrid>
+      <w:tr>
+        <w:tc>
+          <w:tcPr>
+            <w:tcW w:type="dxa" w:w="2200"/>
+            <w:tcBorders>
+              <w:top w:val="single" w:color="000000" w:sz="4"/>
+              <w:left w:val="single" w:color="000000" w:sz="4"/>
+              <w:bottom w:val="single" w:color="000000" w:sz="4"/>
+              <w:right w:val="single" w:color="000000" w:sz="4"/>
+            </w:tcBorders>
+            <w:tcMar>
+              <w:top w:type="dxa" w:w="80"/>
+              <w:left w:type="dxa" w:w="120"/>
+              <w:bottom w:type="dxa" w:w="80"/>
+              <w:right w:type="dxa" w:w="120"/>
+            </w:tcMar>
+          </w:tcPr>
+          <w:p>
+            <w:pPr>
+              <w:jc w:val="left"/>
+            </w:pPr>
+            <w:r>
+              <w:rPr>
+                <w:rFonts w:ascii="Calibri" w:cs="Calibri" w:eastAsia="Calibri" w:hAnsi="Calibri"/>
+                <w:b/>
+                <w:bCs/>
+                <w:color w:val="000000"/>
+                <w:sz w:val="20"/>
+                <w:szCs w:val="20"/>
+              </w:rPr>
+              <w:t xml:space="preserve">Variable</w:t>
+            </w:r>
+          </w:p>
+        </w:tc>
+        <w:tc>
+          <w:tcPr>
+            <w:tcW w:type="dxa" w:w="900"/>
+            <w:tcBorders>
+              <w:top w:val="single" w:color="000000" w:sz="4"/>
+              <w:left w:val="single" w:color="000000" w:sz="4"/>
+              <w:bottom w:val="single" w:color="000000" w:sz="4"/>
+              <w:right w:val="single" w:color="000000" w:sz="4"/>
+            </w:tcBorders>
+            <w:tcMar>
+              <w:top w:type="dxa" w:w="80"/>
+              <w:left w:type="dxa" w:w="120"/>
+              <w:bottom w:type="dxa" w:w="80"/>
+              <w:right w:type="dxa" w:w="120"/>
+            </w:tcMar>
+          </w:tcPr>
+          <w:p>
+            <w:pPr>
+              <w:jc w:val="center"/>
+            </w:pPr>
+            <w:r>
+              <w:rPr>
+                <w:rFonts w:ascii="Calibri" w:cs="Calibri" w:eastAsia="Calibri" w:hAnsi="Calibri"/>
+                <w:b/>
+                <w:bCs/>
+                <w:color w:val="000000"/>
+                <w:sz w:val="20"/>
+                <w:szCs w:val="20"/>
+              </w:rPr>
+              <w:t xml:space="preserve">Mean</w:t>
+            </w:r>
+          </w:p>
+        </w:tc>
+        <w:tc>
+          <w:tcPr>
+            <w:tcW w:type="dxa" w:w="900"/>
+            <w:tcBorders>
+              <w:top w:val="single" w:color="000000" w:sz="4"/>
+              <w:left w:val="single" w:color="000000" w:sz="4"/>
+              <w:bottom w:val="single" w:color="000000" w:sz="4"/>
+              <w:right w:val="single" w:color="000000" w:sz="4"/>
+            </w:tcBorders>
+            <w:tcMar>
+              <w:top w:type="dxa" w:w="80"/>
+              <w:left w:type="dxa" w:w="120"/>
+              <w:bottom w:type="dxa" w:w="80"/>
+              <w:right w:type="dxa" w:w="120"/>
+            </w:tcMar>
+          </w:tcPr>
+          <w:p>
+            <w:pPr>
+              <w:jc w:val="center"/>
+            </w:pPr>
+            <w:r>
+              <w:rPr>
+                <w:rFonts w:ascii="Calibri" w:cs="Calibri" w:eastAsia="Calibri" w:hAnsi="Calibri"/>
+                <w:b/>
+                <w:bCs/>
+                <w:color w:val="000000"/>
+                <w:sz w:val="20"/>
+                <w:szCs w:val="20"/>
+              </w:rPr>
+              <w:t xml:space="preserve">Std Dev</w:t>
+            </w:r>
+          </w:p>
+        </w:tc>
+        <w:tc>
+          <w:tcPr>
+            <w:tcW w:type="dxa" w:w="900"/>
+            <w:tcBorders>
+              <w:top w:val="single" w:color="000000" w:sz="4"/>
+              <w:left w:val="single" w:color="000000" w:sz="4"/>
+              <w:bottom w:val="single" w:color="000000" w:sz="4"/>
+              <w:right w:val="single" w:color="000000" w:sz="4"/>
+            </w:tcBorders>
+            <w:tcMar>
+              <w:top w:type="dxa" w:w="80"/>
+              <w:left w:type="dxa" w:w="120"/>
+              <w:bottom w:type="dxa" w:w="80"/>
+              <w:right w:type="dxa" w:w="120"/>
+            </w:tcMar>
+          </w:tcPr>
+          <w:p>
+            <w:pPr>
+              <w:jc w:val="center"/>
+            </w:pPr>
+            <w:r>
+              <w:rPr>
+                <w:rFonts w:ascii="Calibri" w:cs="Calibri" w:eastAsia="Calibri" w:hAnsi="Calibri"/>
+                <w:b/>
+                <w:bCs/>
+                <w:color w:val="000000"/>
+                <w:sz w:val="20"/>
+                <w:szCs w:val="20"/>
+              </w:rPr>
+              <w:t xml:space="preserve">Min</w:t>
+            </w:r>
+          </w:p>
+        </w:tc>
+        <w:tc>
+          <w:tcPr>
+            <w:tcW w:type="dxa" w:w="1000"/>
+            <w:tcBorders>
+              <w:top w:val="single" w:color="000000" w:sz="4"/>
+              <w:left w:val="single" w:color="000000" w:sz="4"/>
+              <w:bottom w:val="single" w:color="000000" w:sz="4"/>
+              <w:right w:val="single" w:color="000000" w:sz="4"/>
+            </w:tcBorders>
+            <w:tcMar>
+              <w:top w:type="dxa" w:w="80"/>
+              <w:left w:type="dxa" w:w="120"/>
+              <w:bottom w:type="dxa" w:w="80"/>
+              <w:right w:type="dxa" w:w="120"/>
+            </w:tcMar>
+          </w:tcPr>
+          <w:p>
+            <w:pPr>
+              <w:jc w:val="center"/>
+            </w:pPr>
+            <w:r>
+              <w:rPr>
+                <w:rFonts w:ascii="Calibri" w:cs="Calibri" w:eastAsia="Calibri" w:hAnsi="Calibri"/>
+                <w:b/>
+                <w:bCs/>
+                <w:color w:val="000000"/>
+                <w:sz w:val="20"/>
+                <w:szCs w:val="20"/>
+              </w:rPr>
+              <w:t xml:space="preserve">Median</w:t>
+            </w:r>
+          </w:p>
+        </w:tc>
+        <w:tc>
+          <w:tcPr>
+            <w:tcW w:type="dxa" w:w="900"/>
+            <w:tcBorders>
+              <w:top w:val="single" w:color="000000" w:sz="4"/>
+              <w:left w:val="single" w:color="000000" w:sz="4"/>
+              <w:bottom w:val="single" w:color="000000" w:sz="4"/>
+              <w:right w:val="single" w:color="000000" w:sz="4"/>
+            </w:tcBorders>
+            <w:tcMar>
+              <w:top w:type="dxa" w:w="80"/>
+              <w:left w:type="dxa" w:w="120"/>
+              <w:bottom w:type="dxa" w:w="80"/>
+              <w:right w:type="dxa" w:w="120"/>
+            </w:tcMar>
+          </w:tcPr>
+          <w:p>
+            <w:pPr>
+              <w:jc w:val="center"/>
+            </w:pPr>
+            <w:r>
+              <w:rPr>
+                <w:rFonts w:ascii="Calibri" w:cs="Calibri" w:eastAsia="Calibri" w:hAnsi="Calibri"/>
+                <w:b/>
+                <w:bCs/>
+                <w:color w:val="000000"/>
+                <w:sz w:val="20"/>
+                <w:szCs w:val="20"/>
+              </w:rPr>
+              <w:t xml:space="preserve">Max</w:t>
+            </w:r>
+          </w:p>
+        </w:tc>
+        <w:tc>
+          <w:tcPr>
+            <w:tcW w:type="dxa" w:w="1200"/>
+            <w:tcBorders>
+              <w:top w:val="single" w:color="000000" w:sz="4"/>
+              <w:left w:val="single" w:color="000000" w:sz="4"/>
+              <w:bottom w:val="single" w:color="000000" w:sz="4"/>
+              <w:right w:val="single" w:color="000000" w:sz="4"/>
+            </w:tcBorders>
+            <w:tcMar>
+              <w:top w:type="dxa" w:w="80"/>
+              <w:left w:type="dxa" w:w="120"/>
+              <w:bottom w:type="dxa" w:w="80"/>
+              <w:right w:type="dxa" w:w="120"/>
+            </w:tcMar>
+          </w:tcPr>
+          <w:p>
+            <w:pPr>
+              <w:jc w:val="center"/>
+            </w:pPr>
+            <w:r>
+              <w:rPr>
+                <w:rFonts w:ascii="Calibri" w:cs="Calibri" w:eastAsia="Calibri" w:hAnsi="Calibri"/>
+                <w:b/>
+                <w:bCs/>
+                <w:color w:val="000000"/>
+                <w:sz w:val="20"/>
+                <w:szCs w:val="20"/>
+              </w:rPr>
+              <w:t xml:space="preserve">Observations</w:t>
+            </w:r>
+          </w:p>
+        </w:tc>
+      </w:tr>
+      <w:tr>
+        <w:tc>
+          <w:tcPr>
+            <w:tcW w:type="dxa" w:w="2200"/>
+            <w:tcBorders>
+              <w:top w:val="single" w:color="000000" w:sz="4"/>
+              <w:left w:val="single" w:color="000000" w:sz="4"/>
+              <w:bottom w:val="single" w:color="000000" w:sz="4"/>
+              <w:right w:val="single" w:color="000000" w:sz="4"/>
+            </w:tcBorders>
+            <w:tcMar>
+              <w:top w:type="dxa" w:w="80"/>
+              <w:left w:type="dxa" w:w="120"/>
+              <w:bottom w:type="dxa" w:w="80"/>
+              <w:right w:type="dxa" w:w="120"/>
+            </w:tcMar>
+          </w:tcPr>
+          <w:p>
+            <w:pPr>
+              <w:jc w:val="left"/>
+            </w:pPr>
+            <w:r>
+              <w:rPr>
+                <w:rFonts w:ascii="Calibri" w:cs="Calibri" w:eastAsia="Calibri" w:hAnsi="Calibri"/>
+                <w:b w:val="false"/>
+                <w:bCs w:val="false"/>
+                <w:color w:val="000000"/>
+                <w:sz w:val="20"/>
+                <w:szCs w:val="20"/>
+              </w:rPr>
+              <w:t xml:space="preserve">Price (EUR/MWh)</w:t>
+            </w:r>
+          </w:p>
+        </w:tc>
+        <w:tc>
+          <w:tcPr>
+            <w:tcW w:type="dxa" w:w="900"/>
+            <w:tcBorders>
+              <w:top w:val="single" w:color="000000" w:sz="4"/>
+              <w:left w:val="single" w:color="000000" w:sz="4"/>
+              <w:bottom w:val="single" w:color="000000" w:sz="4"/>
+              <w:right w:val="single" w:color="000000" w:sz="4"/>
+            </w:tcBorders>
+            <w:tcMar>
+              <w:top w:type="dxa" w:w="80"/>
+              <w:left w:type="dxa" w:w="120"/>
+              <w:bottom w:type="dxa" w:w="80"/>
+              <w:right w:type="dxa" w:w="120"/>
+            </w:tcMar>
+          </w:tcPr>
+          <w:p>
+            <w:pPr>
+              <w:jc w:val="center"/>
+            </w:pPr>
+            <w:r>
+              <w:rPr>
+                <w:rFonts w:ascii="Calibri" w:cs="Calibri" w:eastAsia="Calibri" w:hAnsi="Calibri"/>
+                <w:b w:val="false"/>
+                <w:bCs w:val="false"/>
+                <w:color w:val="000000"/>
+                <w:sz w:val="20"/>
+                <w:szCs w:val="20"/>
+              </w:rPr>
+              <w:t xml:space="preserve">97.5</w:t>
+            </w:r>
+          </w:p>
+        </w:tc>
+        <w:tc>
+          <w:tcPr>
+            <w:tcW w:type="dxa" w:w="900"/>
+            <w:tcBorders>
+              <w:top w:val="single" w:color="000000" w:sz="4"/>
+              <w:left w:val="single" w:color="000000" w:sz="4"/>
+              <w:bottom w:val="single" w:color="000000" w:sz="4"/>
+              <w:right w:val="single" w:color="000000" w:sz="4"/>
+            </w:tcBorders>
+            <w:tcMar>
+              <w:top w:type="dxa" w:w="80"/>
+              <w:left w:type="dxa" w:w="120"/>
+              <w:bottom w:type="dxa" w:w="80"/>
+              <w:right w:type="dxa" w:w="120"/>
+            </w:tcMar>
+          </w:tcPr>
+          <w:p>
+            <w:pPr>
+              <w:jc w:val="center"/>
+            </w:pPr>
+            <w:r>
+              <w:rPr>
+                <w:rFonts w:ascii="Calibri" w:cs="Calibri" w:eastAsia="Calibri" w:hAnsi="Calibri"/>
+                <w:b w:val="false"/>
+                <w:bCs w:val="false"/>
+                <w:color w:val="000000"/>
+                <w:sz w:val="20"/>
+                <w:szCs w:val="20"/>
+              </w:rPr>
+              <w:t xml:space="preserve">118.2</w:t>
+            </w:r>
+          </w:p>
+        </w:tc>
+        <w:tc>
+          <w:tcPr>
+            <w:tcW w:type="dxa" w:w="900"/>
+            <w:tcBorders>
+              <w:top w:val="single" w:color="000000" w:sz="4"/>
+              <w:left w:val="single" w:color="000000" w:sz="4"/>
+              <w:bottom w:val="single" w:color="000000" w:sz="4"/>
+              <w:right w:val="single" w:color="000000" w:sz="4"/>
+            </w:tcBorders>
+            <w:tcMar>
+              <w:top w:type="dxa" w:w="80"/>
+              <w:left w:type="dxa" w:w="120"/>
+              <w:bottom w:type="dxa" w:w="80"/>
+              <w:right w:type="dxa" w:w="120"/>
+            </w:tcMar>
+          </w:tcPr>
+          <w:p>
+            <w:pPr>
+              <w:jc w:val="center"/>
+            </w:pPr>
+            <w:r>
+              <w:rPr>
+                <w:rFonts w:ascii="Calibri" w:cs="Calibri" w:eastAsia="Calibri" w:hAnsi="Calibri"/>
+                <w:b w:val="false"/>
+                <w:bCs w:val="false"/>
+                <w:color w:val="000000"/>
+                <w:sz w:val="20"/>
+                <w:szCs w:val="20"/>
+              </w:rPr>
+              <w:t xml:space="preserve">-200.0</w:t>
+            </w:r>
+          </w:p>
+        </w:tc>
+        <w:tc>
+          <w:tcPr>
+            <w:tcW w:type="dxa" w:w="1000"/>
+            <w:tcBorders>
+              <w:top w:val="single" w:color="000000" w:sz="4"/>
+              <w:left w:val="single" w:color="000000" w:sz="4"/>
+              <w:bottom w:val="single" w:color="000000" w:sz="4"/>
+              <w:right w:val="single" w:color="000000" w:sz="4"/>
+            </w:tcBorders>
+            <w:tcMar>
+              <w:top w:type="dxa" w:w="80"/>
+              <w:left w:type="dxa" w:w="120"/>
+              <w:bottom w:type="dxa" w:w="80"/>
+              <w:right w:type="dxa" w:w="120"/>
+            </w:tcMar>
+          </w:tcPr>
+          <w:p>
+            <w:pPr>
+              <w:jc w:val="center"/>
+            </w:pPr>
+            <w:r>
+              <w:rPr>
+                <w:rFonts w:ascii="Calibri" w:cs="Calibri" w:eastAsia="Calibri" w:hAnsi="Calibri"/>
+                <w:b w:val="false"/>
+                <w:bCs w:val="false"/>
+                <w:color w:val="000000"/>
+                <w:sz w:val="20"/>
+                <w:szCs w:val="20"/>
+              </w:rPr>
+              <w:t xml:space="preserve">70.2</w:t>
+            </w:r>
+          </w:p>
+        </w:tc>
+        <w:tc>
+          <w:tcPr>
+            <w:tcW w:type="dxa" w:w="900"/>
+            <w:tcBorders>
+              <w:top w:val="single" w:color="000000" w:sz="4"/>
+              <w:left w:val="single" w:color="000000" w:sz="4"/>
+              <w:bottom w:val="single" w:color="000000" w:sz="4"/>
+              <w:right w:val="single" w:color="000000" w:sz="4"/>
+            </w:tcBorders>
+            <w:tcMar>
+              <w:top w:type="dxa" w:w="80"/>
+              <w:left w:type="dxa" w:w="120"/>
+              <w:bottom w:type="dxa" w:w="80"/>
+              <w:right w:type="dxa" w:w="120"/>
+            </w:tcMar>
+          </w:tcPr>
+          <w:p>
+            <w:pPr>
+              <w:jc w:val="center"/>
+            </w:pPr>
+            <w:r>
+              <w:rPr>
+                <w:rFonts w:ascii="Calibri" w:cs="Calibri" w:eastAsia="Calibri" w:hAnsi="Calibri"/>
+                <w:b w:val="false"/>
+                <w:bCs w:val="false"/>
+                <w:color w:val="000000"/>
+                <w:sz w:val="20"/>
+                <w:szCs w:val="20"/>
+              </w:rPr>
+              <w:t xml:space="preserve">3,086</w:t>
+            </w:r>
+          </w:p>
+        </w:tc>
+        <w:tc>
+          <w:tcPr>
+            <w:tcW w:type="dxa" w:w="1200"/>
+            <w:tcBorders>
+              <w:top w:val="single" w:color="000000" w:sz="4"/>
+              <w:left w:val="single" w:color="000000" w:sz="4"/>
+              <w:bottom w:val="single" w:color="000000" w:sz="4"/>
+              <w:right w:val="single" w:color="000000" w:sz="4"/>
+            </w:tcBorders>
+            <w:tcMar>
+              <w:top w:type="dxa" w:w="80"/>
+              <w:left w:type="dxa" w:w="120"/>
+              <w:bottom w:type="dxa" w:w="80"/>
+              <w:right w:type="dxa" w:w="120"/>
+            </w:tcMar>
+          </w:tcPr>
+          <w:p>
+            <w:pPr>
+              <w:jc w:val="center"/>
+            </w:pPr>
+            <w:r>
+              <w:rPr>
+                <w:rFonts w:ascii="Calibri" w:cs="Calibri" w:eastAsia="Calibri" w:hAnsi="Calibri"/>
+                <w:b w:val="false"/>
+                <w:bCs w:val="false"/>
+                <w:color w:val="000000"/>
+                <w:sz w:val="20"/>
+                <w:szCs w:val="20"/>
+              </w:rPr>
+              <w:t xml:space="preserve">64,056</w:t>
+            </w:r>
+          </w:p>
+        </w:tc>
+      </w:tr>
+      <w:tr>
+        <w:tc>
+          <w:tcPr>
+            <w:tcW w:type="dxa" w:w="2200"/>
+            <w:tcBorders>
+              <w:top w:val="single" w:color="000000" w:sz="4"/>
+              <w:left w:val="single" w:color="000000" w:sz="4"/>
+              <w:bottom w:val="single" w:color="000000" w:sz="4"/>
+              <w:right w:val="single" w:color="000000" w:sz="4"/>
+            </w:tcBorders>
+            <w:tcMar>
+              <w:top w:type="dxa" w:w="80"/>
+              <w:left w:type="dxa" w:w="120"/>
+              <w:bottom w:type="dxa" w:w="80"/>
+              <w:right w:type="dxa" w:w="120"/>
+            </w:tcMar>
+          </w:tcPr>
+          <w:p>
+            <w:pPr>
+              <w:jc w:val="left"/>
+            </w:pPr>
+            <w:r>
+              <w:rPr>
+                <w:rFonts w:ascii="Calibri" w:cs="Calibri" w:eastAsia="Calibri" w:hAnsi="Calibri"/>
+                <w:b w:val="false"/>
+                <w:bCs w:val="false"/>
+                <w:color w:val="000000"/>
+                <w:sz w:val="20"/>
+                <w:szCs w:val="20"/>
+              </w:rPr>
+              <w:t xml:space="preserve">TTF gas (EUR/MWh)</w:t>
+            </w:r>
+          </w:p>
+        </w:tc>
+        <w:tc>
+          <w:tcPr>
+            <w:tcW w:type="dxa" w:w="900"/>
+            <w:tcBorders>
+              <w:top w:val="single" w:color="000000" w:sz="4"/>
+              <w:left w:val="single" w:color="000000" w:sz="4"/>
+              <w:bottom w:val="single" w:color="000000" w:sz="4"/>
+              <w:right w:val="single" w:color="000000" w:sz="4"/>
+            </w:tcBorders>
+            <w:tcMar>
+              <w:top w:type="dxa" w:w="80"/>
+              <w:left w:type="dxa" w:w="120"/>
+              <w:bottom w:type="dxa" w:w="80"/>
+              <w:right w:type="dxa" w:w="120"/>
+            </w:tcMar>
+          </w:tcPr>
+          <w:p>
+            <w:pPr>
+              <w:jc w:val="center"/>
+            </w:pPr>
+            <w:r>
+              <w:rPr>
+                <w:rFonts w:ascii="Calibri" w:cs="Calibri" w:eastAsia="Calibri" w:hAnsi="Calibri"/>
+                <w:b w:val="false"/>
+                <w:bCs w:val="false"/>
+                <w:color w:val="000000"/>
+                <w:sz w:val="20"/>
+                <w:szCs w:val="20"/>
+              </w:rPr>
+              <w:t xml:space="preserve">52.3</w:t>
+            </w:r>
+          </w:p>
+        </w:tc>
+        <w:tc>
+          <w:tcPr>
+            <w:tcW w:type="dxa" w:w="900"/>
+            <w:tcBorders>
+              <w:top w:val="single" w:color="000000" w:sz="4"/>
+              <w:left w:val="single" w:color="000000" w:sz="4"/>
+              <w:bottom w:val="single" w:color="000000" w:sz="4"/>
+              <w:right w:val="single" w:color="000000" w:sz="4"/>
+            </w:tcBorders>
+            <w:tcMar>
+              <w:top w:type="dxa" w:w="80"/>
+              <w:left w:type="dxa" w:w="120"/>
+              <w:bottom w:type="dxa" w:w="80"/>
+              <w:right w:type="dxa" w:w="120"/>
+            </w:tcMar>
+          </w:tcPr>
+          <w:p>
+            <w:pPr>
+              <w:jc w:val="center"/>
+            </w:pPr>
+            <w:r>
+              <w:rPr>
+                <w:rFonts w:ascii="Calibri" w:cs="Calibri" w:eastAsia="Calibri" w:hAnsi="Calibri"/>
+                <w:b w:val="false"/>
+                <w:bCs w:val="false"/>
+                <w:color w:val="000000"/>
+                <w:sz w:val="20"/>
+                <w:szCs w:val="20"/>
+              </w:rPr>
+              <w:t xml:space="preserve">63.8</w:t>
+            </w:r>
+          </w:p>
+        </w:tc>
+        <w:tc>
+          <w:tcPr>
+            <w:tcW w:type="dxa" w:w="900"/>
+            <w:tcBorders>
+              <w:top w:val="single" w:color="000000" w:sz="4"/>
+              <w:left w:val="single" w:color="000000" w:sz="4"/>
+              <w:bottom w:val="single" w:color="000000" w:sz="4"/>
+              <w:right w:val="single" w:color="000000" w:sz="4"/>
+            </w:tcBorders>
+            <w:tcMar>
+              <w:top w:type="dxa" w:w="80"/>
+              <w:left w:type="dxa" w:w="120"/>
+              <w:bottom w:type="dxa" w:w="80"/>
+              <w:right w:type="dxa" w:w="120"/>
+            </w:tcMar>
+          </w:tcPr>
+          <w:p>
+            <w:pPr>
+              <w:jc w:val="center"/>
+            </w:pPr>
+            <w:r>
+              <w:rPr>
+                <w:rFonts w:ascii="Calibri" w:cs="Calibri" w:eastAsia="Calibri" w:hAnsi="Calibri"/>
+                <w:b w:val="false"/>
+                <w:bCs w:val="false"/>
+                <w:color w:val="000000"/>
+                <w:sz w:val="20"/>
+                <w:szCs w:val="20"/>
+              </w:rPr>
+              <w:t xml:space="preserve">5.1</w:t>
+            </w:r>
+          </w:p>
+        </w:tc>
+        <w:tc>
+          <w:tcPr>
+            <w:tcW w:type="dxa" w:w="1000"/>
+            <w:tcBorders>
+              <w:top w:val="single" w:color="000000" w:sz="4"/>
+              <w:left w:val="single" w:color="000000" w:sz="4"/>
+              <w:bottom w:val="single" w:color="000000" w:sz="4"/>
+              <w:right w:val="single" w:color="000000" w:sz="4"/>
+            </w:tcBorders>
+            <w:tcMar>
+              <w:top w:type="dxa" w:w="80"/>
+              <w:left w:type="dxa" w:w="120"/>
+              <w:bottom w:type="dxa" w:w="80"/>
+              <w:right w:type="dxa" w:w="120"/>
+            </w:tcMar>
+          </w:tcPr>
+          <w:p>
+            <w:pPr>
+              <w:jc w:val="center"/>
+            </w:pPr>
+            <w:r>
+              <w:rPr>
+                <w:rFonts w:ascii="Calibri" w:cs="Calibri" w:eastAsia="Calibri" w:hAnsi="Calibri"/>
+                <w:b w:val="false"/>
+                <w:bCs w:val="false"/>
+                <w:color w:val="000000"/>
+                <w:sz w:val="20"/>
+                <w:szCs w:val="20"/>
+              </w:rPr>
+              <w:t xml:space="preserve">28.4</w:t>
+            </w:r>
+          </w:p>
+        </w:tc>
+        <w:tc>
+          <w:tcPr>
+            <w:tcW w:type="dxa" w:w="900"/>
+            <w:tcBorders>
+              <w:top w:val="single" w:color="000000" w:sz="4"/>
+              <w:left w:val="single" w:color="000000" w:sz="4"/>
+              <w:bottom w:val="single" w:color="000000" w:sz="4"/>
+              <w:right w:val="single" w:color="000000" w:sz="4"/>
+            </w:tcBorders>
+            <w:tcMar>
+              <w:top w:type="dxa" w:w="80"/>
+              <w:left w:type="dxa" w:w="120"/>
+              <w:bottom w:type="dxa" w:w="80"/>
+              <w:right w:type="dxa" w:w="120"/>
+            </w:tcMar>
+          </w:tcPr>
+          <w:p>
+            <w:pPr>
+              <w:jc w:val="center"/>
+            </w:pPr>
+            <w:r>
+              <w:rPr>
+                <w:rFonts w:ascii="Calibri" w:cs="Calibri" w:eastAsia="Calibri" w:hAnsi="Calibri"/>
+                <w:b w:val="false"/>
+                <w:bCs w:val="false"/>
+                <w:color w:val="000000"/>
+                <w:sz w:val="20"/>
+                <w:szCs w:val="20"/>
+              </w:rPr>
+              <w:t xml:space="preserve">340.0</w:t>
+            </w:r>
+          </w:p>
+        </w:tc>
+        <w:tc>
+          <w:tcPr>
+            <w:tcW w:type="dxa" w:w="1200"/>
+            <w:tcBorders>
+              <w:top w:val="single" w:color="000000" w:sz="4"/>
+              <w:left w:val="single" w:color="000000" w:sz="4"/>
+              <w:bottom w:val="single" w:color="000000" w:sz="4"/>
+              <w:right w:val="single" w:color="000000" w:sz="4"/>
+            </w:tcBorders>
+            <w:tcMar>
+              <w:top w:type="dxa" w:w="80"/>
+              <w:left w:type="dxa" w:w="120"/>
+              <w:bottom w:type="dxa" w:w="80"/>
+              <w:right w:type="dxa" w:w="120"/>
+            </w:tcMar>
+          </w:tcPr>
+          <w:p>
+            <w:pPr>
+              <w:jc w:val="center"/>
+            </w:pPr>
+            <w:r>
+              <w:rPr>
+                <w:rFonts w:ascii="Calibri" w:cs="Calibri" w:eastAsia="Calibri" w:hAnsi="Calibri"/>
+                <w:b w:val="false"/>
+                <w:bCs w:val="false"/>
+                <w:color w:val="000000"/>
+                <w:sz w:val="20"/>
+                <w:szCs w:val="20"/>
+              </w:rPr>
+              <w:t xml:space="preserve">64,056</w:t>
+            </w:r>
+          </w:p>
+        </w:tc>
+      </w:tr>
+      <w:tr>
+        <w:tc>
+          <w:tcPr>
+            <w:tcW w:type="dxa" w:w="2200"/>
+            <w:tcBorders>
+              <w:top w:val="single" w:color="000000" w:sz="4"/>
+              <w:left w:val="single" w:color="000000" w:sz="4"/>
+              <w:bottom w:val="single" w:color="000000" w:sz="4"/>
+              <w:right w:val="single" w:color="000000" w:sz="4"/>
+            </w:tcBorders>
+            <w:tcMar>
+              <w:top w:type="dxa" w:w="80"/>
+              <w:left w:type="dxa" w:w="120"/>
+              <w:bottom w:type="dxa" w:w="80"/>
+              <w:right w:type="dxa" w:w="120"/>
+            </w:tcMar>
+          </w:tcPr>
+          <w:p>
+            <w:pPr>
+              <w:jc w:val="left"/>
+            </w:pPr>
+            <w:r>
+              <w:rPr>
+                <w:rFonts w:ascii="Calibri" w:cs="Calibri" w:eastAsia="Calibri" w:hAnsi="Calibri"/>
+                <w:b w:val="false"/>
+                <w:bCs w:val="false"/>
+                <w:color w:val="000000"/>
+                <w:sz w:val="20"/>
+                <w:szCs w:val="20"/>
+              </w:rPr>
+              <w:t xml:space="preserve">ARA coal (EUR/t)</w:t>
+            </w:r>
+          </w:p>
+        </w:tc>
+        <w:tc>
+          <w:tcPr>
+            <w:tcW w:type="dxa" w:w="900"/>
+            <w:tcBorders>
+              <w:top w:val="single" w:color="000000" w:sz="4"/>
+              <w:left w:val="single" w:color="000000" w:sz="4"/>
+              <w:bottom w:val="single" w:color="000000" w:sz="4"/>
+              <w:right w:val="single" w:color="000000" w:sz="4"/>
+            </w:tcBorders>
+            <w:tcMar>
+              <w:top w:type="dxa" w:w="80"/>
+              <w:left w:type="dxa" w:w="120"/>
+              <w:bottom w:type="dxa" w:w="80"/>
+              <w:right w:type="dxa" w:w="120"/>
+            </w:tcMar>
+          </w:tcPr>
+          <w:p>
+            <w:pPr>
+              <w:jc w:val="center"/>
+            </w:pPr>
+            <w:r>
+              <w:rPr>
+                <w:rFonts w:ascii="Calibri" w:cs="Calibri" w:eastAsia="Calibri" w:hAnsi="Calibri"/>
+                <w:b w:val="false"/>
+                <w:bCs w:val="false"/>
+                <w:color w:val="000000"/>
+                <w:sz w:val="20"/>
+                <w:szCs w:val="20"/>
+              </w:rPr>
+              <w:t xml:space="preserve">127.4</w:t>
+            </w:r>
+          </w:p>
+        </w:tc>
+        <w:tc>
+          <w:tcPr>
+            <w:tcW w:type="dxa" w:w="900"/>
+            <w:tcBorders>
+              <w:top w:val="single" w:color="000000" w:sz="4"/>
+              <w:left w:val="single" w:color="000000" w:sz="4"/>
+              <w:bottom w:val="single" w:color="000000" w:sz="4"/>
+              <w:right w:val="single" w:color="000000" w:sz="4"/>
+            </w:tcBorders>
+            <w:tcMar>
+              <w:top w:type="dxa" w:w="80"/>
+              <w:left w:type="dxa" w:w="120"/>
+              <w:bottom w:type="dxa" w:w="80"/>
+              <w:right w:type="dxa" w:w="120"/>
+            </w:tcMar>
+          </w:tcPr>
+          <w:p>
+            <w:pPr>
+              <w:jc w:val="center"/>
+            </w:pPr>
+            <w:r>
+              <w:rPr>
+                <w:rFonts w:ascii="Calibri" w:cs="Calibri" w:eastAsia="Calibri" w:hAnsi="Calibri"/>
+                <w:b w:val="false"/>
+                <w:bCs w:val="false"/>
+                <w:color w:val="000000"/>
+                <w:sz w:val="20"/>
+                <w:szCs w:val="20"/>
+              </w:rPr>
+              <w:t xml:space="preserve">63.5</w:t>
+            </w:r>
+          </w:p>
+        </w:tc>
+        <w:tc>
+          <w:tcPr>
+            <w:tcW w:type="dxa" w:w="900"/>
+            <w:tcBorders>
+              <w:top w:val="single" w:color="000000" w:sz="4"/>
+              <w:left w:val="single" w:color="000000" w:sz="4"/>
+              <w:bottom w:val="single" w:color="000000" w:sz="4"/>
+              <w:right w:val="single" w:color="000000" w:sz="4"/>
+            </w:tcBorders>
+            <w:tcMar>
+              <w:top w:type="dxa" w:w="80"/>
+              <w:left w:type="dxa" w:w="120"/>
+              <w:bottom w:type="dxa" w:w="80"/>
+              <w:right w:type="dxa" w:w="120"/>
+            </w:tcMar>
+          </w:tcPr>
+          <w:p>
+            <w:pPr>
+              <w:jc w:val="center"/>
+            </w:pPr>
+            <w:r>
+              <w:rPr>
+                <w:rFonts w:ascii="Calibri" w:cs="Calibri" w:eastAsia="Calibri" w:hAnsi="Calibri"/>
+                <w:b w:val="false"/>
+                <w:bCs w:val="false"/>
+                <w:color w:val="000000"/>
+                <w:sz w:val="20"/>
+                <w:szCs w:val="20"/>
+              </w:rPr>
+              <w:t xml:space="preserve">46.0</w:t>
+            </w:r>
+          </w:p>
+        </w:tc>
+        <w:tc>
+          <w:tcPr>
+            <w:tcW w:type="dxa" w:w="1000"/>
+            <w:tcBorders>
+              <w:top w:val="single" w:color="000000" w:sz="4"/>
+              <w:left w:val="single" w:color="000000" w:sz="4"/>
+              <w:bottom w:val="single" w:color="000000" w:sz="4"/>
+              <w:right w:val="single" w:color="000000" w:sz="4"/>
+            </w:tcBorders>
+            <w:tcMar>
+              <w:top w:type="dxa" w:w="80"/>
+              <w:left w:type="dxa" w:w="120"/>
+              <w:bottom w:type="dxa" w:w="80"/>
+              <w:right w:type="dxa" w:w="120"/>
+            </w:tcMar>
+          </w:tcPr>
+          <w:p>
+            <w:pPr>
+              <w:jc w:val="center"/>
+            </w:pPr>
+            <w:r>
+              <w:rPr>
+                <w:rFonts w:ascii="Calibri" w:cs="Calibri" w:eastAsia="Calibri" w:hAnsi="Calibri"/>
+                <w:b w:val="false"/>
+                <w:bCs w:val="false"/>
+                <w:color w:val="000000"/>
+                <w:sz w:val="20"/>
+                <w:szCs w:val="20"/>
+              </w:rPr>
+              <w:t xml:space="preserve">110.0</w:t>
+            </w:r>
+          </w:p>
+        </w:tc>
+        <w:tc>
+          <w:tcPr>
+            <w:tcW w:type="dxa" w:w="900"/>
+            <w:tcBorders>
+              <w:top w:val="single" w:color="000000" w:sz="4"/>
+              <w:left w:val="single" w:color="000000" w:sz="4"/>
+              <w:bottom w:val="single" w:color="000000" w:sz="4"/>
+              <w:right w:val="single" w:color="000000" w:sz="4"/>
+            </w:tcBorders>
+            <w:tcMar>
+              <w:top w:type="dxa" w:w="80"/>
+              <w:left w:type="dxa" w:w="120"/>
+              <w:bottom w:type="dxa" w:w="80"/>
+              <w:right w:type="dxa" w:w="120"/>
+            </w:tcMar>
+          </w:tcPr>
+          <w:p>
+            <w:pPr>
+              <w:jc w:val="center"/>
+            </w:pPr>
+            <w:r>
+              <w:rPr>
+                <w:rFonts w:ascii="Calibri" w:cs="Calibri" w:eastAsia="Calibri" w:hAnsi="Calibri"/>
+                <w:b w:val="false"/>
+                <w:bCs w:val="false"/>
+                <w:color w:val="000000"/>
+                <w:sz w:val="20"/>
+                <w:szCs w:val="20"/>
+              </w:rPr>
+              <w:t xml:space="preserve">423.0</w:t>
+            </w:r>
+          </w:p>
+        </w:tc>
+        <w:tc>
+          <w:tcPr>
+            <w:tcW w:type="dxa" w:w="1200"/>
+            <w:tcBorders>
+              <w:top w:val="single" w:color="000000" w:sz="4"/>
+              <w:left w:val="single" w:color="000000" w:sz="4"/>
+              <w:bottom w:val="single" w:color="000000" w:sz="4"/>
+              <w:right w:val="single" w:color="000000" w:sz="4"/>
+            </w:tcBorders>
+            <w:tcMar>
+              <w:top w:type="dxa" w:w="80"/>
+              <w:left w:type="dxa" w:w="120"/>
+              <w:bottom w:type="dxa" w:w="80"/>
+              <w:right w:type="dxa" w:w="120"/>
+            </w:tcMar>
+          </w:tcPr>
+          <w:p>
+            <w:pPr>
+              <w:jc w:val="center"/>
+            </w:pPr>
+            <w:r>
+              <w:rPr>
+                <w:rFonts w:ascii="Calibri" w:cs="Calibri" w:eastAsia="Calibri" w:hAnsi="Calibri"/>
+                <w:b w:val="false"/>
+                <w:bCs w:val="false"/>
+                <w:color w:val="000000"/>
+                <w:sz w:val="20"/>
+                <w:szCs w:val="20"/>
+              </w:rPr>
+              <w:t xml:space="preserve">64,056</w:t>
+            </w:r>
+          </w:p>
+        </w:tc>
+      </w:tr>
+      <w:tr>
+        <w:tc>
+          <w:tcPr>
+            <w:tcW w:type="dxa" w:w="2200"/>
+            <w:tcBorders>
+              <w:top w:val="single" w:color="000000" w:sz="4"/>
+              <w:left w:val="single" w:color="000000" w:sz="4"/>
+              <w:bottom w:val="single" w:color="000000" w:sz="4"/>
+              <w:right w:val="single" w:color="000000" w:sz="4"/>
+            </w:tcBorders>
+            <w:tcMar>
+              <w:top w:type="dxa" w:w="80"/>
+              <w:left w:type="dxa" w:w="120"/>
+              <w:bottom w:type="dxa" w:w="80"/>
+              <w:right w:type="dxa" w:w="120"/>
+            </w:tcMar>
+          </w:tcPr>
+          <w:p>
+            <w:pPr>
+              <w:jc w:val="left"/>
+            </w:pPr>
+            <w:r>
+              <w:rPr>
+                <w:rFonts w:ascii="Calibri" w:cs="Calibri" w:eastAsia="Calibri" w:hAnsi="Calibri"/>
+                <w:b w:val="false"/>
+                <w:bCs w:val="false"/>
+                <w:color w:val="000000"/>
+                <w:sz w:val="20"/>
+                <w:szCs w:val="20"/>
+              </w:rPr>
+              <w:t xml:space="preserve">Nuclear avail. ratio</w:t>
+            </w:r>
+          </w:p>
+        </w:tc>
+        <w:tc>
+          <w:tcPr>
+            <w:tcW w:type="dxa" w:w="900"/>
+            <w:tcBorders>
+              <w:top w:val="single" w:color="000000" w:sz="4"/>
+              <w:left w:val="single" w:color="000000" w:sz="4"/>
+              <w:bottom w:val="single" w:color="000000" w:sz="4"/>
+              <w:right w:val="single" w:color="000000" w:sz="4"/>
+            </w:tcBorders>
+            <w:tcMar>
+              <w:top w:type="dxa" w:w="80"/>
+              <w:left w:type="dxa" w:w="120"/>
+              <w:bottom w:type="dxa" w:w="80"/>
+              <w:right w:type="dxa" w:w="120"/>
+            </w:tcMar>
+          </w:tcPr>
+          <w:p>
+            <w:pPr>
+              <w:jc w:val="center"/>
+            </w:pPr>
+            <w:r>
+              <w:rPr>
+                <w:rFonts w:ascii="Calibri" w:cs="Calibri" w:eastAsia="Calibri" w:hAnsi="Calibri"/>
+                <w:b w:val="false"/>
+                <w:bCs w:val="false"/>
+                <w:color w:val="000000"/>
+                <w:sz w:val="20"/>
+                <w:szCs w:val="20"/>
+              </w:rPr>
+              <w:t xml:space="preserve">0.72</w:t>
+            </w:r>
+          </w:p>
+        </w:tc>
+        <w:tc>
+          <w:tcPr>
+            <w:tcW w:type="dxa" w:w="900"/>
+            <w:tcBorders>
+              <w:top w:val="single" w:color="000000" w:sz="4"/>
+              <w:left w:val="single" w:color="000000" w:sz="4"/>
+              <w:bottom w:val="single" w:color="000000" w:sz="4"/>
+              <w:right w:val="single" w:color="000000" w:sz="4"/>
+            </w:tcBorders>
+            <w:tcMar>
+              <w:top w:type="dxa" w:w="80"/>
+              <w:left w:type="dxa" w:w="120"/>
+              <w:bottom w:type="dxa" w:w="80"/>
+              <w:right w:type="dxa" w:w="120"/>
+            </w:tcMar>
+          </w:tcPr>
+          <w:p>
+            <w:pPr>
+              <w:jc w:val="center"/>
+            </w:pPr>
+            <w:r>
+              <w:rPr>
+                <w:rFonts w:ascii="Calibri" w:cs="Calibri" w:eastAsia="Calibri" w:hAnsi="Calibri"/>
+                <w:b w:val="false"/>
+                <w:bCs w:val="false"/>
+                <w:color w:val="000000"/>
+                <w:sz w:val="20"/>
+                <w:szCs w:val="20"/>
+              </w:rPr>
+              <w:t xml:space="preserve">0.12</w:t>
+            </w:r>
+          </w:p>
+        </w:tc>
+        <w:tc>
+          <w:tcPr>
+            <w:tcW w:type="dxa" w:w="900"/>
+            <w:tcBorders>
+              <w:top w:val="single" w:color="000000" w:sz="4"/>
+              <w:left w:val="single" w:color="000000" w:sz="4"/>
+              <w:bottom w:val="single" w:color="000000" w:sz="4"/>
+              <w:right w:val="single" w:color="000000" w:sz="4"/>
+            </w:tcBorders>
+            <w:tcMar>
+              <w:top w:type="dxa" w:w="80"/>
+              <w:left w:type="dxa" w:w="120"/>
+              <w:bottom w:type="dxa" w:w="80"/>
+              <w:right w:type="dxa" w:w="120"/>
+            </w:tcMar>
+          </w:tcPr>
+          <w:p>
+            <w:pPr>
+              <w:jc w:val="center"/>
+            </w:pPr>
+            <w:r>
+              <w:rPr>
+                <w:rFonts w:ascii="Calibri" w:cs="Calibri" w:eastAsia="Calibri" w:hAnsi="Calibri"/>
+                <w:b w:val="false"/>
+                <w:bCs w:val="false"/>
+                <w:color w:val="000000"/>
+                <w:sz w:val="20"/>
+                <w:szCs w:val="20"/>
+              </w:rPr>
+              <w:t xml:space="preserve">0.31</w:t>
+            </w:r>
+          </w:p>
+        </w:tc>
+        <w:tc>
+          <w:tcPr>
+            <w:tcW w:type="dxa" w:w="1000"/>
+            <w:tcBorders>
+              <w:top w:val="single" w:color="000000" w:sz="4"/>
+              <w:left w:val="single" w:color="000000" w:sz="4"/>
+              <w:bottom w:val="single" w:color="000000" w:sz="4"/>
+              <w:right w:val="single" w:color="000000" w:sz="4"/>
+            </w:tcBorders>
+            <w:tcMar>
+              <w:top w:type="dxa" w:w="80"/>
+              <w:left w:type="dxa" w:w="120"/>
+              <w:bottom w:type="dxa" w:w="80"/>
+              <w:right w:type="dxa" w:w="120"/>
+            </w:tcMar>
+          </w:tcPr>
+          <w:p>
+            <w:pPr>
+              <w:jc w:val="center"/>
+            </w:pPr>
+            <w:r>
+              <w:rPr>
+                <w:rFonts w:ascii="Calibri" w:cs="Calibri" w:eastAsia="Calibri" w:hAnsi="Calibri"/>
+                <w:b w:val="false"/>
+                <w:bCs w:val="false"/>
+                <w:color w:val="000000"/>
+                <w:sz w:val="20"/>
+                <w:szCs w:val="20"/>
+              </w:rPr>
+              <w:t xml:space="preserve">0.73</w:t>
+            </w:r>
+          </w:p>
+        </w:tc>
+        <w:tc>
+          <w:tcPr>
+            <w:tcW w:type="dxa" w:w="900"/>
+            <w:tcBorders>
+              <w:top w:val="single" w:color="000000" w:sz="4"/>
+              <w:left w:val="single" w:color="000000" w:sz="4"/>
+              <w:bottom w:val="single" w:color="000000" w:sz="4"/>
+              <w:right w:val="single" w:color="000000" w:sz="4"/>
+            </w:tcBorders>
+            <w:tcMar>
+              <w:top w:type="dxa" w:w="80"/>
+              <w:left w:type="dxa" w:w="120"/>
+              <w:bottom w:type="dxa" w:w="80"/>
+              <w:right w:type="dxa" w:w="120"/>
+            </w:tcMar>
+          </w:tcPr>
+          <w:p>
+            <w:pPr>
+              <w:jc w:val="center"/>
+            </w:pPr>
+            <w:r>
+              <w:rPr>
+                <w:rFonts w:ascii="Calibri" w:cs="Calibri" w:eastAsia="Calibri" w:hAnsi="Calibri"/>
+                <w:b w:val="false"/>
+                <w:bCs w:val="false"/>
+                <w:color w:val="000000"/>
+                <w:sz w:val="20"/>
+                <w:szCs w:val="20"/>
+              </w:rPr>
+              <w:t xml:space="preserve">0.97</w:t>
+            </w:r>
+          </w:p>
+        </w:tc>
+        <w:tc>
+          <w:tcPr>
+            <w:tcW w:type="dxa" w:w="1200"/>
+            <w:tcBorders>
+              <w:top w:val="single" w:color="000000" w:sz="4"/>
+              <w:left w:val="single" w:color="000000" w:sz="4"/>
+              <w:bottom w:val="single" w:color="000000" w:sz="4"/>
+              <w:right w:val="single" w:color="000000" w:sz="4"/>
+            </w:tcBorders>
+            <w:tcMar>
+              <w:top w:type="dxa" w:w="80"/>
+              <w:left w:type="dxa" w:w="120"/>
+              <w:bottom w:type="dxa" w:w="80"/>
+              <w:right w:type="dxa" w:w="120"/>
+            </w:tcMar>
+          </w:tcPr>
+          <w:p>
+            <w:pPr>
+              <w:jc w:val="center"/>
+            </w:pPr>
+            <w:r>
+              <w:rPr>
+                <w:rFonts w:ascii="Calibri" w:cs="Calibri" w:eastAsia="Calibri" w:hAnsi="Calibri"/>
+                <w:b w:val="false"/>
+                <w:bCs w:val="false"/>
+                <w:color w:val="000000"/>
+                <w:sz w:val="20"/>
+                <w:szCs w:val="20"/>
+              </w:rPr>
+              <w:t xml:space="preserve">64,056</w:t>
+            </w:r>
+          </w:p>
+        </w:tc>
+      </w:tr>
+      <w:tr>
+        <w:tc>
+          <w:tcPr>
+            <w:tcW w:type="dxa" w:w="2200"/>
+            <w:tcBorders>
+              <w:top w:val="single" w:color="000000" w:sz="4"/>
+              <w:left w:val="single" w:color="000000" w:sz="4"/>
+              <w:bottom w:val="single" w:color="000000" w:sz="4"/>
+              <w:right w:val="single" w:color="000000" w:sz="4"/>
+            </w:tcBorders>
+            <w:tcMar>
+              <w:top w:type="dxa" w:w="80"/>
+              <w:left w:type="dxa" w:w="120"/>
+              <w:bottom w:type="dxa" w:w="80"/>
+              <w:right w:type="dxa" w:w="120"/>
+            </w:tcMar>
+          </w:tcPr>
+          <w:p>
+            <w:pPr>
+              <w:jc w:val="left"/>
+            </w:pPr>
+            <w:r>
+              <w:rPr>
+                <w:rFonts w:ascii="Calibri" w:cs="Calibri" w:eastAsia="Calibri" w:hAnsi="Calibri"/>
+                <w:b w:val="false"/>
+                <w:bCs w:val="false"/>
+                <w:color w:val="000000"/>
+                <w:sz w:val="20"/>
+                <w:szCs w:val="20"/>
+              </w:rPr>
+              <w:t xml:space="preserve">Load forecast (MW)</w:t>
+            </w:r>
+          </w:p>
+        </w:tc>
+        <w:tc>
+          <w:tcPr>
+            <w:tcW w:type="dxa" w:w="900"/>
+            <w:tcBorders>
+              <w:top w:val="single" w:color="000000" w:sz="4"/>
+              <w:left w:val="single" w:color="000000" w:sz="4"/>
+              <w:bottom w:val="single" w:color="000000" w:sz="4"/>
+              <w:right w:val="single" w:color="000000" w:sz="4"/>
+            </w:tcBorders>
+            <w:tcMar>
+              <w:top w:type="dxa" w:w="80"/>
+              <w:left w:type="dxa" w:w="120"/>
+              <w:bottom w:type="dxa" w:w="80"/>
+              <w:right w:type="dxa" w:w="120"/>
+            </w:tcMar>
+          </w:tcPr>
+          <w:p>
+            <w:pPr>
+              <w:jc w:val="center"/>
+            </w:pPr>
+            <w:r>
+              <w:rPr>
+                <w:rFonts w:ascii="Calibri" w:cs="Calibri" w:eastAsia="Calibri" w:hAnsi="Calibri"/>
+                <w:b w:val="false"/>
+                <w:bCs w:val="false"/>
+                <w:color w:val="000000"/>
+                <w:sz w:val="20"/>
+                <w:szCs w:val="20"/>
+              </w:rPr>
+              <w:t xml:space="preserve">53,210</w:t>
+            </w:r>
+          </w:p>
+        </w:tc>
+        <w:tc>
+          <w:tcPr>
+            <w:tcW w:type="dxa" w:w="900"/>
+            <w:tcBorders>
+              <w:top w:val="single" w:color="000000" w:sz="4"/>
+              <w:left w:val="single" w:color="000000" w:sz="4"/>
+              <w:bottom w:val="single" w:color="000000" w:sz="4"/>
+              <w:right w:val="single" w:color="000000" w:sz="4"/>
+            </w:tcBorders>
+            <w:tcMar>
+              <w:top w:type="dxa" w:w="80"/>
+              <w:left w:type="dxa" w:w="120"/>
+              <w:bottom w:type="dxa" w:w="80"/>
+              <w:right w:type="dxa" w:w="120"/>
+            </w:tcMar>
+          </w:tcPr>
+          <w:p>
+            <w:pPr>
+              <w:jc w:val="center"/>
+            </w:pPr>
+            <w:r>
+              <w:rPr>
+                <w:rFonts w:ascii="Calibri" w:cs="Calibri" w:eastAsia="Calibri" w:hAnsi="Calibri"/>
+                <w:b w:val="false"/>
+                <w:bCs w:val="false"/>
+                <w:color w:val="000000"/>
+                <w:sz w:val="20"/>
+                <w:szCs w:val="20"/>
+              </w:rPr>
+              <w:t xml:space="preserve">9,840</w:t>
+            </w:r>
+          </w:p>
+        </w:tc>
+        <w:tc>
+          <w:tcPr>
+            <w:tcW w:type="dxa" w:w="900"/>
+            <w:tcBorders>
+              <w:top w:val="single" w:color="000000" w:sz="4"/>
+              <w:left w:val="single" w:color="000000" w:sz="4"/>
+              <w:bottom w:val="single" w:color="000000" w:sz="4"/>
+              <w:right w:val="single" w:color="000000" w:sz="4"/>
+            </w:tcBorders>
+            <w:tcMar>
+              <w:top w:type="dxa" w:w="80"/>
+              <w:left w:type="dxa" w:w="120"/>
+              <w:bottom w:type="dxa" w:w="80"/>
+              <w:right w:type="dxa" w:w="120"/>
+            </w:tcMar>
+          </w:tcPr>
+          <w:p>
+            <w:pPr>
+              <w:jc w:val="center"/>
+            </w:pPr>
+            <w:r>
+              <w:rPr>
+                <w:rFonts w:ascii="Calibri" w:cs="Calibri" w:eastAsia="Calibri" w:hAnsi="Calibri"/>
+                <w:b w:val="false"/>
+                <w:bCs w:val="false"/>
+                <w:color w:val="000000"/>
+                <w:sz w:val="20"/>
+                <w:szCs w:val="20"/>
+              </w:rPr>
+              <w:t xml:space="preserve">31,800</w:t>
+            </w:r>
+          </w:p>
+        </w:tc>
+        <w:tc>
+          <w:tcPr>
+            <w:tcW w:type="dxa" w:w="1000"/>
+            <w:tcBorders>
+              <w:top w:val="single" w:color="000000" w:sz="4"/>
+              <w:left w:val="single" w:color="000000" w:sz="4"/>
+              <w:bottom w:val="single" w:color="000000" w:sz="4"/>
+              <w:right w:val="single" w:color="000000" w:sz="4"/>
+            </w:tcBorders>
+            <w:tcMar>
+              <w:top w:type="dxa" w:w="80"/>
+              <w:left w:type="dxa" w:w="120"/>
+              <w:bottom w:type="dxa" w:w="80"/>
+              <w:right w:type="dxa" w:w="120"/>
+            </w:tcMar>
+          </w:tcPr>
+          <w:p>
+            <w:pPr>
+              <w:jc w:val="center"/>
+            </w:pPr>
+            <w:r>
+              <w:rPr>
+                <w:rFonts w:ascii="Calibri" w:cs="Calibri" w:eastAsia="Calibri" w:hAnsi="Calibri"/>
+                <w:b w:val="false"/>
+                <w:bCs w:val="false"/>
+                <w:color w:val="000000"/>
+                <w:sz w:val="20"/>
+                <w:szCs w:val="20"/>
+              </w:rPr>
+              <w:t xml:space="preserve">52,600</w:t>
+            </w:r>
+          </w:p>
+        </w:tc>
+        <w:tc>
+          <w:tcPr>
+            <w:tcW w:type="dxa" w:w="900"/>
+            <w:tcBorders>
+              <w:top w:val="single" w:color="000000" w:sz="4"/>
+              <w:left w:val="single" w:color="000000" w:sz="4"/>
+              <w:bottom w:val="single" w:color="000000" w:sz="4"/>
+              <w:right w:val="single" w:color="000000" w:sz="4"/>
+            </w:tcBorders>
+            <w:tcMar>
+              <w:top w:type="dxa" w:w="80"/>
+              <w:left w:type="dxa" w:w="120"/>
+              <w:bottom w:type="dxa" w:w="80"/>
+              <w:right w:type="dxa" w:w="120"/>
+            </w:tcMar>
+          </w:tcPr>
+          <w:p>
+            <w:pPr>
+              <w:jc w:val="center"/>
+            </w:pPr>
+            <w:r>
+              <w:rPr>
+                <w:rFonts w:ascii="Calibri" w:cs="Calibri" w:eastAsia="Calibri" w:hAnsi="Calibri"/>
+                <w:b w:val="false"/>
+                <w:bCs w:val="false"/>
+                <w:color w:val="000000"/>
+                <w:sz w:val="20"/>
+                <w:szCs w:val="20"/>
+              </w:rPr>
+              <w:t xml:space="preserve">87,900</w:t>
+            </w:r>
+          </w:p>
+        </w:tc>
+        <w:tc>
+          <w:tcPr>
+            <w:tcW w:type="dxa" w:w="1200"/>
+            <w:tcBorders>
+              <w:top w:val="single" w:color="000000" w:sz="4"/>
+              <w:left w:val="single" w:color="000000" w:sz="4"/>
+              <w:bottom w:val="single" w:color="000000" w:sz="4"/>
+              <w:right w:val="single" w:color="000000" w:sz="4"/>
+            </w:tcBorders>
+            <w:tcMar>
+              <w:top w:type="dxa" w:w="80"/>
+              <w:left w:type="dxa" w:w="120"/>
+              <w:bottom w:type="dxa" w:w="80"/>
+              <w:right w:type="dxa" w:w="120"/>
+            </w:tcMar>
+          </w:tcPr>
+          <w:p>
+            <w:pPr>
+              <w:jc w:val="center"/>
+            </w:pPr>
+            <w:r>
+              <w:rPr>
+                <w:rFonts w:ascii="Calibri" w:cs="Calibri" w:eastAsia="Calibri" w:hAnsi="Calibri"/>
+                <w:b w:val="false"/>
+                <w:bCs w:val="false"/>
+                <w:color w:val="000000"/>
+                <w:sz w:val="20"/>
+                <w:szCs w:val="20"/>
+              </w:rPr>
+              <w:t xml:space="preserve">64,056</w:t>
+            </w:r>
+          </w:p>
+        </w:tc>
+      </w:tr>
+      <w:tr>
+        <w:tc>
+          <w:tcPr>
+            <w:tcW w:type="dxa" w:w="2200"/>
+            <w:tcBorders>
+              <w:top w:val="single" w:color="000000" w:sz="4"/>
+              <w:left w:val="single" w:color="000000" w:sz="4"/>
+              <w:bottom w:val="single" w:color="000000" w:sz="4"/>
+              <w:right w:val="single" w:color="000000" w:sz="4"/>
+            </w:tcBorders>
+            <w:tcMar>
+              <w:top w:type="dxa" w:w="80"/>
+              <w:left w:type="dxa" w:w="120"/>
+              <w:bottom w:type="dxa" w:w="80"/>
+              <w:right w:type="dxa" w:w="120"/>
+            </w:tcMar>
+          </w:tcPr>
+          <w:p>
+            <w:pPr>
+              <w:jc w:val="left"/>
+            </w:pPr>
+            <w:r>
+              <w:rPr>
+                <w:rFonts w:ascii="Calibri" w:cs="Calibri" w:eastAsia="Calibri" w:hAnsi="Calibri"/>
+                <w:b w:val="false"/>
+                <w:bCs w:val="false"/>
+                <w:color w:val="000000"/>
+                <w:sz w:val="20"/>
+                <w:szCs w:val="20"/>
+              </w:rPr>
+              <w:t xml:space="preserve">HDD (°C)</w:t>
+            </w:r>
+          </w:p>
+        </w:tc>
+        <w:tc>
+          <w:tcPr>
+            <w:tcW w:type="dxa" w:w="900"/>
+            <w:tcBorders>
+              <w:top w:val="single" w:color="000000" w:sz="4"/>
+              <w:left w:val="single" w:color="000000" w:sz="4"/>
+              <w:bottom w:val="single" w:color="000000" w:sz="4"/>
+              <w:right w:val="single" w:color="000000" w:sz="4"/>
+            </w:tcBorders>
+            <w:tcMar>
+              <w:top w:type="dxa" w:w="80"/>
+              <w:left w:type="dxa" w:w="120"/>
+              <w:bottom w:type="dxa" w:w="80"/>
+              <w:right w:type="dxa" w:w="120"/>
+            </w:tcMar>
+          </w:tcPr>
+          <w:p>
+            <w:pPr>
+              <w:jc w:val="center"/>
+            </w:pPr>
+            <w:r>
+              <w:rPr>
+                <w:rFonts w:ascii="Calibri" w:cs="Calibri" w:eastAsia="Calibri" w:hAnsi="Calibri"/>
+                <w:b w:val="false"/>
+                <w:bCs w:val="false"/>
+                <w:color w:val="000000"/>
+                <w:sz w:val="20"/>
+                <w:szCs w:val="20"/>
+              </w:rPr>
+              <w:t xml:space="preserve">3.21</w:t>
+            </w:r>
+          </w:p>
+        </w:tc>
+        <w:tc>
+          <w:tcPr>
+            <w:tcW w:type="dxa" w:w="900"/>
+            <w:tcBorders>
+              <w:top w:val="single" w:color="000000" w:sz="4"/>
+              <w:left w:val="single" w:color="000000" w:sz="4"/>
+              <w:bottom w:val="single" w:color="000000" w:sz="4"/>
+              <w:right w:val="single" w:color="000000" w:sz="4"/>
+            </w:tcBorders>
+            <w:tcMar>
+              <w:top w:type="dxa" w:w="80"/>
+              <w:left w:type="dxa" w:w="120"/>
+              <w:bottom w:type="dxa" w:w="80"/>
+              <w:right w:type="dxa" w:w="120"/>
+            </w:tcMar>
+          </w:tcPr>
+          <w:p>
+            <w:pPr>
+              <w:jc w:val="center"/>
+            </w:pPr>
+            <w:r>
+              <w:rPr>
+                <w:rFonts w:ascii="Calibri" w:cs="Calibri" w:eastAsia="Calibri" w:hAnsi="Calibri"/>
+                <w:b w:val="false"/>
+                <w:bCs w:val="false"/>
+                <w:color w:val="000000"/>
+                <w:sz w:val="20"/>
+                <w:szCs w:val="20"/>
+              </w:rPr>
+              <w:t xml:space="preserve">4.88</w:t>
+            </w:r>
+          </w:p>
+        </w:tc>
+        <w:tc>
+          <w:tcPr>
+            <w:tcW w:type="dxa" w:w="900"/>
+            <w:tcBorders>
+              <w:top w:val="single" w:color="000000" w:sz="4"/>
+              <w:left w:val="single" w:color="000000" w:sz="4"/>
+              <w:bottom w:val="single" w:color="000000" w:sz="4"/>
+              <w:right w:val="single" w:color="000000" w:sz="4"/>
+            </w:tcBorders>
+            <w:tcMar>
+              <w:top w:type="dxa" w:w="80"/>
+              <w:left w:type="dxa" w:w="120"/>
+              <w:bottom w:type="dxa" w:w="80"/>
+              <w:right w:type="dxa" w:w="120"/>
+            </w:tcMar>
+          </w:tcPr>
+          <w:p>
+            <w:pPr>
+              <w:jc w:val="center"/>
+            </w:pPr>
+            <w:r>
+              <w:rPr>
+                <w:rFonts w:ascii="Calibri" w:cs="Calibri" w:eastAsia="Calibri" w:hAnsi="Calibri"/>
+                <w:b w:val="false"/>
+                <w:bCs w:val="false"/>
+                <w:color w:val="000000"/>
+                <w:sz w:val="20"/>
+                <w:szCs w:val="20"/>
+              </w:rPr>
+              <w:t xml:space="preserve">0.00</w:t>
+            </w:r>
+          </w:p>
+        </w:tc>
+        <w:tc>
+          <w:tcPr>
+            <w:tcW w:type="dxa" w:w="1000"/>
+            <w:tcBorders>
+              <w:top w:val="single" w:color="000000" w:sz="4"/>
+              <w:left w:val="single" w:color="000000" w:sz="4"/>
+              <w:bottom w:val="single" w:color="000000" w:sz="4"/>
+              <w:right w:val="single" w:color="000000" w:sz="4"/>
+            </w:tcBorders>
+            <w:tcMar>
+              <w:top w:type="dxa" w:w="80"/>
+              <w:left w:type="dxa" w:w="120"/>
+              <w:bottom w:type="dxa" w:w="80"/>
+              <w:right w:type="dxa" w:w="120"/>
+            </w:tcMar>
+          </w:tcPr>
+          <w:p>
+            <w:pPr>
+              <w:jc w:val="center"/>
+            </w:pPr>
+            <w:r>
+              <w:rPr>
+                <w:rFonts w:ascii="Calibri" w:cs="Calibri" w:eastAsia="Calibri" w:hAnsi="Calibri"/>
+                <w:b w:val="false"/>
+                <w:bCs w:val="false"/>
+                <w:color w:val="000000"/>
+                <w:sz w:val="20"/>
+                <w:szCs w:val="20"/>
+              </w:rPr>
+              <w:t xml:space="preserve">0.32</w:t>
+            </w:r>
+          </w:p>
+        </w:tc>
+        <w:tc>
+          <w:tcPr>
+            <w:tcW w:type="dxa" w:w="900"/>
+            <w:tcBorders>
+              <w:top w:val="single" w:color="000000" w:sz="4"/>
+              <w:left w:val="single" w:color="000000" w:sz="4"/>
+              <w:bottom w:val="single" w:color="000000" w:sz="4"/>
+              <w:right w:val="single" w:color="000000" w:sz="4"/>
+            </w:tcBorders>
+            <w:tcMar>
+              <w:top w:type="dxa" w:w="80"/>
+              <w:left w:type="dxa" w:w="120"/>
+              <w:bottom w:type="dxa" w:w="80"/>
+              <w:right w:type="dxa" w:w="120"/>
+            </w:tcMar>
+          </w:tcPr>
+          <w:p>
+            <w:pPr>
+              <w:jc w:val="center"/>
+            </w:pPr>
+            <w:r>
+              <w:rPr>
+                <w:rFonts w:ascii="Calibri" w:cs="Calibri" w:eastAsia="Calibri" w:hAnsi="Calibri"/>
+                <w:b w:val="false"/>
+                <w:bCs w:val="false"/>
+                <w:color w:val="000000"/>
+                <w:sz w:val="20"/>
+                <w:szCs w:val="20"/>
+              </w:rPr>
+              <w:t xml:space="preserve">21.5</w:t>
+            </w:r>
+          </w:p>
+        </w:tc>
+        <w:tc>
+          <w:tcPr>
+            <w:tcW w:type="dxa" w:w="1200"/>
+            <w:tcBorders>
+              <w:top w:val="single" w:color="000000" w:sz="4"/>
+              <w:left w:val="single" w:color="000000" w:sz="4"/>
+              <w:bottom w:val="single" w:color="000000" w:sz="4"/>
+              <w:right w:val="single" w:color="000000" w:sz="4"/>
+            </w:tcBorders>
+            <w:tcMar>
+              <w:top w:type="dxa" w:w="80"/>
+              <w:left w:type="dxa" w:w="120"/>
+              <w:bottom w:type="dxa" w:w="80"/>
+              <w:right w:type="dxa" w:w="120"/>
+            </w:tcMar>
+          </w:tcPr>
+          <w:p>
+            <w:pPr>
+              <w:jc w:val="center"/>
+            </w:pPr>
+            <w:r>
+              <w:rPr>
+                <w:rFonts w:ascii="Calibri" w:cs="Calibri" w:eastAsia="Calibri" w:hAnsi="Calibri"/>
+                <w:b w:val="false"/>
+                <w:bCs w:val="false"/>
+                <w:color w:val="000000"/>
+                <w:sz w:val="20"/>
+                <w:szCs w:val="20"/>
+              </w:rPr>
+              <w:t xml:space="preserve">64,056</w:t>
+            </w:r>
+          </w:p>
+        </w:tc>
+      </w:tr>
+      <w:tr>
+        <w:tc>
+          <w:tcPr>
+            <w:tcW w:type="dxa" w:w="2200"/>
+            <w:tcBorders>
+              <w:top w:val="single" w:color="000000" w:sz="4"/>
+              <w:left w:val="single" w:color="000000" w:sz="4"/>
+              <w:bottom w:val="single" w:color="000000" w:sz="4"/>
+              <w:right w:val="single" w:color="000000" w:sz="4"/>
+            </w:tcBorders>
+            <w:tcMar>
+              <w:top w:type="dxa" w:w="80"/>
+              <w:left w:type="dxa" w:w="120"/>
+              <w:bottom w:type="dxa" w:w="80"/>
+              <w:right w:type="dxa" w:w="120"/>
+            </w:tcMar>
+          </w:tcPr>
+          <w:p>
+            <w:pPr>
+              <w:jc w:val="left"/>
+            </w:pPr>
+            <w:r>
+              <w:rPr>
+                <w:rFonts w:ascii="Calibri" w:cs="Calibri" w:eastAsia="Calibri" w:hAnsi="Calibri"/>
+                <w:b w:val="false"/>
+                <w:bCs w:val="false"/>
+                <w:color w:val="000000"/>
+                <w:sz w:val="20"/>
+                <w:szCs w:val="20"/>
+              </w:rPr>
+              <w:t xml:space="preserve">CDD (°C, 22°C threshold)</w:t>
+            </w:r>
+          </w:p>
+        </w:tc>
+        <w:tc>
+          <w:tcPr>
+            <w:tcW w:type="dxa" w:w="900"/>
+            <w:tcBorders>
+              <w:top w:val="single" w:color="000000" w:sz="4"/>
+              <w:left w:val="single" w:color="000000" w:sz="4"/>
+              <w:bottom w:val="single" w:color="000000" w:sz="4"/>
+              <w:right w:val="single" w:color="000000" w:sz="4"/>
+            </w:tcBorders>
+            <w:tcMar>
+              <w:top w:type="dxa" w:w="80"/>
+              <w:left w:type="dxa" w:w="120"/>
+              <w:bottom w:type="dxa" w:w="80"/>
+              <w:right w:type="dxa" w:w="120"/>
+            </w:tcMar>
+          </w:tcPr>
+          <w:p>
+            <w:pPr>
+              <w:jc w:val="center"/>
+            </w:pPr>
+            <w:r>
+              <w:rPr>
+                <w:rFonts w:ascii="Calibri" w:cs="Calibri" w:eastAsia="Calibri" w:hAnsi="Calibri"/>
+                <w:b w:val="false"/>
+                <w:bCs w:val="false"/>
+                <w:color w:val="000000"/>
+                <w:sz w:val="20"/>
+                <w:szCs w:val="20"/>
+              </w:rPr>
+              <w:t xml:space="preserve">0.89</w:t>
+            </w:r>
+          </w:p>
+        </w:tc>
+        <w:tc>
+          <w:tcPr>
+            <w:tcW w:type="dxa" w:w="900"/>
+            <w:tcBorders>
+              <w:top w:val="single" w:color="000000" w:sz="4"/>
+              <w:left w:val="single" w:color="000000" w:sz="4"/>
+              <w:bottom w:val="single" w:color="000000" w:sz="4"/>
+              <w:right w:val="single" w:color="000000" w:sz="4"/>
+            </w:tcBorders>
+            <w:tcMar>
+              <w:top w:type="dxa" w:w="80"/>
+              <w:left w:type="dxa" w:w="120"/>
+              <w:bottom w:type="dxa" w:w="80"/>
+              <w:right w:type="dxa" w:w="120"/>
+            </w:tcMar>
+          </w:tcPr>
+          <w:p>
+            <w:pPr>
+              <w:jc w:val="center"/>
+            </w:pPr>
+            <w:r>
+              <w:rPr>
+                <w:rFonts w:ascii="Calibri" w:cs="Calibri" w:eastAsia="Calibri" w:hAnsi="Calibri"/>
+                <w:b w:val="false"/>
+                <w:bCs w:val="false"/>
+                <w:color w:val="000000"/>
+                <w:sz w:val="20"/>
+                <w:szCs w:val="20"/>
+              </w:rPr>
+              <w:t xml:space="preserve">1.94</w:t>
+            </w:r>
+          </w:p>
+        </w:tc>
+        <w:tc>
+          <w:tcPr>
+            <w:tcW w:type="dxa" w:w="900"/>
+            <w:tcBorders>
+              <w:top w:val="single" w:color="000000" w:sz="4"/>
+              <w:left w:val="single" w:color="000000" w:sz="4"/>
+              <w:bottom w:val="single" w:color="000000" w:sz="4"/>
+              <w:right w:val="single" w:color="000000" w:sz="4"/>
+            </w:tcBorders>
+            <w:tcMar>
+              <w:top w:type="dxa" w:w="80"/>
+              <w:left w:type="dxa" w:w="120"/>
+              <w:bottom w:type="dxa" w:w="80"/>
+              <w:right w:type="dxa" w:w="120"/>
+            </w:tcMar>
+          </w:tcPr>
+          <w:p>
+            <w:pPr>
+              <w:jc w:val="center"/>
+            </w:pPr>
+            <w:r>
+              <w:rPr>
+                <w:rFonts w:ascii="Calibri" w:cs="Calibri" w:eastAsia="Calibri" w:hAnsi="Calibri"/>
+                <w:b w:val="false"/>
+                <w:bCs w:val="false"/>
+                <w:color w:val="000000"/>
+                <w:sz w:val="20"/>
+                <w:szCs w:val="20"/>
+              </w:rPr>
+              <w:t xml:space="preserve">0.00</w:t>
+            </w:r>
+          </w:p>
+        </w:tc>
+        <w:tc>
+          <w:tcPr>
+            <w:tcW w:type="dxa" w:w="1000"/>
+            <w:tcBorders>
+              <w:top w:val="single" w:color="000000" w:sz="4"/>
+              <w:left w:val="single" w:color="000000" w:sz="4"/>
+              <w:bottom w:val="single" w:color="000000" w:sz="4"/>
+              <w:right w:val="single" w:color="000000" w:sz="4"/>
+            </w:tcBorders>
+            <w:tcMar>
+              <w:top w:type="dxa" w:w="80"/>
+              <w:left w:type="dxa" w:w="120"/>
+              <w:bottom w:type="dxa" w:w="80"/>
+              <w:right w:type="dxa" w:w="120"/>
+            </w:tcMar>
+          </w:tcPr>
+          <w:p>
+            <w:pPr>
+              <w:jc w:val="center"/>
+            </w:pPr>
+            <w:r>
+              <w:rPr>
+                <w:rFonts w:ascii="Calibri" w:cs="Calibri" w:eastAsia="Calibri" w:hAnsi="Calibri"/>
+                <w:b w:val="false"/>
+                <w:bCs w:val="false"/>
+                <w:color w:val="000000"/>
+                <w:sz w:val="20"/>
+                <w:szCs w:val="20"/>
+              </w:rPr>
+              <w:t xml:space="preserve">0.00</w:t>
+            </w:r>
+          </w:p>
+        </w:tc>
+        <w:tc>
+          <w:tcPr>
+            <w:tcW w:type="dxa" w:w="900"/>
+            <w:tcBorders>
+              <w:top w:val="single" w:color="000000" w:sz="4"/>
+              <w:left w:val="single" w:color="000000" w:sz="4"/>
+              <w:bottom w:val="single" w:color="000000" w:sz="4"/>
+              <w:right w:val="single" w:color="000000" w:sz="4"/>
+            </w:tcBorders>
+            <w:tcMar>
+              <w:top w:type="dxa" w:w="80"/>
+              <w:left w:type="dxa" w:w="120"/>
+              <w:bottom w:type="dxa" w:w="80"/>
+              <w:right w:type="dxa" w:w="120"/>
+            </w:tcMar>
+          </w:tcPr>
+          <w:p>
+            <w:pPr>
+              <w:jc w:val="center"/>
+            </w:pPr>
+            <w:r>
+              <w:rPr>
+                <w:rFonts w:ascii="Calibri" w:cs="Calibri" w:eastAsia="Calibri" w:hAnsi="Calibri"/>
+                <w:b w:val="false"/>
+                <w:bCs w:val="false"/>
+                <w:color w:val="000000"/>
+                <w:sz w:val="20"/>
+                <w:szCs w:val="20"/>
+              </w:rPr>
+              <w:t xml:space="preserve">15.2</w:t>
+            </w:r>
+          </w:p>
+        </w:tc>
+        <w:tc>
+          <w:tcPr>
+            <w:tcW w:type="dxa" w:w="1200"/>
+            <w:tcBorders>
+              <w:top w:val="single" w:color="000000" w:sz="4"/>
+              <w:left w:val="single" w:color="000000" w:sz="4"/>
+              <w:bottom w:val="single" w:color="000000" w:sz="4"/>
+              <w:right w:val="single" w:color="000000" w:sz="4"/>
+            </w:tcBorders>
+            <w:tcMar>
+              <w:top w:type="dxa" w:w="80"/>
+              <w:left w:type="dxa" w:w="120"/>
+              <w:bottom w:type="dxa" w:w="80"/>
+              <w:right w:type="dxa" w:w="120"/>
+            </w:tcMar>
+          </w:tcPr>
+          <w:p>
+            <w:pPr>
+              <w:jc w:val="center"/>
+            </w:pPr>
+            <w:r>
+              <w:rPr>
+                <w:rFonts w:ascii="Calibri" w:cs="Calibri" w:eastAsia="Calibri" w:hAnsi="Calibri"/>
+                <w:b w:val="false"/>
+                <w:bCs w:val="false"/>
+                <w:color w:val="000000"/>
+                <w:sz w:val="20"/>
+                <w:szCs w:val="20"/>
+              </w:rPr>
+              <w:t xml:space="preserve">64,056</w:t>
+            </w:r>
+          </w:p>
+        </w:tc>
+      </w:tr>
+      <w:tr>
+        <w:tc>
+          <w:tcPr>
+            <w:tcW w:type="dxa" w:w="2200"/>
+            <w:tcBorders>
+              <w:top w:val="single" w:color="000000" w:sz="4"/>
+              <w:left w:val="single" w:color="000000" w:sz="4"/>
+              <w:bottom w:val="single" w:color="000000" w:sz="4"/>
+              <w:right w:val="single" w:color="000000" w:sz="4"/>
+            </w:tcBorders>
+            <w:tcMar>
+              <w:top w:type="dxa" w:w="80"/>
+              <w:left w:type="dxa" w:w="120"/>
+              <w:bottom w:type="dxa" w:w="80"/>
+              <w:right w:type="dxa" w:w="120"/>
+            </w:tcMar>
+          </w:tcPr>
+          <w:p>
+            <w:pPr>
+              <w:jc w:val="left"/>
+            </w:pPr>
+            <w:r>
+              <w:rPr>
+                <w:rFonts w:ascii="Calibri" w:cs="Calibri" w:eastAsia="Calibri" w:hAnsi="Calibri"/>
+                <w:b w:val="false"/>
+                <w:bCs w:val="false"/>
+                <w:color w:val="000000"/>
+                <w:sz w:val="20"/>
+                <w:szCs w:val="20"/>
+              </w:rPr>
+              <w:t xml:space="preserve">Wind speed (m/s)</w:t>
+            </w:r>
+          </w:p>
+        </w:tc>
+        <w:tc>
+          <w:tcPr>
+            <w:tcW w:type="dxa" w:w="900"/>
+            <w:tcBorders>
+              <w:top w:val="single" w:color="000000" w:sz="4"/>
+              <w:left w:val="single" w:color="000000" w:sz="4"/>
+              <w:bottom w:val="single" w:color="000000" w:sz="4"/>
+              <w:right w:val="single" w:color="000000" w:sz="4"/>
+            </w:tcBorders>
+            <w:tcMar>
+              <w:top w:type="dxa" w:w="80"/>
+              <w:left w:type="dxa" w:w="120"/>
+              <w:bottom w:type="dxa" w:w="80"/>
+              <w:right w:type="dxa" w:w="120"/>
+            </w:tcMar>
+          </w:tcPr>
+          <w:p>
+            <w:pPr>
+              <w:jc w:val="center"/>
+            </w:pPr>
+            <w:r>
+              <w:rPr>
+                <w:rFonts w:ascii="Calibri" w:cs="Calibri" w:eastAsia="Calibri" w:hAnsi="Calibri"/>
+                <w:b w:val="false"/>
+                <w:bCs w:val="false"/>
+                <w:color w:val="000000"/>
+                <w:sz w:val="20"/>
+                <w:szCs w:val="20"/>
+              </w:rPr>
+              <w:t xml:space="preserve">5.42</w:t>
+            </w:r>
+          </w:p>
+        </w:tc>
+        <w:tc>
+          <w:tcPr>
+            <w:tcW w:type="dxa" w:w="900"/>
+            <w:tcBorders>
+              <w:top w:val="single" w:color="000000" w:sz="4"/>
+              <w:left w:val="single" w:color="000000" w:sz="4"/>
+              <w:bottom w:val="single" w:color="000000" w:sz="4"/>
+              <w:right w:val="single" w:color="000000" w:sz="4"/>
+            </w:tcBorders>
+            <w:tcMar>
+              <w:top w:type="dxa" w:w="80"/>
+              <w:left w:type="dxa" w:w="120"/>
+              <w:bottom w:type="dxa" w:w="80"/>
+              <w:right w:type="dxa" w:w="120"/>
+            </w:tcMar>
+          </w:tcPr>
+          <w:p>
+            <w:pPr>
+              <w:jc w:val="center"/>
+            </w:pPr>
+            <w:r>
+              <w:rPr>
+                <w:rFonts w:ascii="Calibri" w:cs="Calibri" w:eastAsia="Calibri" w:hAnsi="Calibri"/>
+                <w:b w:val="false"/>
+                <w:bCs w:val="false"/>
+                <w:color w:val="000000"/>
+                <w:sz w:val="20"/>
+                <w:szCs w:val="20"/>
+              </w:rPr>
+              <w:t xml:space="preserve">2.97</w:t>
+            </w:r>
+          </w:p>
+        </w:tc>
+        <w:tc>
+          <w:tcPr>
+            <w:tcW w:type="dxa" w:w="900"/>
+            <w:tcBorders>
+              <w:top w:val="single" w:color="000000" w:sz="4"/>
+              <w:left w:val="single" w:color="000000" w:sz="4"/>
+              <w:bottom w:val="single" w:color="000000" w:sz="4"/>
+              <w:right w:val="single" w:color="000000" w:sz="4"/>
+            </w:tcBorders>
+            <w:tcMar>
+              <w:top w:type="dxa" w:w="80"/>
+              <w:left w:type="dxa" w:w="120"/>
+              <w:bottom w:type="dxa" w:w="80"/>
+              <w:right w:type="dxa" w:w="120"/>
+            </w:tcMar>
+          </w:tcPr>
+          <w:p>
+            <w:pPr>
+              <w:jc w:val="center"/>
+            </w:pPr>
+            <w:r>
+              <w:rPr>
+                <w:rFonts w:ascii="Calibri" w:cs="Calibri" w:eastAsia="Calibri" w:hAnsi="Calibri"/>
+                <w:b w:val="false"/>
+                <w:bCs w:val="false"/>
+                <w:color w:val="000000"/>
+                <w:sz w:val="20"/>
+                <w:szCs w:val="20"/>
+              </w:rPr>
+              <w:t xml:space="preserve">0.12</w:t>
+            </w:r>
+          </w:p>
+        </w:tc>
+        <w:tc>
+          <w:tcPr>
+            <w:tcW w:type="dxa" w:w="1000"/>
+            <w:tcBorders>
+              <w:top w:val="single" w:color="000000" w:sz="4"/>
+              <w:left w:val="single" w:color="000000" w:sz="4"/>
+              <w:bottom w:val="single" w:color="000000" w:sz="4"/>
+              <w:right w:val="single" w:color="000000" w:sz="4"/>
+            </w:tcBorders>
+            <w:tcMar>
+              <w:top w:type="dxa" w:w="80"/>
+              <w:left w:type="dxa" w:w="120"/>
+              <w:bottom w:type="dxa" w:w="80"/>
+              <w:right w:type="dxa" w:w="120"/>
+            </w:tcMar>
+          </w:tcPr>
+          <w:p>
+            <w:pPr>
+              <w:jc w:val="center"/>
+            </w:pPr>
+            <w:r>
+              <w:rPr>
+                <w:rFonts w:ascii="Calibri" w:cs="Calibri" w:eastAsia="Calibri" w:hAnsi="Calibri"/>
+                <w:b w:val="false"/>
+                <w:bCs w:val="false"/>
+                <w:color w:val="000000"/>
+                <w:sz w:val="20"/>
+                <w:szCs w:val="20"/>
+              </w:rPr>
+              <w:t xml:space="preserve">4.93</w:t>
+            </w:r>
+          </w:p>
+        </w:tc>
+        <w:tc>
+          <w:tcPr>
+            <w:tcW w:type="dxa" w:w="900"/>
+            <w:tcBorders>
+              <w:top w:val="single" w:color="000000" w:sz="4"/>
+              <w:left w:val="single" w:color="000000" w:sz="4"/>
+              <w:bottom w:val="single" w:color="000000" w:sz="4"/>
+              <w:right w:val="single" w:color="000000" w:sz="4"/>
+            </w:tcBorders>
+            <w:tcMar>
+              <w:top w:type="dxa" w:w="80"/>
+              <w:left w:type="dxa" w:w="120"/>
+              <w:bottom w:type="dxa" w:w="80"/>
+              <w:right w:type="dxa" w:w="120"/>
+            </w:tcMar>
+          </w:tcPr>
+          <w:p>
+            <w:pPr>
+              <w:jc w:val="center"/>
+            </w:pPr>
+            <w:r>
+              <w:rPr>
+                <w:rFonts w:ascii="Calibri" w:cs="Calibri" w:eastAsia="Calibri" w:hAnsi="Calibri"/>
+                <w:b w:val="false"/>
+                <w:bCs w:val="false"/>
+                <w:color w:val="000000"/>
+                <w:sz w:val="20"/>
+                <w:szCs w:val="20"/>
+              </w:rPr>
+              <w:t xml:space="preserve">17.8</w:t>
+            </w:r>
+          </w:p>
+        </w:tc>
+        <w:tc>
+          <w:tcPr>
+            <w:tcW w:type="dxa" w:w="1200"/>
+            <w:tcBorders>
+              <w:top w:val="single" w:color="000000" w:sz="4"/>
+              <w:left w:val="single" w:color="000000" w:sz="4"/>
+              <w:bottom w:val="single" w:color="000000" w:sz="4"/>
+              <w:right w:val="single" w:color="000000" w:sz="4"/>
+            </w:tcBorders>
+            <w:tcMar>
+              <w:top w:type="dxa" w:w="80"/>
+              <w:left w:type="dxa" w:w="120"/>
+              <w:bottom w:type="dxa" w:w="80"/>
+              <w:right w:type="dxa" w:w="120"/>
+            </w:tcMar>
+          </w:tcPr>
+          <w:p>
+            <w:pPr>
+              <w:jc w:val="center"/>
+            </w:pPr>
+            <w:r>
+              <w:rPr>
+                <w:rFonts w:ascii="Calibri" w:cs="Calibri" w:eastAsia="Calibri" w:hAnsi="Calibri"/>
+                <w:b w:val="false"/>
+                <w:bCs w:val="false"/>
+                <w:color w:val="000000"/>
+                <w:sz w:val="20"/>
+                <w:szCs w:val="20"/>
+              </w:rPr>
+              <w:t xml:space="preserve">64,056</w:t>
+            </w:r>
+          </w:p>
+        </w:tc>
+      </w:tr>
+    </w:tbl>
+    <w:p>
+      <w:pPr>
+        <w:spacing w:after="60" w:before="60"/>
+      </w:pPr>
+      <w:r>
+        <w:rPr>
+          <w:rFonts w:ascii="Calibri" w:cs="Calibri" w:eastAsia="Calibri" w:hAnsi="Calibri"/>
+          <w:color w:val="000000"/>
+          <w:sz w:val="24"/>
+          <w:szCs w:val="24"/>
+        </w:rPr>
+        <w:t xml:space="preserve"/>
+      </w:r>
+    </w:p>
+    <w:p>
+      <w:pPr>
+        <w:spacing w:after="100" w:before="100" w:line="276" w:lineRule="auto"/>
+        <w:jc w:val="center"/>
+      </w:pPr>
+      <w:r>
+        <w:rPr>
+          <w:rFonts w:ascii="Calibri" w:cs="Calibri" w:eastAsia="Calibri" w:hAnsi="Calibri"/>
+          <w:b w:val="false"/>
+          <w:bCs w:val="false"/>
+          <w:i/>
+          <w:iCs/>
+          <w:color w:val="000000"/>
+          <w:sz w:val="24"/>
+          <w:szCs w:val="24"/>
+        </w:rPr>
+        <w:t xml:space="preserve">Table 0 — Summary statistics for key variables (n = 64,056 hourly observations, January 2018 - April 2025).</w:t>
+      </w:r>
+    </w:p>
+    <w:p>
+      <w:pPr>
+        <w:spacing w:after="120" w:before="120"/>
+      </w:pPr>
+      <w:r>
+        <w:rPr>
+          <w:rFonts w:ascii="Calibri" w:cs="Calibri" w:eastAsia="Calibri" w:hAnsi="Calibri"/>
+          <w:color w:val="000000"/>
+          <w:sz w:val="24"/>
+          <w:szCs w:val="24"/>
+        </w:rPr>
+        <w:t xml:space="preserve"/>
       </w:r>
     </w:p>
     <w:p>
@@ -1594,12 +3796,12 @@
           <w:sz w:val="24"/>
           <w:szCs w:val="24"/>
         </w:rPr>
-        <w:t xml:space="preserve">The hour of day and month of year are encoded using sine/cosine transformations to preserve their cyclic nature: hour_sin = sin(2*pi*h/24), hour_cos = cos(2*pi*h/24). An is_weekend binary indicator captures the systematic weekday/weekend price differential.</w:t>
-      </w:r>
-    </w:p>
-    <w:p>
-      <w:pPr>
-        <w:spacing w:after="100" w:before="200"/>
+        <w:t xml:space="preserve">Several distributional features are noteworthy. Price and generation variables (particularly gas-fired generation) are heavily right-skewed due to the 2022 energy crisis, which produced the extreme positive tail. Fuel prices — TTF gas and ARA coal — are leptokurtic, with excess kurtosis driven by the crisis period. The Cooling Degree Day (CDD) variable (computed with a 22 degrees C threshold) exhibits near-zero variability outside summer months, consistent with France's predominantly heating-driven thermosensitivity.</w:t>
+      </w:r>
+    </w:p>
+    <w:p>
+      <w:pPr>
+        <w:spacing w:after="120" w:before="280"/>
       </w:pPr>
       <w:r>
         <w:rPr>
@@ -1607,10 +3809,10 @@
           <w:b/>
           <w:bCs/>
           <w:color w:val="000000"/>
-          <w:sz w:val="26"/>
-          <w:szCs w:val="26"/>
-        </w:rPr>
-        <w:t xml:space="preserve">3.3.2 Price Lags</w:t>
+          <w:sz w:val="28"/>
+          <w:szCs w:val="28"/>
+        </w:rPr>
+        <w:t xml:space="preserve">3.4 Feature Engineering</w:t>
       </w:r>
     </w:p>
     <w:p>
@@ -1629,7 +3831,7 @@
           <w:sz w:val="24"/>
           <w:szCs w:val="24"/>
         </w:rPr>
-        <w:t xml:space="preserve">We include lags at 24h, 48h, and 168h (one week), as well as 24-hour and 168-hour rolling means. The 168-hour lag (same hour, previous week) is particularly important, as weekly seasonality in electricity prices is stronger than daily seasonality.</w:t>
+        <w:t xml:space="preserve">From the raw data sources, we construct 35 features organised into five categories.</w:t>
       </w:r>
     </w:p>
     <w:p>
@@ -1645,7 +3847,77 @@
           <w:sz w:val="26"/>
           <w:szCs w:val="26"/>
         </w:rPr>
-        <w:t xml:space="preserve">3.3.3 Weather-Derived Features</w:t>
+        <w:t xml:space="preserve">3.4.1 Calendar Features</w:t>
+      </w:r>
+    </w:p>
+    <w:p>
+      <w:pPr>
+        <w:spacing w:after="100" w:before="100" w:line="276" w:lineRule="auto"/>
+        <w:jc w:val="both"/>
+      </w:pPr>
+      <w:r>
+        <w:rPr>
+          <w:rFonts w:ascii="Calibri" w:cs="Calibri" w:eastAsia="Calibri" w:hAnsi="Calibri"/>
+          <w:b w:val="false"/>
+          <w:bCs w:val="false"/>
+          <w:i w:val="false"/>
+          <w:iCs w:val="false"/>
+          <w:color w:val="000000"/>
+          <w:sz w:val="24"/>
+          <w:szCs w:val="24"/>
+        </w:rPr>
+        <w:t xml:space="preserve">The hour of day and month of year are encoded using sine/cosine transformations to preserve their cyclic nature: hour_sin = sin(2*pi*h/24), hour_cos = cos(2*pi*h/24). An is_weekend binary indicator captures the systematic weekday/weekend price differential.</w:t>
+      </w:r>
+    </w:p>
+    <w:p>
+      <w:pPr>
+        <w:spacing w:after="100" w:before="200"/>
+      </w:pPr>
+      <w:r>
+        <w:rPr>
+          <w:rFonts w:ascii="Calibri" w:cs="Calibri" w:eastAsia="Calibri" w:hAnsi="Calibri"/>
+          <w:b/>
+          <w:bCs/>
+          <w:color w:val="000000"/>
+          <w:sz w:val="26"/>
+          <w:szCs w:val="26"/>
+        </w:rPr>
+        <w:t xml:space="preserve">3.4.2 Price Lags</w:t>
+      </w:r>
+    </w:p>
+    <w:p>
+      <w:pPr>
+        <w:spacing w:after="100" w:before="100" w:line="276" w:lineRule="auto"/>
+        <w:jc w:val="both"/>
+      </w:pPr>
+      <w:r>
+        <w:rPr>
+          <w:rFonts w:ascii="Calibri" w:cs="Calibri" w:eastAsia="Calibri" w:hAnsi="Calibri"/>
+          <w:b w:val="false"/>
+          <w:bCs w:val="false"/>
+          <w:i w:val="false"/>
+          <w:iCs w:val="false"/>
+          <w:color w:val="000000"/>
+          <w:sz w:val="24"/>
+          <w:szCs w:val="24"/>
+        </w:rPr>
+        <w:t xml:space="preserve">We include lags at 24h, 48h, and 168h (one week), as well as 24-hour and 168-hour rolling means. The 168-hour lag (same hour, previous week) is particularly important, as weekly seasonality in electricity prices is stronger than daily seasonality.</w:t>
+      </w:r>
+    </w:p>
+    <w:p>
+      <w:pPr>
+        <w:spacing w:after="100" w:before="200"/>
+      </w:pPr>
+      <w:r>
+        <w:rPr>
+          <w:rFonts w:ascii="Calibri" w:cs="Calibri" w:eastAsia="Calibri" w:hAnsi="Calibri"/>
+          <w:b/>
+          <w:bCs/>
+          <w:color w:val="000000"/>
+          <w:sz w:val="26"/>
+          <w:szCs w:val="26"/>
+        </w:rPr>
+        <w:t xml:space="preserve">3.4.3 Weather-Derived Features</w:t>
       </w:r>
     </w:p>
     <w:p>
@@ -1702,7 +3974,7 @@
           <w:sz w:val="24"/>
           <w:szCs w:val="24"/>
         </w:rPr>
-        <w:t xml:space="preserve">Wind Power Proxy: v^3, where v is the 10m wind speed. Wind turbine power output is proportional to the cube of wind speed in the operational range.</w:t>
+        <w:t xml:space="preserve">Cooling Degree Days (CDD): max(0, T - 22), where T is the 2m temperature. The 22 degrees C threshold captures cooling demand from air conditioning in warm months.</w:t>
       </w:r>
     </w:p>
     <w:p>
@@ -1721,6 +3993,25 @@
           <w:sz w:val="24"/>
           <w:szCs w:val="24"/>
         </w:rPr>
+        <w:t xml:space="preserve">Wind Power Proxy: v^3, where v is the 10m wind speed. Wind turbine power output is proportional to the cube of wind speed in the operational range.</w:t>
+      </w:r>
+    </w:p>
+    <w:p>
+      <w:pPr>
+        <w:pStyle w:val="ListParagraph"/>
+        <w:numPr>
+          <w:ilvl w:val="0"/>
+          <w:numId w:val="3"/>
+        </w:numPr>
+        <w:spacing w:after="60" w:before="60"/>
+      </w:pPr>
+      <w:r>
+        <w:rPr>
+          <w:rFonts w:ascii="Calibri" w:cs="Calibri" w:eastAsia="Calibri" w:hAnsi="Calibri"/>
+          <w:color w:val="000000"/>
+          <w:sz w:val="24"/>
+          <w:szCs w:val="24"/>
+        </w:rPr>
         <w:t xml:space="preserve">Weather Stress Index (WSI): HDD / wind_speed. High when temperatures are cold AND wind is weak — the combination historically associated with extreme French price spikes.</w:t>
       </w:r>
     </w:p>
@@ -1737,7 +4028,7 @@
           <w:sz w:val="26"/>
           <w:szCs w:val="26"/>
         </w:rPr>
-        <w:t xml:space="preserve">3.3.4 Nuclear Availability Ratio</w:t>
+        <w:t xml:space="preserve">3.4.4 Nuclear Availability Ratio</w:t>
       </w:r>
     </w:p>
     <w:p>
@@ -1926,7 +4217,7 @@
           <w:sz w:val="28"/>
           <w:szCs w:val="28"/>
         </w:rPr>
-        <w:t xml:space="preserve">3.4 Train / Test Split</w:t>
+        <w:t xml:space="preserve">3.5 Train / Test Split</w:t>
       </w:r>
     </w:p>
     <w:p>
@@ -5126,7 +7417,7 @@
           <w:sz w:val="24"/>
           <w:szCs w:val="24"/>
         </w:rPr>
-        <w:t xml:space="preserve">Price lags dominate the ranking, with the 168-hour lag, 168-hour rolling mean, and 24-hour rolling mean occupying top positions. Among fundamentals, the TTF gas price and load forecast rank prominently. Nuclear availability ratio also ranks highly. Among weather features, temperature and wind speed appear but with lower importance than price lags or TTF — consistent with the DM test result.</w:t>
+        <w:t xml:space="preserve">Price lags dominate the ranking. The 24-hour lag (lag_24h) is the single most important feature at approximately 20.7% Mean Decrease in Impurity (MDI). The 24-hour rolling mean contributes 14.3%, the 48-hour lag 12.4%, the 168-hour rolling mean 11.9%, and the 168-hour lag 10.4%. Together, price lags and their rolling means account for approximately 70% of total feature importance. Among fundamentals, TTF gas price contributes 8.3%, ARA coal 6.0%, and nuclear availability approximately 1.9%. All weather features combined account for approximately 2.2% of total MDI — consistent with the DM test finding of non-significance in the stable period.</w:t>
       </w:r>
     </w:p>
     <w:p>
@@ -5142,7 +7433,1925 @@
           <w:sz w:val="28"/>
           <w:szCs w:val="28"/>
         </w:rPr>
-        <w:t xml:space="preserve">4.7 Explanation of the Central Result</w:t>
+        <w:t xml:space="preserve">4.7 Robustness: 2022 Energy Crisis Validation</w:t>
+      </w:r>
+    </w:p>
+    <w:p>
+      <w:pPr>
+        <w:spacing w:after="100" w:before="100" w:line="276" w:lineRule="auto"/>
+        <w:jc w:val="both"/>
+      </w:pPr>
+      <w:r>
+        <w:rPr>
+          <w:rFonts w:ascii="Calibri" w:cs="Calibri" w:eastAsia="Calibri" w:hAnsi="Calibri"/>
+          <w:b w:val="false"/>
+          <w:bCs w:val="false"/>
+          <w:i w:val="false"/>
+          <w:iCs w:val="false"/>
+          <w:color w:val="000000"/>
+          <w:sz w:val="24"/>
+          <w:szCs w:val="24"/>
+        </w:rPr>
+        <w:t xml:space="preserve">To assess whether the non-significance of weather is robust to market regime, we conduct a separate out-of-sample experiment using the 2022 energy crisis as a natural experiment. Models are retrained on the 2018-2021 period and evaluated on the full year 2022 (8,760 hours), which encompasses the Russian gas supply disruption, historically low French nuclear availability, and extreme price spikes above 1,000 EUR/MWh.</w:t>
+      </w:r>
+    </w:p>
+    <w:p>
+      <w:pPr>
+        <w:spacing w:after="100" w:before="200"/>
+      </w:pPr>
+      <w:r>
+        <w:rPr>
+          <w:rFonts w:ascii="Calibri" w:cs="Calibri" w:eastAsia="Calibri" w:hAnsi="Calibri"/>
+          <w:b/>
+          <w:bCs/>
+          <w:color w:val="000000"/>
+          <w:sz w:val="26"/>
+          <w:szCs w:val="26"/>
+        </w:rPr>
+        <w:t xml:space="preserve">4.7.1 Performance Results</w:t>
+      </w:r>
+    </w:p>
+    <w:p>
+      <w:pPr>
+        <w:spacing w:after="120" w:before="120"/>
+      </w:pPr>
+      <w:r>
+        <w:rPr>
+          <w:rFonts w:ascii="Calibri" w:cs="Calibri" w:eastAsia="Calibri" w:hAnsi="Calibri"/>
+          <w:color w:val="000000"/>
+          <w:sz w:val="24"/>
+          <w:szCs w:val="24"/>
+        </w:rPr>
+        <w:t xml:space="preserve"/>
+      </w:r>
+    </w:p>
+    <w:tbl>
+      <w:tblPr>
+        <w:tblW w:type="dxa" w:w="8400"/>
+        <w:tblBorders>
+          <w:top w:val="single" w:color="auto" w:sz="4"/>
+          <w:left w:val="single" w:color="auto" w:sz="4"/>
+          <w:bottom w:val="single" w:color="auto" w:sz="4"/>
+          <w:right w:val="single" w:color="auto" w:sz="4"/>
+          <w:insideH w:val="single" w:color="auto" w:sz="4"/>
+          <w:insideV w:val="single" w:color="auto" w:sz="4"/>
+        </w:tblBorders>
+      </w:tblPr>
+      <w:tblGrid>
+        <w:gridCol w:w="2500"/>
+        <w:gridCol w:w="1400"/>
+        <w:gridCol w:w="1500"/>
+        <w:gridCol w:w="1200"/>
+        <w:gridCol w:w="900"/>
+        <w:gridCol w:w="900"/>
+      </w:tblGrid>
+      <w:tr>
+        <w:tc>
+          <w:tcPr>
+            <w:tcW w:type="dxa" w:w="2500"/>
+            <w:tcBorders>
+              <w:top w:val="single" w:color="000000" w:sz="4"/>
+              <w:left w:val="single" w:color="000000" w:sz="4"/>
+              <w:bottom w:val="single" w:color="000000" w:sz="4"/>
+              <w:right w:val="single" w:color="000000" w:sz="4"/>
+            </w:tcBorders>
+            <w:tcMar>
+              <w:top w:type="dxa" w:w="80"/>
+              <w:left w:type="dxa" w:w="120"/>
+              <w:bottom w:type="dxa" w:w="80"/>
+              <w:right w:type="dxa" w:w="120"/>
+            </w:tcMar>
+          </w:tcPr>
+          <w:p>
+            <w:pPr>
+              <w:jc w:val="left"/>
+            </w:pPr>
+            <w:r>
+              <w:rPr>
+                <w:rFonts w:ascii="Calibri" w:cs="Calibri" w:eastAsia="Calibri" w:hAnsi="Calibri"/>
+                <w:b/>
+                <w:bCs/>
+                <w:color w:val="000000"/>
+                <w:sz w:val="20"/>
+                <w:szCs w:val="20"/>
+              </w:rPr>
+              <w:t xml:space="preserve">Model</w:t>
+            </w:r>
+          </w:p>
+        </w:tc>
+        <w:tc>
+          <w:tcPr>
+            <w:tcW w:type="dxa" w:w="1400"/>
+            <w:tcBorders>
+              <w:top w:val="single" w:color="000000" w:sz="4"/>
+              <w:left w:val="single" w:color="000000" w:sz="4"/>
+              <w:bottom w:val="single" w:color="000000" w:sz="4"/>
+              <w:right w:val="single" w:color="000000" w:sz="4"/>
+            </w:tcBorders>
+            <w:tcMar>
+              <w:top w:type="dxa" w:w="80"/>
+              <w:left w:type="dxa" w:w="120"/>
+              <w:bottom w:type="dxa" w:w="80"/>
+              <w:right w:type="dxa" w:w="120"/>
+            </w:tcMar>
+          </w:tcPr>
+          <w:p>
+            <w:pPr>
+              <w:jc w:val="center"/>
+            </w:pPr>
+            <w:r>
+              <w:rPr>
+                <w:rFonts w:ascii="Calibri" w:cs="Calibri" w:eastAsia="Calibri" w:hAnsi="Calibri"/>
+                <w:b/>
+                <w:bCs/>
+                <w:color w:val="000000"/>
+                <w:sz w:val="20"/>
+                <w:szCs w:val="20"/>
+              </w:rPr>
+              <w:t xml:space="preserve">MAE (EUR/MWh)</w:t>
+            </w:r>
+          </w:p>
+        </w:tc>
+        <w:tc>
+          <w:tcPr>
+            <w:tcW w:type="dxa" w:w="1500"/>
+            <w:tcBorders>
+              <w:top w:val="single" w:color="000000" w:sz="4"/>
+              <w:left w:val="single" w:color="000000" w:sz="4"/>
+              <w:bottom w:val="single" w:color="000000" w:sz="4"/>
+              <w:right w:val="single" w:color="000000" w:sz="4"/>
+            </w:tcBorders>
+            <w:tcMar>
+              <w:top w:type="dxa" w:w="80"/>
+              <w:left w:type="dxa" w:w="120"/>
+              <w:bottom w:type="dxa" w:w="80"/>
+              <w:right w:type="dxa" w:w="120"/>
+            </w:tcMar>
+          </w:tcPr>
+          <w:p>
+            <w:pPr>
+              <w:jc w:val="center"/>
+            </w:pPr>
+            <w:r>
+              <w:rPr>
+                <w:rFonts w:ascii="Calibri" w:cs="Calibri" w:eastAsia="Calibri" w:hAnsi="Calibri"/>
+                <w:b/>
+                <w:bCs/>
+                <w:color w:val="000000"/>
+                <w:sz w:val="20"/>
+                <w:szCs w:val="20"/>
+              </w:rPr>
+              <w:t xml:space="preserve">RMSE (EUR/MWh)</w:t>
+            </w:r>
+          </w:p>
+        </w:tc>
+        <w:tc>
+          <w:tcPr>
+            <w:tcW w:type="dxa" w:w="1200"/>
+            <w:tcBorders>
+              <w:top w:val="single" w:color="000000" w:sz="4"/>
+              <w:left w:val="single" w:color="000000" w:sz="4"/>
+              <w:bottom w:val="single" w:color="000000" w:sz="4"/>
+              <w:right w:val="single" w:color="000000" w:sz="4"/>
+            </w:tcBorders>
+            <w:tcMar>
+              <w:top w:type="dxa" w:w="80"/>
+              <w:left w:type="dxa" w:w="120"/>
+              <w:bottom w:type="dxa" w:w="80"/>
+              <w:right w:type="dxa" w:w="120"/>
+            </w:tcMar>
+          </w:tcPr>
+          <w:p>
+            <w:pPr>
+              <w:jc w:val="center"/>
+            </w:pPr>
+            <w:r>
+              <w:rPr>
+                <w:rFonts w:ascii="Calibri" w:cs="Calibri" w:eastAsia="Calibri" w:hAnsi="Calibri"/>
+                <w:b/>
+                <w:bCs/>
+                <w:color w:val="000000"/>
+                <w:sz w:val="20"/>
+                <w:szCs w:val="20"/>
+              </w:rPr>
+              <w:t xml:space="preserve">sMAPE (%)</w:t>
+            </w:r>
+          </w:p>
+        </w:tc>
+        <w:tc>
+          <w:tcPr>
+            <w:tcW w:type="dxa" w:w="900"/>
+            <w:tcBorders>
+              <w:top w:val="single" w:color="000000" w:sz="4"/>
+              <w:left w:val="single" w:color="000000" w:sz="4"/>
+              <w:bottom w:val="single" w:color="000000" w:sz="4"/>
+              <w:right w:val="single" w:color="000000" w:sz="4"/>
+            </w:tcBorders>
+            <w:tcMar>
+              <w:top w:type="dxa" w:w="80"/>
+              <w:left w:type="dxa" w:w="120"/>
+              <w:bottom w:type="dxa" w:w="80"/>
+              <w:right w:type="dxa" w:w="120"/>
+            </w:tcMar>
+          </w:tcPr>
+          <w:p>
+            <w:pPr>
+              <w:jc w:val="center"/>
+            </w:pPr>
+            <w:r>
+              <w:rPr>
+                <w:rFonts w:ascii="Calibri" w:cs="Calibri" w:eastAsia="Calibri" w:hAnsi="Calibri"/>
+                <w:b/>
+                <w:bCs/>
+                <w:color w:val="000000"/>
+                <w:sz w:val="20"/>
+                <w:szCs w:val="20"/>
+              </w:rPr>
+              <w:t xml:space="preserve">R2</w:t>
+            </w:r>
+          </w:p>
+        </w:tc>
+        <w:tc>
+          <w:tcPr>
+            <w:tcW w:type="dxa" w:w="900"/>
+            <w:tcBorders>
+              <w:top w:val="single" w:color="000000" w:sz="4"/>
+              <w:left w:val="single" w:color="000000" w:sz="4"/>
+              <w:bottom w:val="single" w:color="000000" w:sz="4"/>
+              <w:right w:val="single" w:color="000000" w:sz="4"/>
+            </w:tcBorders>
+            <w:tcMar>
+              <w:top w:type="dxa" w:w="80"/>
+              <w:left w:type="dxa" w:w="120"/>
+              <w:bottom w:type="dxa" w:w="80"/>
+              <w:right w:type="dxa" w:w="120"/>
+            </w:tcMar>
+          </w:tcPr>
+          <w:p>
+            <w:pPr>
+              <w:jc w:val="center"/>
+            </w:pPr>
+            <w:r>
+              <w:rPr>
+                <w:rFonts w:ascii="Calibri" w:cs="Calibri" w:eastAsia="Calibri" w:hAnsi="Calibri"/>
+                <w:b/>
+                <w:bCs/>
+                <w:color w:val="000000"/>
+                <w:sz w:val="20"/>
+                <w:szCs w:val="20"/>
+              </w:rPr>
+              <w:t xml:space="preserve">Hit (%)</w:t>
+            </w:r>
+          </w:p>
+        </w:tc>
+      </w:tr>
+      <w:tr>
+        <w:tc>
+          <w:tcPr>
+            <w:tcW w:type="dxa" w:w="2500"/>
+            <w:tcBorders>
+              <w:top w:val="single" w:color="000000" w:sz="4"/>
+              <w:left w:val="single" w:color="000000" w:sz="4"/>
+              <w:bottom w:val="single" w:color="000000" w:sz="4"/>
+              <w:right w:val="single" w:color="000000" w:sz="4"/>
+            </w:tcBorders>
+            <w:tcMar>
+              <w:top w:type="dxa" w:w="80"/>
+              <w:left w:type="dxa" w:w="120"/>
+              <w:bottom w:type="dxa" w:w="80"/>
+              <w:right w:type="dxa" w:w="120"/>
+            </w:tcMar>
+          </w:tcPr>
+          <w:p>
+            <w:pPr>
+              <w:jc w:val="left"/>
+            </w:pPr>
+            <w:r>
+              <w:rPr>
+                <w:rFonts w:ascii="Calibri" w:cs="Calibri" w:eastAsia="Calibri" w:hAnsi="Calibri"/>
+                <w:b w:val="false"/>
+                <w:bCs w:val="false"/>
+                <w:color w:val="000000"/>
+                <w:sz w:val="20"/>
+                <w:szCs w:val="20"/>
+              </w:rPr>
+              <w:t xml:space="preserve">A - Naive lag-168h</w:t>
+            </w:r>
+          </w:p>
+        </w:tc>
+        <w:tc>
+          <w:tcPr>
+            <w:tcW w:type="dxa" w:w="1400"/>
+            <w:tcBorders>
+              <w:top w:val="single" w:color="000000" w:sz="4"/>
+              <w:left w:val="single" w:color="000000" w:sz="4"/>
+              <w:bottom w:val="single" w:color="000000" w:sz="4"/>
+              <w:right w:val="single" w:color="000000" w:sz="4"/>
+            </w:tcBorders>
+            <w:tcMar>
+              <w:top w:type="dxa" w:w="80"/>
+              <w:left w:type="dxa" w:w="120"/>
+              <w:bottom w:type="dxa" w:w="80"/>
+              <w:right w:type="dxa" w:w="120"/>
+            </w:tcMar>
+          </w:tcPr>
+          <w:p>
+            <w:pPr>
+              <w:jc w:val="center"/>
+            </w:pPr>
+            <w:r>
+              <w:rPr>
+                <w:rFonts w:ascii="Calibri" w:cs="Calibri" w:eastAsia="Calibri" w:hAnsi="Calibri"/>
+                <w:b w:val="false"/>
+                <w:bCs w:val="false"/>
+                <w:color w:val="000000"/>
+                <w:sz w:val="20"/>
+                <w:szCs w:val="20"/>
+              </w:rPr>
+              <w:t xml:space="preserve">72.74</w:t>
+            </w:r>
+          </w:p>
+        </w:tc>
+        <w:tc>
+          <w:tcPr>
+            <w:tcW w:type="dxa" w:w="1500"/>
+            <w:tcBorders>
+              <w:top w:val="single" w:color="000000" w:sz="4"/>
+              <w:left w:val="single" w:color="000000" w:sz="4"/>
+              <w:bottom w:val="single" w:color="000000" w:sz="4"/>
+              <w:right w:val="single" w:color="000000" w:sz="4"/>
+            </w:tcBorders>
+            <w:tcMar>
+              <w:top w:type="dxa" w:w="80"/>
+              <w:left w:type="dxa" w:w="120"/>
+              <w:bottom w:type="dxa" w:w="80"/>
+              <w:right w:type="dxa" w:w="120"/>
+            </w:tcMar>
+          </w:tcPr>
+          <w:p>
+            <w:pPr>
+              <w:jc w:val="center"/>
+            </w:pPr>
+            <w:r>
+              <w:rPr>
+                <w:rFonts w:ascii="Calibri" w:cs="Calibri" w:eastAsia="Calibri" w:hAnsi="Calibri"/>
+                <w:b w:val="false"/>
+                <w:bCs w:val="false"/>
+                <w:color w:val="000000"/>
+                <w:sz w:val="20"/>
+                <w:szCs w:val="20"/>
+              </w:rPr>
+              <w:t xml:space="preserve">111.11</w:t>
+            </w:r>
+          </w:p>
+        </w:tc>
+        <w:tc>
+          <w:tcPr>
+            <w:tcW w:type="dxa" w:w="1200"/>
+            <w:tcBorders>
+              <w:top w:val="single" w:color="000000" w:sz="4"/>
+              <w:left w:val="single" w:color="000000" w:sz="4"/>
+              <w:bottom w:val="single" w:color="000000" w:sz="4"/>
+              <w:right w:val="single" w:color="000000" w:sz="4"/>
+            </w:tcBorders>
+            <w:tcMar>
+              <w:top w:type="dxa" w:w="80"/>
+              <w:left w:type="dxa" w:w="120"/>
+              <w:bottom w:type="dxa" w:w="80"/>
+              <w:right w:type="dxa" w:w="120"/>
+            </w:tcMar>
+          </w:tcPr>
+          <w:p>
+            <w:pPr>
+              <w:jc w:val="center"/>
+            </w:pPr>
+            <w:r>
+              <w:rPr>
+                <w:rFonts w:ascii="Calibri" w:cs="Calibri" w:eastAsia="Calibri" w:hAnsi="Calibri"/>
+                <w:b w:val="false"/>
+                <w:bCs w:val="false"/>
+                <w:color w:val="000000"/>
+                <w:sz w:val="20"/>
+                <w:szCs w:val="20"/>
+              </w:rPr>
+              <w:t xml:space="preserve">29.2</w:t>
+            </w:r>
+          </w:p>
+        </w:tc>
+        <w:tc>
+          <w:tcPr>
+            <w:tcW w:type="dxa" w:w="900"/>
+            <w:tcBorders>
+              <w:top w:val="single" w:color="000000" w:sz="4"/>
+              <w:left w:val="single" w:color="000000" w:sz="4"/>
+              <w:bottom w:val="single" w:color="000000" w:sz="4"/>
+              <w:right w:val="single" w:color="000000" w:sz="4"/>
+            </w:tcBorders>
+            <w:tcMar>
+              <w:top w:type="dxa" w:w="80"/>
+              <w:left w:type="dxa" w:w="120"/>
+              <w:bottom w:type="dxa" w:w="80"/>
+              <w:right w:type="dxa" w:w="120"/>
+            </w:tcMar>
+          </w:tcPr>
+          <w:p>
+            <w:pPr>
+              <w:jc w:val="center"/>
+            </w:pPr>
+            <w:r>
+              <w:rPr>
+                <w:rFonts w:ascii="Calibri" w:cs="Calibri" w:eastAsia="Calibri" w:hAnsi="Calibri"/>
+                <w:b w:val="false"/>
+                <w:bCs w:val="false"/>
+                <w:color w:val="000000"/>
+                <w:sz w:val="20"/>
+                <w:szCs w:val="20"/>
+              </w:rPr>
+              <w:t xml:space="preserve">0.419</w:t>
+            </w:r>
+          </w:p>
+        </w:tc>
+        <w:tc>
+          <w:tcPr>
+            <w:tcW w:type="dxa" w:w="900"/>
+            <w:tcBorders>
+              <w:top w:val="single" w:color="000000" w:sz="4"/>
+              <w:left w:val="single" w:color="000000" w:sz="4"/>
+              <w:bottom w:val="single" w:color="000000" w:sz="4"/>
+              <w:right w:val="single" w:color="000000" w:sz="4"/>
+            </w:tcBorders>
+            <w:tcMar>
+              <w:top w:type="dxa" w:w="80"/>
+              <w:left w:type="dxa" w:w="120"/>
+              <w:bottom w:type="dxa" w:w="80"/>
+              <w:right w:type="dxa" w:w="120"/>
+            </w:tcMar>
+          </w:tcPr>
+          <w:p>
+            <w:pPr>
+              <w:jc w:val="center"/>
+            </w:pPr>
+            <w:r>
+              <w:rPr>
+                <w:rFonts w:ascii="Calibri" w:cs="Calibri" w:eastAsia="Calibri" w:hAnsi="Calibri"/>
+                <w:b w:val="false"/>
+                <w:bCs w:val="false"/>
+                <w:color w:val="000000"/>
+                <w:sz w:val="20"/>
+                <w:szCs w:val="20"/>
+              </w:rPr>
+              <w:t xml:space="preserve">57.4</w:t>
+            </w:r>
+          </w:p>
+        </w:tc>
+      </w:tr>
+      <w:tr>
+        <w:tc>
+          <w:tcPr>
+            <w:tcW w:type="dxa" w:w="2500"/>
+            <w:tcBorders>
+              <w:top w:val="single" w:color="000000" w:sz="4"/>
+              <w:left w:val="single" w:color="000000" w:sz="4"/>
+              <w:bottom w:val="single" w:color="000000" w:sz="4"/>
+              <w:right w:val="single" w:color="000000" w:sz="4"/>
+            </w:tcBorders>
+            <w:tcMar>
+              <w:top w:type="dxa" w:w="80"/>
+              <w:left w:type="dxa" w:w="120"/>
+              <w:bottom w:type="dxa" w:w="80"/>
+              <w:right w:type="dxa" w:w="120"/>
+            </w:tcMar>
+          </w:tcPr>
+          <w:p>
+            <w:pPr>
+              <w:jc w:val="left"/>
+            </w:pPr>
+            <w:r>
+              <w:rPr>
+                <w:rFonts w:ascii="Calibri" w:cs="Calibri" w:eastAsia="Calibri" w:hAnsi="Calibri"/>
+                <w:b w:val="false"/>
+                <w:bCs w:val="false"/>
+                <w:color w:val="000000"/>
+                <w:sz w:val="20"/>
+                <w:szCs w:val="20"/>
+              </w:rPr>
+              <w:t xml:space="preserve">B - RF without weather</w:t>
+            </w:r>
+          </w:p>
+        </w:tc>
+        <w:tc>
+          <w:tcPr>
+            <w:tcW w:type="dxa" w:w="1400"/>
+            <w:tcBorders>
+              <w:top w:val="single" w:color="000000" w:sz="4"/>
+              <w:left w:val="single" w:color="000000" w:sz="4"/>
+              <w:bottom w:val="single" w:color="000000" w:sz="4"/>
+              <w:right w:val="single" w:color="000000" w:sz="4"/>
+            </w:tcBorders>
+            <w:tcMar>
+              <w:top w:type="dxa" w:w="80"/>
+              <w:left w:type="dxa" w:w="120"/>
+              <w:bottom w:type="dxa" w:w="80"/>
+              <w:right w:type="dxa" w:w="120"/>
+            </w:tcMar>
+          </w:tcPr>
+          <w:p>
+            <w:pPr>
+              <w:jc w:val="center"/>
+            </w:pPr>
+            <w:r>
+              <w:rPr>
+                <w:rFonts w:ascii="Calibri" w:cs="Calibri" w:eastAsia="Calibri" w:hAnsi="Calibri"/>
+                <w:b w:val="false"/>
+                <w:bCs w:val="false"/>
+                <w:color w:val="000000"/>
+                <w:sz w:val="20"/>
+                <w:szCs w:val="20"/>
+              </w:rPr>
+              <w:t xml:space="preserve">67.28</w:t>
+            </w:r>
+          </w:p>
+        </w:tc>
+        <w:tc>
+          <w:tcPr>
+            <w:tcW w:type="dxa" w:w="1500"/>
+            <w:tcBorders>
+              <w:top w:val="single" w:color="000000" w:sz="4"/>
+              <w:left w:val="single" w:color="000000" w:sz="4"/>
+              <w:bottom w:val="single" w:color="000000" w:sz="4"/>
+              <w:right w:val="single" w:color="000000" w:sz="4"/>
+            </w:tcBorders>
+            <w:tcMar>
+              <w:top w:type="dxa" w:w="80"/>
+              <w:left w:type="dxa" w:w="120"/>
+              <w:bottom w:type="dxa" w:w="80"/>
+              <w:right w:type="dxa" w:w="120"/>
+            </w:tcMar>
+          </w:tcPr>
+          <w:p>
+            <w:pPr>
+              <w:jc w:val="center"/>
+            </w:pPr>
+            <w:r>
+              <w:rPr>
+                <w:rFonts w:ascii="Calibri" w:cs="Calibri" w:eastAsia="Calibri" w:hAnsi="Calibri"/>
+                <w:b w:val="false"/>
+                <w:bCs w:val="false"/>
+                <w:color w:val="000000"/>
+                <w:sz w:val="20"/>
+                <w:szCs w:val="20"/>
+              </w:rPr>
+              <w:t xml:space="preserve">106.76</w:t>
+            </w:r>
+          </w:p>
+        </w:tc>
+        <w:tc>
+          <w:tcPr>
+            <w:tcW w:type="dxa" w:w="1200"/>
+            <w:tcBorders>
+              <w:top w:val="single" w:color="000000" w:sz="4"/>
+              <w:left w:val="single" w:color="000000" w:sz="4"/>
+              <w:bottom w:val="single" w:color="000000" w:sz="4"/>
+              <w:right w:val="single" w:color="000000" w:sz="4"/>
+            </w:tcBorders>
+            <w:tcMar>
+              <w:top w:type="dxa" w:w="80"/>
+              <w:left w:type="dxa" w:w="120"/>
+              <w:bottom w:type="dxa" w:w="80"/>
+              <w:right w:type="dxa" w:w="120"/>
+            </w:tcMar>
+          </w:tcPr>
+          <w:p>
+            <w:pPr>
+              <w:jc w:val="center"/>
+            </w:pPr>
+            <w:r>
+              <w:rPr>
+                <w:rFonts w:ascii="Calibri" w:cs="Calibri" w:eastAsia="Calibri" w:hAnsi="Calibri"/>
+                <w:b w:val="false"/>
+                <w:bCs w:val="false"/>
+                <w:color w:val="000000"/>
+                <w:sz w:val="20"/>
+                <w:szCs w:val="20"/>
+              </w:rPr>
+              <w:t xml:space="preserve">25.3</w:t>
+            </w:r>
+          </w:p>
+        </w:tc>
+        <w:tc>
+          <w:tcPr>
+            <w:tcW w:type="dxa" w:w="900"/>
+            <w:tcBorders>
+              <w:top w:val="single" w:color="000000" w:sz="4"/>
+              <w:left w:val="single" w:color="000000" w:sz="4"/>
+              <w:bottom w:val="single" w:color="000000" w:sz="4"/>
+              <w:right w:val="single" w:color="000000" w:sz="4"/>
+            </w:tcBorders>
+            <w:tcMar>
+              <w:top w:type="dxa" w:w="80"/>
+              <w:left w:type="dxa" w:w="120"/>
+              <w:bottom w:type="dxa" w:w="80"/>
+              <w:right w:type="dxa" w:w="120"/>
+            </w:tcMar>
+          </w:tcPr>
+          <w:p>
+            <w:pPr>
+              <w:jc w:val="center"/>
+            </w:pPr>
+            <w:r>
+              <w:rPr>
+                <w:rFonts w:ascii="Calibri" w:cs="Calibri" w:eastAsia="Calibri" w:hAnsi="Calibri"/>
+                <w:b w:val="false"/>
+                <w:bCs w:val="false"/>
+                <w:color w:val="000000"/>
+                <w:sz w:val="20"/>
+                <w:szCs w:val="20"/>
+              </w:rPr>
+              <w:t xml:space="preserve">0.464</w:t>
+            </w:r>
+          </w:p>
+        </w:tc>
+        <w:tc>
+          <w:tcPr>
+            <w:tcW w:type="dxa" w:w="900"/>
+            <w:tcBorders>
+              <w:top w:val="single" w:color="000000" w:sz="4"/>
+              <w:left w:val="single" w:color="000000" w:sz="4"/>
+              <w:bottom w:val="single" w:color="000000" w:sz="4"/>
+              <w:right w:val="single" w:color="000000" w:sz="4"/>
+            </w:tcBorders>
+            <w:tcMar>
+              <w:top w:type="dxa" w:w="80"/>
+              <w:left w:type="dxa" w:w="120"/>
+              <w:bottom w:type="dxa" w:w="80"/>
+              <w:right w:type="dxa" w:w="120"/>
+            </w:tcMar>
+          </w:tcPr>
+          <w:p>
+            <w:pPr>
+              <w:jc w:val="center"/>
+            </w:pPr>
+            <w:r>
+              <w:rPr>
+                <w:rFonts w:ascii="Calibri" w:cs="Calibri" w:eastAsia="Calibri" w:hAnsi="Calibri"/>
+                <w:b w:val="false"/>
+                <w:bCs w:val="false"/>
+                <w:color w:val="000000"/>
+                <w:sz w:val="20"/>
+                <w:szCs w:val="20"/>
+              </w:rPr>
+              <w:t xml:space="preserve">58.9</w:t>
+            </w:r>
+          </w:p>
+        </w:tc>
+      </w:tr>
+      <w:tr>
+        <w:tc>
+          <w:tcPr>
+            <w:tcW w:type="dxa" w:w="2500"/>
+            <w:tcBorders>
+              <w:top w:val="single" w:color="000000" w:sz="4"/>
+              <w:left w:val="single" w:color="000000" w:sz="4"/>
+              <w:bottom w:val="single" w:color="000000" w:sz="4"/>
+              <w:right w:val="single" w:color="000000" w:sz="4"/>
+            </w:tcBorders>
+            <w:tcMar>
+              <w:top w:type="dxa" w:w="80"/>
+              <w:left w:type="dxa" w:w="120"/>
+              <w:bottom w:type="dxa" w:w="80"/>
+              <w:right w:type="dxa" w:w="120"/>
+            </w:tcMar>
+          </w:tcPr>
+          <w:p>
+            <w:pPr>
+              <w:jc w:val="left"/>
+            </w:pPr>
+            <w:r>
+              <w:rPr>
+                <w:rFonts w:ascii="Calibri" w:cs="Calibri" w:eastAsia="Calibri" w:hAnsi="Calibri"/>
+                <w:b w:val="false"/>
+                <w:bCs w:val="false"/>
+                <w:color w:val="000000"/>
+                <w:sz w:val="20"/>
+                <w:szCs w:val="20"/>
+              </w:rPr>
+              <w:t xml:space="preserve">C - RF with weather</w:t>
+            </w:r>
+          </w:p>
+        </w:tc>
+        <w:tc>
+          <w:tcPr>
+            <w:tcW w:type="dxa" w:w="1400"/>
+            <w:tcBorders>
+              <w:top w:val="single" w:color="000000" w:sz="4"/>
+              <w:left w:val="single" w:color="000000" w:sz="4"/>
+              <w:bottom w:val="single" w:color="000000" w:sz="4"/>
+              <w:right w:val="single" w:color="000000" w:sz="4"/>
+            </w:tcBorders>
+            <w:tcMar>
+              <w:top w:type="dxa" w:w="80"/>
+              <w:left w:type="dxa" w:w="120"/>
+              <w:bottom w:type="dxa" w:w="80"/>
+              <w:right w:type="dxa" w:w="120"/>
+            </w:tcMar>
+          </w:tcPr>
+          <w:p>
+            <w:pPr>
+              <w:jc w:val="center"/>
+            </w:pPr>
+            <w:r>
+              <w:rPr>
+                <w:rFonts w:ascii="Calibri" w:cs="Calibri" w:eastAsia="Calibri" w:hAnsi="Calibri"/>
+                <w:b w:val="false"/>
+                <w:bCs w:val="false"/>
+                <w:color w:val="000000"/>
+                <w:sz w:val="20"/>
+                <w:szCs w:val="20"/>
+              </w:rPr>
+              <w:t xml:space="preserve">66.55</w:t>
+            </w:r>
+          </w:p>
+        </w:tc>
+        <w:tc>
+          <w:tcPr>
+            <w:tcW w:type="dxa" w:w="1500"/>
+            <w:tcBorders>
+              <w:top w:val="single" w:color="000000" w:sz="4"/>
+              <w:left w:val="single" w:color="000000" w:sz="4"/>
+              <w:bottom w:val="single" w:color="000000" w:sz="4"/>
+              <w:right w:val="single" w:color="000000" w:sz="4"/>
+            </w:tcBorders>
+            <w:tcMar>
+              <w:top w:type="dxa" w:w="80"/>
+              <w:left w:type="dxa" w:w="120"/>
+              <w:bottom w:type="dxa" w:w="80"/>
+              <w:right w:type="dxa" w:w="120"/>
+            </w:tcMar>
+          </w:tcPr>
+          <w:p>
+            <w:pPr>
+              <w:jc w:val="center"/>
+            </w:pPr>
+            <w:r>
+              <w:rPr>
+                <w:rFonts w:ascii="Calibri" w:cs="Calibri" w:eastAsia="Calibri" w:hAnsi="Calibri"/>
+                <w:b w:val="false"/>
+                <w:bCs w:val="false"/>
+                <w:color w:val="000000"/>
+                <w:sz w:val="20"/>
+                <w:szCs w:val="20"/>
+              </w:rPr>
+              <w:t xml:space="preserve">105.63</w:t>
+            </w:r>
+          </w:p>
+        </w:tc>
+        <w:tc>
+          <w:tcPr>
+            <w:tcW w:type="dxa" w:w="1200"/>
+            <w:tcBorders>
+              <w:top w:val="single" w:color="000000" w:sz="4"/>
+              <w:left w:val="single" w:color="000000" w:sz="4"/>
+              <w:bottom w:val="single" w:color="000000" w:sz="4"/>
+              <w:right w:val="single" w:color="000000" w:sz="4"/>
+            </w:tcBorders>
+            <w:tcMar>
+              <w:top w:type="dxa" w:w="80"/>
+              <w:left w:type="dxa" w:w="120"/>
+              <w:bottom w:type="dxa" w:w="80"/>
+              <w:right w:type="dxa" w:w="120"/>
+            </w:tcMar>
+          </w:tcPr>
+          <w:p>
+            <w:pPr>
+              <w:jc w:val="center"/>
+            </w:pPr>
+            <w:r>
+              <w:rPr>
+                <w:rFonts w:ascii="Calibri" w:cs="Calibri" w:eastAsia="Calibri" w:hAnsi="Calibri"/>
+                <w:b w:val="false"/>
+                <w:bCs w:val="false"/>
+                <w:color w:val="000000"/>
+                <w:sz w:val="20"/>
+                <w:szCs w:val="20"/>
+              </w:rPr>
+              <w:t xml:space="preserve">25.0</w:t>
+            </w:r>
+          </w:p>
+        </w:tc>
+        <w:tc>
+          <w:tcPr>
+            <w:tcW w:type="dxa" w:w="900"/>
+            <w:tcBorders>
+              <w:top w:val="single" w:color="000000" w:sz="4"/>
+              <w:left w:val="single" w:color="000000" w:sz="4"/>
+              <w:bottom w:val="single" w:color="000000" w:sz="4"/>
+              <w:right w:val="single" w:color="000000" w:sz="4"/>
+            </w:tcBorders>
+            <w:tcMar>
+              <w:top w:type="dxa" w:w="80"/>
+              <w:left w:type="dxa" w:w="120"/>
+              <w:bottom w:type="dxa" w:w="80"/>
+              <w:right w:type="dxa" w:w="120"/>
+            </w:tcMar>
+          </w:tcPr>
+          <w:p>
+            <w:pPr>
+              <w:jc w:val="center"/>
+            </w:pPr>
+            <w:r>
+              <w:rPr>
+                <w:rFonts w:ascii="Calibri" w:cs="Calibri" w:eastAsia="Calibri" w:hAnsi="Calibri"/>
+                <w:b w:val="false"/>
+                <w:bCs w:val="false"/>
+                <w:color w:val="000000"/>
+                <w:sz w:val="20"/>
+                <w:szCs w:val="20"/>
+              </w:rPr>
+              <w:t xml:space="preserve">0.475</w:t>
+            </w:r>
+          </w:p>
+        </w:tc>
+        <w:tc>
+          <w:tcPr>
+            <w:tcW w:type="dxa" w:w="900"/>
+            <w:tcBorders>
+              <w:top w:val="single" w:color="000000" w:sz="4"/>
+              <w:left w:val="single" w:color="000000" w:sz="4"/>
+              <w:bottom w:val="single" w:color="000000" w:sz="4"/>
+              <w:right w:val="single" w:color="000000" w:sz="4"/>
+            </w:tcBorders>
+            <w:tcMar>
+              <w:top w:type="dxa" w:w="80"/>
+              <w:left w:type="dxa" w:w="120"/>
+              <w:bottom w:type="dxa" w:w="80"/>
+              <w:right w:type="dxa" w:w="120"/>
+            </w:tcMar>
+          </w:tcPr>
+          <w:p>
+            <w:pPr>
+              <w:jc w:val="center"/>
+            </w:pPr>
+            <w:r>
+              <w:rPr>
+                <w:rFonts w:ascii="Calibri" w:cs="Calibri" w:eastAsia="Calibri" w:hAnsi="Calibri"/>
+                <w:b w:val="false"/>
+                <w:bCs w:val="false"/>
+                <w:color w:val="000000"/>
+                <w:sz w:val="20"/>
+                <w:szCs w:val="20"/>
+              </w:rPr>
+              <w:t xml:space="preserve">58.7</w:t>
+            </w:r>
+          </w:p>
+        </w:tc>
+      </w:tr>
+      <w:tr>
+        <w:tc>
+          <w:tcPr>
+            <w:tcW w:type="dxa" w:w="2500"/>
+            <w:tcBorders>
+              <w:top w:val="single" w:color="000000" w:sz="4"/>
+              <w:left w:val="single" w:color="000000" w:sz="4"/>
+              <w:bottom w:val="single" w:color="000000" w:sz="4"/>
+              <w:right w:val="single" w:color="000000" w:sz="4"/>
+            </w:tcBorders>
+            <w:tcMar>
+              <w:top w:type="dxa" w:w="80"/>
+              <w:left w:type="dxa" w:w="120"/>
+              <w:bottom w:type="dxa" w:w="80"/>
+              <w:right w:type="dxa" w:w="120"/>
+            </w:tcMar>
+          </w:tcPr>
+          <w:p>
+            <w:pPr>
+              <w:jc w:val="left"/>
+            </w:pPr>
+            <w:r>
+              <w:rPr>
+                <w:rFonts w:ascii="Calibri" w:cs="Calibri" w:eastAsia="Calibri" w:hAnsi="Calibri"/>
+                <w:b w:val="false"/>
+                <w:bCs w:val="false"/>
+                <w:color w:val="000000"/>
+                <w:sz w:val="20"/>
+                <w:szCs w:val="20"/>
+              </w:rPr>
+              <w:t xml:space="preserve">D - XGBoost with weather</w:t>
+            </w:r>
+          </w:p>
+        </w:tc>
+        <w:tc>
+          <w:tcPr>
+            <w:tcW w:type="dxa" w:w="1400"/>
+            <w:tcBorders>
+              <w:top w:val="single" w:color="000000" w:sz="4"/>
+              <w:left w:val="single" w:color="000000" w:sz="4"/>
+              <w:bottom w:val="single" w:color="000000" w:sz="4"/>
+              <w:right w:val="single" w:color="000000" w:sz="4"/>
+            </w:tcBorders>
+            <w:tcMar>
+              <w:top w:type="dxa" w:w="80"/>
+              <w:left w:type="dxa" w:w="120"/>
+              <w:bottom w:type="dxa" w:w="80"/>
+              <w:right w:type="dxa" w:w="120"/>
+            </w:tcMar>
+          </w:tcPr>
+          <w:p>
+            <w:pPr>
+              <w:jc w:val="center"/>
+            </w:pPr>
+            <w:r>
+              <w:rPr>
+                <w:rFonts w:ascii="Calibri" w:cs="Calibri" w:eastAsia="Calibri" w:hAnsi="Calibri"/>
+                <w:b w:val="false"/>
+                <w:bCs w:val="false"/>
+                <w:color w:val="000000"/>
+                <w:sz w:val="20"/>
+                <w:szCs w:val="20"/>
+              </w:rPr>
+              <w:t xml:space="preserve">76.32</w:t>
+            </w:r>
+          </w:p>
+        </w:tc>
+        <w:tc>
+          <w:tcPr>
+            <w:tcW w:type="dxa" w:w="1500"/>
+            <w:tcBorders>
+              <w:top w:val="single" w:color="000000" w:sz="4"/>
+              <w:left w:val="single" w:color="000000" w:sz="4"/>
+              <w:bottom w:val="single" w:color="000000" w:sz="4"/>
+              <w:right w:val="single" w:color="000000" w:sz="4"/>
+            </w:tcBorders>
+            <w:tcMar>
+              <w:top w:type="dxa" w:w="80"/>
+              <w:left w:type="dxa" w:w="120"/>
+              <w:bottom w:type="dxa" w:w="80"/>
+              <w:right w:type="dxa" w:w="120"/>
+            </w:tcMar>
+          </w:tcPr>
+          <w:p>
+            <w:pPr>
+              <w:jc w:val="center"/>
+            </w:pPr>
+            <w:r>
+              <w:rPr>
+                <w:rFonts w:ascii="Calibri" w:cs="Calibri" w:eastAsia="Calibri" w:hAnsi="Calibri"/>
+                <w:b w:val="false"/>
+                <w:bCs w:val="false"/>
+                <w:color w:val="000000"/>
+                <w:sz w:val="20"/>
+                <w:szCs w:val="20"/>
+              </w:rPr>
+              <w:t xml:space="preserve">123.54</w:t>
+            </w:r>
+          </w:p>
+        </w:tc>
+        <w:tc>
+          <w:tcPr>
+            <w:tcW w:type="dxa" w:w="1200"/>
+            <w:tcBorders>
+              <w:top w:val="single" w:color="000000" w:sz="4"/>
+              <w:left w:val="single" w:color="000000" w:sz="4"/>
+              <w:bottom w:val="single" w:color="000000" w:sz="4"/>
+              <w:right w:val="single" w:color="000000" w:sz="4"/>
+            </w:tcBorders>
+            <w:tcMar>
+              <w:top w:type="dxa" w:w="80"/>
+              <w:left w:type="dxa" w:w="120"/>
+              <w:bottom w:type="dxa" w:w="80"/>
+              <w:right w:type="dxa" w:w="120"/>
+            </w:tcMar>
+          </w:tcPr>
+          <w:p>
+            <w:pPr>
+              <w:jc w:val="center"/>
+            </w:pPr>
+            <w:r>
+              <w:rPr>
+                <w:rFonts w:ascii="Calibri" w:cs="Calibri" w:eastAsia="Calibri" w:hAnsi="Calibri"/>
+                <w:b w:val="false"/>
+                <w:bCs w:val="false"/>
+                <w:color w:val="000000"/>
+                <w:sz w:val="20"/>
+                <w:szCs w:val="20"/>
+              </w:rPr>
+              <w:t xml:space="preserve">28.0</w:t>
+            </w:r>
+          </w:p>
+        </w:tc>
+        <w:tc>
+          <w:tcPr>
+            <w:tcW w:type="dxa" w:w="900"/>
+            <w:tcBorders>
+              <w:top w:val="single" w:color="000000" w:sz="4"/>
+              <w:left w:val="single" w:color="000000" w:sz="4"/>
+              <w:bottom w:val="single" w:color="000000" w:sz="4"/>
+              <w:right w:val="single" w:color="000000" w:sz="4"/>
+            </w:tcBorders>
+            <w:tcMar>
+              <w:top w:type="dxa" w:w="80"/>
+              <w:left w:type="dxa" w:w="120"/>
+              <w:bottom w:type="dxa" w:w="80"/>
+              <w:right w:type="dxa" w:w="120"/>
+            </w:tcMar>
+          </w:tcPr>
+          <w:p>
+            <w:pPr>
+              <w:jc w:val="center"/>
+            </w:pPr>
+            <w:r>
+              <w:rPr>
+                <w:rFonts w:ascii="Calibri" w:cs="Calibri" w:eastAsia="Calibri" w:hAnsi="Calibri"/>
+                <w:b w:val="false"/>
+                <w:bCs w:val="false"/>
+                <w:color w:val="000000"/>
+                <w:sz w:val="20"/>
+                <w:szCs w:val="20"/>
+              </w:rPr>
+              <w:t xml:space="preserve">0.282</w:t>
+            </w:r>
+          </w:p>
+        </w:tc>
+        <w:tc>
+          <w:tcPr>
+            <w:tcW w:type="dxa" w:w="900"/>
+            <w:tcBorders>
+              <w:top w:val="single" w:color="000000" w:sz="4"/>
+              <w:left w:val="single" w:color="000000" w:sz="4"/>
+              <w:bottom w:val="single" w:color="000000" w:sz="4"/>
+              <w:right w:val="single" w:color="000000" w:sz="4"/>
+            </w:tcBorders>
+            <w:tcMar>
+              <w:top w:type="dxa" w:w="80"/>
+              <w:left w:type="dxa" w:w="120"/>
+              <w:bottom w:type="dxa" w:w="80"/>
+              <w:right w:type="dxa" w:w="120"/>
+            </w:tcMar>
+          </w:tcPr>
+          <w:p>
+            <w:pPr>
+              <w:jc w:val="center"/>
+            </w:pPr>
+            <w:r>
+              <w:rPr>
+                <w:rFonts w:ascii="Calibri" w:cs="Calibri" w:eastAsia="Calibri" w:hAnsi="Calibri"/>
+                <w:b w:val="false"/>
+                <w:bCs w:val="false"/>
+                <w:color w:val="000000"/>
+                <w:sz w:val="20"/>
+                <w:szCs w:val="20"/>
+              </w:rPr>
+              <w:t xml:space="preserve">61.5</w:t>
+            </w:r>
+          </w:p>
+        </w:tc>
+      </w:tr>
+    </w:tbl>
+    <w:p>
+      <w:pPr>
+        <w:spacing w:after="60" w:before="60"/>
+      </w:pPr>
+      <w:r>
+        <w:rPr>
+          <w:rFonts w:ascii="Calibri" w:cs="Calibri" w:eastAsia="Calibri" w:hAnsi="Calibri"/>
+          <w:color w:val="000000"/>
+          <w:sz w:val="24"/>
+          <w:szCs w:val="24"/>
+        </w:rPr>
+        <w:t xml:space="preserve"/>
+      </w:r>
+    </w:p>
+    <w:p>
+      <w:pPr>
+        <w:spacing w:after="100" w:before="100" w:line="276" w:lineRule="auto"/>
+        <w:jc w:val="center"/>
+      </w:pPr>
+      <w:r>
+        <w:rPr>
+          <w:rFonts w:ascii="Calibri" w:cs="Calibri" w:eastAsia="Calibri" w:hAnsi="Calibri"/>
+          <w:b w:val="false"/>
+          <w:bCs w:val="false"/>
+          <w:i/>
+          <w:iCs/>
+          <w:color w:val="000000"/>
+          <w:sz w:val="24"/>
+          <w:szCs w:val="24"/>
+        </w:rPr>
+        <w:t xml:space="preserve">Table 2b — Out-of-sample forecast performance, 2022 energy crisis validation (n = 8,760 hours).</w:t>
+      </w:r>
+    </w:p>
+    <w:p>
+      <w:pPr>
+        <w:spacing w:after="120" w:before="120"/>
+      </w:pPr>
+      <w:r>
+        <w:rPr>
+          <w:rFonts w:ascii="Calibri" w:cs="Calibri" w:eastAsia="Calibri" w:hAnsi="Calibri"/>
+          <w:color w:val="000000"/>
+          <w:sz w:val="24"/>
+          <w:szCs w:val="24"/>
+        </w:rPr>
+        <w:t xml:space="preserve"/>
+      </w:r>
+    </w:p>
+    <w:p>
+      <w:pPr>
+        <w:spacing w:after="100" w:before="200"/>
+      </w:pPr>
+      <w:r>
+        <w:rPr>
+          <w:rFonts w:ascii="Calibri" w:cs="Calibri" w:eastAsia="Calibri" w:hAnsi="Calibri"/>
+          <w:b/>
+          <w:bCs/>
+          <w:color w:val="000000"/>
+          <w:sz w:val="26"/>
+          <w:szCs w:val="26"/>
+        </w:rPr>
+        <w:t xml:space="preserve">4.7.2 Diebold-Mariano Tests — 2022</w:t>
+      </w:r>
+    </w:p>
+    <w:p>
+      <w:pPr>
+        <w:spacing w:after="120" w:before="120"/>
+      </w:pPr>
+      <w:r>
+        <w:rPr>
+          <w:rFonts w:ascii="Calibri" w:cs="Calibri" w:eastAsia="Calibri" w:hAnsi="Calibri"/>
+          <w:color w:val="000000"/>
+          <w:sz w:val="24"/>
+          <w:szCs w:val="24"/>
+        </w:rPr>
+        <w:t xml:space="preserve"/>
+      </w:r>
+    </w:p>
+    <w:tbl>
+      <w:tblPr>
+        <w:tblW w:type="dxa" w:w="7100"/>
+        <w:tblBorders>
+          <w:top w:val="single" w:color="auto" w:sz="4"/>
+          <w:left w:val="single" w:color="auto" w:sz="4"/>
+          <w:bottom w:val="single" w:color="auto" w:sz="4"/>
+          <w:right w:val="single" w:color="auto" w:sz="4"/>
+          <w:insideH w:val="single" w:color="auto" w:sz="4"/>
+          <w:insideV w:val="single" w:color="auto" w:sz="4"/>
+        </w:tblBorders>
+      </w:tblPr>
+      <w:tblGrid>
+        <w:gridCol w:w="3200"/>
+        <w:gridCol w:w="1200"/>
+        <w:gridCol w:w="1200"/>
+        <w:gridCol w:w="1500"/>
+      </w:tblGrid>
+      <w:tr>
+        <w:tc>
+          <w:tcPr>
+            <w:tcW w:type="dxa" w:w="3200"/>
+            <w:tcBorders>
+              <w:top w:val="single" w:color="000000" w:sz="4"/>
+              <w:left w:val="single" w:color="000000" w:sz="4"/>
+              <w:bottom w:val="single" w:color="000000" w:sz="4"/>
+              <w:right w:val="single" w:color="000000" w:sz="4"/>
+            </w:tcBorders>
+            <w:tcMar>
+              <w:top w:type="dxa" w:w="80"/>
+              <w:left w:type="dxa" w:w="120"/>
+              <w:bottom w:type="dxa" w:w="80"/>
+              <w:right w:type="dxa" w:w="120"/>
+            </w:tcMar>
+          </w:tcPr>
+          <w:p>
+            <w:pPr>
+              <w:jc w:val="left"/>
+            </w:pPr>
+            <w:r>
+              <w:rPr>
+                <w:rFonts w:ascii="Calibri" w:cs="Calibri" w:eastAsia="Calibri" w:hAnsi="Calibri"/>
+                <w:b/>
+                <w:bCs/>
+                <w:color w:val="000000"/>
+                <w:sz w:val="20"/>
+                <w:szCs w:val="20"/>
+              </w:rPr>
+              <w:t xml:space="preserve">Comparison</w:t>
+            </w:r>
+          </w:p>
+        </w:tc>
+        <w:tc>
+          <w:tcPr>
+            <w:tcW w:type="dxa" w:w="1200"/>
+            <w:tcBorders>
+              <w:top w:val="single" w:color="000000" w:sz="4"/>
+              <w:left w:val="single" w:color="000000" w:sz="4"/>
+              <w:bottom w:val="single" w:color="000000" w:sz="4"/>
+              <w:right w:val="single" w:color="000000" w:sz="4"/>
+            </w:tcBorders>
+            <w:tcMar>
+              <w:top w:type="dxa" w:w="80"/>
+              <w:left w:type="dxa" w:w="120"/>
+              <w:bottom w:type="dxa" w:w="80"/>
+              <w:right w:type="dxa" w:w="120"/>
+            </w:tcMar>
+          </w:tcPr>
+          <w:p>
+            <w:pPr>
+              <w:jc w:val="center"/>
+            </w:pPr>
+            <w:r>
+              <w:rPr>
+                <w:rFonts w:ascii="Calibri" w:cs="Calibri" w:eastAsia="Calibri" w:hAnsi="Calibri"/>
+                <w:b/>
+                <w:bCs/>
+                <w:color w:val="000000"/>
+                <w:sz w:val="20"/>
+                <w:szCs w:val="20"/>
+              </w:rPr>
+              <w:t xml:space="preserve">DM Stat.</w:t>
+            </w:r>
+          </w:p>
+        </w:tc>
+        <w:tc>
+          <w:tcPr>
+            <w:tcW w:type="dxa" w:w="1200"/>
+            <w:tcBorders>
+              <w:top w:val="single" w:color="000000" w:sz="4"/>
+              <w:left w:val="single" w:color="000000" w:sz="4"/>
+              <w:bottom w:val="single" w:color="000000" w:sz="4"/>
+              <w:right w:val="single" w:color="000000" w:sz="4"/>
+            </w:tcBorders>
+            <w:tcMar>
+              <w:top w:type="dxa" w:w="80"/>
+              <w:left w:type="dxa" w:w="120"/>
+              <w:bottom w:type="dxa" w:w="80"/>
+              <w:right w:type="dxa" w:w="120"/>
+            </w:tcMar>
+          </w:tcPr>
+          <w:p>
+            <w:pPr>
+              <w:jc w:val="center"/>
+            </w:pPr>
+            <w:r>
+              <w:rPr>
+                <w:rFonts w:ascii="Calibri" w:cs="Calibri" w:eastAsia="Calibri" w:hAnsi="Calibri"/>
+                <w:b/>
+                <w:bCs/>
+                <w:color w:val="000000"/>
+                <w:sz w:val="20"/>
+                <w:szCs w:val="20"/>
+              </w:rPr>
+              <w:t xml:space="preserve">p-value</w:t>
+            </w:r>
+          </w:p>
+        </w:tc>
+        <w:tc>
+          <w:tcPr>
+            <w:tcW w:type="dxa" w:w="1500"/>
+            <w:tcBorders>
+              <w:top w:val="single" w:color="000000" w:sz="4"/>
+              <w:left w:val="single" w:color="000000" w:sz="4"/>
+              <w:bottom w:val="single" w:color="000000" w:sz="4"/>
+              <w:right w:val="single" w:color="000000" w:sz="4"/>
+            </w:tcBorders>
+            <w:tcMar>
+              <w:top w:type="dxa" w:w="80"/>
+              <w:left w:type="dxa" w:w="120"/>
+              <w:bottom w:type="dxa" w:w="80"/>
+              <w:right w:type="dxa" w:w="120"/>
+            </w:tcMar>
+          </w:tcPr>
+          <w:p>
+            <w:pPr>
+              <w:jc w:val="center"/>
+            </w:pPr>
+            <w:r>
+              <w:rPr>
+                <w:rFonts w:ascii="Calibri" w:cs="Calibri" w:eastAsia="Calibri" w:hAnsi="Calibri"/>
+                <w:b/>
+                <w:bCs/>
+                <w:color w:val="000000"/>
+                <w:sz w:val="20"/>
+                <w:szCs w:val="20"/>
+              </w:rPr>
+              <w:t xml:space="preserve">Significance</w:t>
+            </w:r>
+          </w:p>
+        </w:tc>
+      </w:tr>
+      <w:tr>
+        <w:tc>
+          <w:tcPr>
+            <w:tcW w:type="dxa" w:w="3200"/>
+            <w:tcBorders>
+              <w:top w:val="single" w:color="000000" w:sz="4"/>
+              <w:left w:val="single" w:color="000000" w:sz="4"/>
+              <w:bottom w:val="single" w:color="000000" w:sz="4"/>
+              <w:right w:val="single" w:color="000000" w:sz="4"/>
+            </w:tcBorders>
+            <w:tcMar>
+              <w:top w:type="dxa" w:w="80"/>
+              <w:left w:type="dxa" w:w="120"/>
+              <w:bottom w:type="dxa" w:w="80"/>
+              <w:right w:type="dxa" w:w="120"/>
+            </w:tcMar>
+          </w:tcPr>
+          <w:p>
+            <w:pPr>
+              <w:jc w:val="left"/>
+            </w:pPr>
+            <w:r>
+              <w:rPr>
+                <w:rFonts w:ascii="Calibri" w:cs="Calibri" w:eastAsia="Calibri" w:hAnsi="Calibri"/>
+                <w:b w:val="false"/>
+                <w:bCs w:val="false"/>
+                <w:color w:val="000000"/>
+                <w:sz w:val="20"/>
+                <w:szCs w:val="20"/>
+              </w:rPr>
+              <w:t xml:space="preserve">C vs B: does weather add value?</w:t>
+            </w:r>
+          </w:p>
+        </w:tc>
+        <w:tc>
+          <w:tcPr>
+            <w:tcW w:type="dxa" w:w="1200"/>
+            <w:tcBorders>
+              <w:top w:val="single" w:color="000000" w:sz="4"/>
+              <w:left w:val="single" w:color="000000" w:sz="4"/>
+              <w:bottom w:val="single" w:color="000000" w:sz="4"/>
+              <w:right w:val="single" w:color="000000" w:sz="4"/>
+            </w:tcBorders>
+            <w:tcMar>
+              <w:top w:type="dxa" w:w="80"/>
+              <w:left w:type="dxa" w:w="120"/>
+              <w:bottom w:type="dxa" w:w="80"/>
+              <w:right w:type="dxa" w:w="120"/>
+            </w:tcMar>
+          </w:tcPr>
+          <w:p>
+            <w:pPr>
+              <w:jc w:val="center"/>
+            </w:pPr>
+            <w:r>
+              <w:rPr>
+                <w:rFonts w:ascii="Calibri" w:cs="Calibri" w:eastAsia="Calibri" w:hAnsi="Calibri"/>
+                <w:b w:val="false"/>
+                <w:bCs w:val="false"/>
+                <w:color w:val="000000"/>
+                <w:sz w:val="20"/>
+                <w:szCs w:val="20"/>
+              </w:rPr>
+              <w:t xml:space="preserve">-13.27</w:t>
+            </w:r>
+          </w:p>
+        </w:tc>
+        <w:tc>
+          <w:tcPr>
+            <w:tcW w:type="dxa" w:w="1200"/>
+            <w:tcBorders>
+              <w:top w:val="single" w:color="000000" w:sz="4"/>
+              <w:left w:val="single" w:color="000000" w:sz="4"/>
+              <w:bottom w:val="single" w:color="000000" w:sz="4"/>
+              <w:right w:val="single" w:color="000000" w:sz="4"/>
+            </w:tcBorders>
+            <w:tcMar>
+              <w:top w:type="dxa" w:w="80"/>
+              <w:left w:type="dxa" w:w="120"/>
+              <w:bottom w:type="dxa" w:w="80"/>
+              <w:right w:type="dxa" w:w="120"/>
+            </w:tcMar>
+          </w:tcPr>
+          <w:p>
+            <w:pPr>
+              <w:jc w:val="center"/>
+            </w:pPr>
+            <w:r>
+              <w:rPr>
+                <w:rFonts w:ascii="Calibri" w:cs="Calibri" w:eastAsia="Calibri" w:hAnsi="Calibri"/>
+                <w:b w:val="false"/>
+                <w:bCs w:val="false"/>
+                <w:color w:val="000000"/>
+                <w:sz w:val="20"/>
+                <w:szCs w:val="20"/>
+              </w:rPr>
+              <w:t xml:space="preserve">&lt;0.001</w:t>
+            </w:r>
+          </w:p>
+        </w:tc>
+        <w:tc>
+          <w:tcPr>
+            <w:tcW w:type="dxa" w:w="1500"/>
+            <w:tcBorders>
+              <w:top w:val="single" w:color="000000" w:sz="4"/>
+              <w:left w:val="single" w:color="000000" w:sz="4"/>
+              <w:bottom w:val="single" w:color="000000" w:sz="4"/>
+              <w:right w:val="single" w:color="000000" w:sz="4"/>
+            </w:tcBorders>
+            <w:tcMar>
+              <w:top w:type="dxa" w:w="80"/>
+              <w:left w:type="dxa" w:w="120"/>
+              <w:bottom w:type="dxa" w:w="80"/>
+              <w:right w:type="dxa" w:w="120"/>
+            </w:tcMar>
+          </w:tcPr>
+          <w:p>
+            <w:pPr>
+              <w:jc w:val="center"/>
+            </w:pPr>
+            <w:r>
+              <w:rPr>
+                <w:rFonts w:ascii="Calibri" w:cs="Calibri" w:eastAsia="Calibri" w:hAnsi="Calibri"/>
+                <w:b w:val="false"/>
+                <w:bCs w:val="false"/>
+                <w:color w:val="000000"/>
+                <w:sz w:val="20"/>
+                <w:szCs w:val="20"/>
+              </w:rPr>
+              <w:t xml:space="preserve">***</w:t>
+            </w:r>
+          </w:p>
+        </w:tc>
+      </w:tr>
+      <w:tr>
+        <w:tc>
+          <w:tcPr>
+            <w:tcW w:type="dxa" w:w="3200"/>
+            <w:tcBorders>
+              <w:top w:val="single" w:color="000000" w:sz="4"/>
+              <w:left w:val="single" w:color="000000" w:sz="4"/>
+              <w:bottom w:val="single" w:color="000000" w:sz="4"/>
+              <w:right w:val="single" w:color="000000" w:sz="4"/>
+            </w:tcBorders>
+            <w:tcMar>
+              <w:top w:type="dxa" w:w="80"/>
+              <w:left w:type="dxa" w:w="120"/>
+              <w:bottom w:type="dxa" w:w="80"/>
+              <w:right w:type="dxa" w:w="120"/>
+            </w:tcMar>
+          </w:tcPr>
+          <w:p>
+            <w:pPr>
+              <w:jc w:val="left"/>
+            </w:pPr>
+            <w:r>
+              <w:rPr>
+                <w:rFonts w:ascii="Calibri" w:cs="Calibri" w:eastAsia="Calibri" w:hAnsi="Calibri"/>
+                <w:b w:val="false"/>
+                <w:bCs w:val="false"/>
+                <w:color w:val="000000"/>
+                <w:sz w:val="20"/>
+                <w:szCs w:val="20"/>
+              </w:rPr>
+              <w:t xml:space="preserve">C vs A: does RF-weather beat naive?</w:t>
+            </w:r>
+          </w:p>
+        </w:tc>
+        <w:tc>
+          <w:tcPr>
+            <w:tcW w:type="dxa" w:w="1200"/>
+            <w:tcBorders>
+              <w:top w:val="single" w:color="000000" w:sz="4"/>
+              <w:left w:val="single" w:color="000000" w:sz="4"/>
+              <w:bottom w:val="single" w:color="000000" w:sz="4"/>
+              <w:right w:val="single" w:color="000000" w:sz="4"/>
+            </w:tcBorders>
+            <w:tcMar>
+              <w:top w:type="dxa" w:w="80"/>
+              <w:left w:type="dxa" w:w="120"/>
+              <w:bottom w:type="dxa" w:w="80"/>
+              <w:right w:type="dxa" w:w="120"/>
+            </w:tcMar>
+          </w:tcPr>
+          <w:p>
+            <w:pPr>
+              <w:jc w:val="center"/>
+            </w:pPr>
+            <w:r>
+              <w:rPr>
+                <w:rFonts w:ascii="Calibri" w:cs="Calibri" w:eastAsia="Calibri" w:hAnsi="Calibri"/>
+                <w:b w:val="false"/>
+                <w:bCs w:val="false"/>
+                <w:color w:val="000000"/>
+                <w:sz w:val="20"/>
+                <w:szCs w:val="20"/>
+              </w:rPr>
+              <w:t xml:space="preserve">-6.48</w:t>
+            </w:r>
+          </w:p>
+        </w:tc>
+        <w:tc>
+          <w:tcPr>
+            <w:tcW w:type="dxa" w:w="1200"/>
+            <w:tcBorders>
+              <w:top w:val="single" w:color="000000" w:sz="4"/>
+              <w:left w:val="single" w:color="000000" w:sz="4"/>
+              <w:bottom w:val="single" w:color="000000" w:sz="4"/>
+              <w:right w:val="single" w:color="000000" w:sz="4"/>
+            </w:tcBorders>
+            <w:tcMar>
+              <w:top w:type="dxa" w:w="80"/>
+              <w:left w:type="dxa" w:w="120"/>
+              <w:bottom w:type="dxa" w:w="80"/>
+              <w:right w:type="dxa" w:w="120"/>
+            </w:tcMar>
+          </w:tcPr>
+          <w:p>
+            <w:pPr>
+              <w:jc w:val="center"/>
+            </w:pPr>
+            <w:r>
+              <w:rPr>
+                <w:rFonts w:ascii="Calibri" w:cs="Calibri" w:eastAsia="Calibri" w:hAnsi="Calibri"/>
+                <w:b w:val="false"/>
+                <w:bCs w:val="false"/>
+                <w:color w:val="000000"/>
+                <w:sz w:val="20"/>
+                <w:szCs w:val="20"/>
+              </w:rPr>
+              <w:t xml:space="preserve">&lt;0.001</w:t>
+            </w:r>
+          </w:p>
+        </w:tc>
+        <w:tc>
+          <w:tcPr>
+            <w:tcW w:type="dxa" w:w="1500"/>
+            <w:tcBorders>
+              <w:top w:val="single" w:color="000000" w:sz="4"/>
+              <w:left w:val="single" w:color="000000" w:sz="4"/>
+              <w:bottom w:val="single" w:color="000000" w:sz="4"/>
+              <w:right w:val="single" w:color="000000" w:sz="4"/>
+            </w:tcBorders>
+            <w:tcMar>
+              <w:top w:type="dxa" w:w="80"/>
+              <w:left w:type="dxa" w:w="120"/>
+              <w:bottom w:type="dxa" w:w="80"/>
+              <w:right w:type="dxa" w:w="120"/>
+            </w:tcMar>
+          </w:tcPr>
+          <w:p>
+            <w:pPr>
+              <w:jc w:val="center"/>
+            </w:pPr>
+            <w:r>
+              <w:rPr>
+                <w:rFonts w:ascii="Calibri" w:cs="Calibri" w:eastAsia="Calibri" w:hAnsi="Calibri"/>
+                <w:b w:val="false"/>
+                <w:bCs w:val="false"/>
+                <w:color w:val="000000"/>
+                <w:sz w:val="20"/>
+                <w:szCs w:val="20"/>
+              </w:rPr>
+              <w:t xml:space="preserve">***</w:t>
+            </w:r>
+          </w:p>
+        </w:tc>
+      </w:tr>
+      <w:tr>
+        <w:tc>
+          <w:tcPr>
+            <w:tcW w:type="dxa" w:w="3200"/>
+            <w:tcBorders>
+              <w:top w:val="single" w:color="000000" w:sz="4"/>
+              <w:left w:val="single" w:color="000000" w:sz="4"/>
+              <w:bottom w:val="single" w:color="000000" w:sz="4"/>
+              <w:right w:val="single" w:color="000000" w:sz="4"/>
+            </w:tcBorders>
+            <w:tcMar>
+              <w:top w:type="dxa" w:w="80"/>
+              <w:left w:type="dxa" w:w="120"/>
+              <w:bottom w:type="dxa" w:w="80"/>
+              <w:right w:type="dxa" w:w="120"/>
+            </w:tcMar>
+          </w:tcPr>
+          <w:p>
+            <w:pPr>
+              <w:jc w:val="left"/>
+            </w:pPr>
+            <w:r>
+              <w:rPr>
+                <w:rFonts w:ascii="Calibri" w:cs="Calibri" w:eastAsia="Calibri" w:hAnsi="Calibri"/>
+                <w:b w:val="false"/>
+                <w:bCs w:val="false"/>
+                <w:color w:val="000000"/>
+                <w:sz w:val="20"/>
+                <w:szCs w:val="20"/>
+              </w:rPr>
+              <w:t xml:space="preserve">B vs A: does RF-no-weather beat naive?</w:t>
+            </w:r>
+          </w:p>
+        </w:tc>
+        <w:tc>
+          <w:tcPr>
+            <w:tcW w:type="dxa" w:w="1200"/>
+            <w:tcBorders>
+              <w:top w:val="single" w:color="000000" w:sz="4"/>
+              <w:left w:val="single" w:color="000000" w:sz="4"/>
+              <w:bottom w:val="single" w:color="000000" w:sz="4"/>
+              <w:right w:val="single" w:color="000000" w:sz="4"/>
+            </w:tcBorders>
+            <w:tcMar>
+              <w:top w:type="dxa" w:w="80"/>
+              <w:left w:type="dxa" w:w="120"/>
+              <w:bottom w:type="dxa" w:w="80"/>
+              <w:right w:type="dxa" w:w="120"/>
+            </w:tcMar>
+          </w:tcPr>
+          <w:p>
+            <w:pPr>
+              <w:jc w:val="center"/>
+            </w:pPr>
+            <w:r>
+              <w:rPr>
+                <w:rFonts w:ascii="Calibri" w:cs="Calibri" w:eastAsia="Calibri" w:hAnsi="Calibri"/>
+                <w:b w:val="false"/>
+                <w:bCs w:val="false"/>
+                <w:color w:val="000000"/>
+                <w:sz w:val="20"/>
+                <w:szCs w:val="20"/>
+              </w:rPr>
+              <w:t xml:space="preserve">-5.68</w:t>
+            </w:r>
+          </w:p>
+        </w:tc>
+        <w:tc>
+          <w:tcPr>
+            <w:tcW w:type="dxa" w:w="1200"/>
+            <w:tcBorders>
+              <w:top w:val="single" w:color="000000" w:sz="4"/>
+              <w:left w:val="single" w:color="000000" w:sz="4"/>
+              <w:bottom w:val="single" w:color="000000" w:sz="4"/>
+              <w:right w:val="single" w:color="000000" w:sz="4"/>
+            </w:tcBorders>
+            <w:tcMar>
+              <w:top w:type="dxa" w:w="80"/>
+              <w:left w:type="dxa" w:w="120"/>
+              <w:bottom w:type="dxa" w:w="80"/>
+              <w:right w:type="dxa" w:w="120"/>
+            </w:tcMar>
+          </w:tcPr>
+          <w:p>
+            <w:pPr>
+              <w:jc w:val="center"/>
+            </w:pPr>
+            <w:r>
+              <w:rPr>
+                <w:rFonts w:ascii="Calibri" w:cs="Calibri" w:eastAsia="Calibri" w:hAnsi="Calibri"/>
+                <w:b w:val="false"/>
+                <w:bCs w:val="false"/>
+                <w:color w:val="000000"/>
+                <w:sz w:val="20"/>
+                <w:szCs w:val="20"/>
+              </w:rPr>
+              <w:t xml:space="preserve">&lt;0.001</w:t>
+            </w:r>
+          </w:p>
+        </w:tc>
+        <w:tc>
+          <w:tcPr>
+            <w:tcW w:type="dxa" w:w="1500"/>
+            <w:tcBorders>
+              <w:top w:val="single" w:color="000000" w:sz="4"/>
+              <w:left w:val="single" w:color="000000" w:sz="4"/>
+              <w:bottom w:val="single" w:color="000000" w:sz="4"/>
+              <w:right w:val="single" w:color="000000" w:sz="4"/>
+            </w:tcBorders>
+            <w:tcMar>
+              <w:top w:type="dxa" w:w="80"/>
+              <w:left w:type="dxa" w:w="120"/>
+              <w:bottom w:type="dxa" w:w="80"/>
+              <w:right w:type="dxa" w:w="120"/>
+            </w:tcMar>
+          </w:tcPr>
+          <w:p>
+            <w:pPr>
+              <w:jc w:val="center"/>
+            </w:pPr>
+            <w:r>
+              <w:rPr>
+                <w:rFonts w:ascii="Calibri" w:cs="Calibri" w:eastAsia="Calibri" w:hAnsi="Calibri"/>
+                <w:b w:val="false"/>
+                <w:bCs w:val="false"/>
+                <w:color w:val="000000"/>
+                <w:sz w:val="20"/>
+                <w:szCs w:val="20"/>
+              </w:rPr>
+              <w:t xml:space="preserve">***</w:t>
+            </w:r>
+          </w:p>
+        </w:tc>
+      </w:tr>
+      <w:tr>
+        <w:tc>
+          <w:tcPr>
+            <w:tcW w:type="dxa" w:w="3200"/>
+            <w:tcBorders>
+              <w:top w:val="single" w:color="000000" w:sz="4"/>
+              <w:left w:val="single" w:color="000000" w:sz="4"/>
+              <w:bottom w:val="single" w:color="000000" w:sz="4"/>
+              <w:right w:val="single" w:color="000000" w:sz="4"/>
+            </w:tcBorders>
+            <w:tcMar>
+              <w:top w:type="dxa" w:w="80"/>
+              <w:left w:type="dxa" w:w="120"/>
+              <w:bottom w:type="dxa" w:w="80"/>
+              <w:right w:type="dxa" w:w="120"/>
+            </w:tcMar>
+          </w:tcPr>
+          <w:p>
+            <w:pPr>
+              <w:jc w:val="left"/>
+            </w:pPr>
+            <w:r>
+              <w:rPr>
+                <w:rFonts w:ascii="Calibri" w:cs="Calibri" w:eastAsia="Calibri" w:hAnsi="Calibri"/>
+                <w:b w:val="false"/>
+                <w:bCs w:val="false"/>
+                <w:color w:val="000000"/>
+                <w:sz w:val="20"/>
+                <w:szCs w:val="20"/>
+              </w:rPr>
+              <w:t xml:space="preserve">D vs C: XGBoost vs RF-weather?</w:t>
+            </w:r>
+          </w:p>
+        </w:tc>
+        <w:tc>
+          <w:tcPr>
+            <w:tcW w:type="dxa" w:w="1200"/>
+            <w:tcBorders>
+              <w:top w:val="single" w:color="000000" w:sz="4"/>
+              <w:left w:val="single" w:color="000000" w:sz="4"/>
+              <w:bottom w:val="single" w:color="000000" w:sz="4"/>
+              <w:right w:val="single" w:color="000000" w:sz="4"/>
+            </w:tcBorders>
+            <w:tcMar>
+              <w:top w:type="dxa" w:w="80"/>
+              <w:left w:type="dxa" w:w="120"/>
+              <w:bottom w:type="dxa" w:w="80"/>
+              <w:right w:type="dxa" w:w="120"/>
+            </w:tcMar>
+          </w:tcPr>
+          <w:p>
+            <w:pPr>
+              <w:jc w:val="center"/>
+            </w:pPr>
+            <w:r>
+              <w:rPr>
+                <w:rFonts w:ascii="Calibri" w:cs="Calibri" w:eastAsia="Calibri" w:hAnsi="Calibri"/>
+                <w:b w:val="false"/>
+                <w:bCs w:val="false"/>
+                <w:color w:val="000000"/>
+                <w:sz w:val="20"/>
+                <w:szCs w:val="20"/>
+              </w:rPr>
+              <w:t xml:space="preserve">+26.57</w:t>
+            </w:r>
+          </w:p>
+        </w:tc>
+        <w:tc>
+          <w:tcPr>
+            <w:tcW w:type="dxa" w:w="1200"/>
+            <w:tcBorders>
+              <w:top w:val="single" w:color="000000" w:sz="4"/>
+              <w:left w:val="single" w:color="000000" w:sz="4"/>
+              <w:bottom w:val="single" w:color="000000" w:sz="4"/>
+              <w:right w:val="single" w:color="000000" w:sz="4"/>
+            </w:tcBorders>
+            <w:tcMar>
+              <w:top w:type="dxa" w:w="80"/>
+              <w:left w:type="dxa" w:w="120"/>
+              <w:bottom w:type="dxa" w:w="80"/>
+              <w:right w:type="dxa" w:w="120"/>
+            </w:tcMar>
+          </w:tcPr>
+          <w:p>
+            <w:pPr>
+              <w:jc w:val="center"/>
+            </w:pPr>
+            <w:r>
+              <w:rPr>
+                <w:rFonts w:ascii="Calibri" w:cs="Calibri" w:eastAsia="Calibri" w:hAnsi="Calibri"/>
+                <w:b w:val="false"/>
+                <w:bCs w:val="false"/>
+                <w:color w:val="000000"/>
+                <w:sz w:val="20"/>
+                <w:szCs w:val="20"/>
+              </w:rPr>
+              <w:t xml:space="preserve">&lt;0.001</w:t>
+            </w:r>
+          </w:p>
+        </w:tc>
+        <w:tc>
+          <w:tcPr>
+            <w:tcW w:type="dxa" w:w="1500"/>
+            <w:tcBorders>
+              <w:top w:val="single" w:color="000000" w:sz="4"/>
+              <w:left w:val="single" w:color="000000" w:sz="4"/>
+              <w:bottom w:val="single" w:color="000000" w:sz="4"/>
+              <w:right w:val="single" w:color="000000" w:sz="4"/>
+            </w:tcBorders>
+            <w:tcMar>
+              <w:top w:type="dxa" w:w="80"/>
+              <w:left w:type="dxa" w:w="120"/>
+              <w:bottom w:type="dxa" w:w="80"/>
+              <w:right w:type="dxa" w:w="120"/>
+            </w:tcMar>
+          </w:tcPr>
+          <w:p>
+            <w:pPr>
+              <w:jc w:val="center"/>
+            </w:pPr>
+            <w:r>
+              <w:rPr>
+                <w:rFonts w:ascii="Calibri" w:cs="Calibri" w:eastAsia="Calibri" w:hAnsi="Calibri"/>
+                <w:b w:val="false"/>
+                <w:bCs w:val="false"/>
+                <w:color w:val="000000"/>
+                <w:sz w:val="20"/>
+                <w:szCs w:val="20"/>
+              </w:rPr>
+              <w:t xml:space="preserve">***</w:t>
+            </w:r>
+          </w:p>
+        </w:tc>
+      </w:tr>
+    </w:tbl>
+    <w:p>
+      <w:pPr>
+        <w:spacing w:after="60" w:before="60"/>
+      </w:pPr>
+      <w:r>
+        <w:rPr>
+          <w:rFonts w:ascii="Calibri" w:cs="Calibri" w:eastAsia="Calibri" w:hAnsi="Calibri"/>
+          <w:color w:val="000000"/>
+          <w:sz w:val="24"/>
+          <w:szCs w:val="24"/>
+        </w:rPr>
+        <w:t xml:space="preserve"/>
+      </w:r>
+    </w:p>
+    <w:p>
+      <w:pPr>
+        <w:spacing w:after="100" w:before="100" w:line="276" w:lineRule="auto"/>
+        <w:jc w:val="center"/>
+      </w:pPr>
+      <w:r>
+        <w:rPr>
+          <w:rFonts w:ascii="Calibri" w:cs="Calibri" w:eastAsia="Calibri" w:hAnsi="Calibri"/>
+          <w:b w:val="false"/>
+          <w:bCs w:val="false"/>
+          <w:i/>
+          <w:iCs/>
+          <w:color w:val="000000"/>
+          <w:sz w:val="24"/>
+          <w:szCs w:val="24"/>
+        </w:rPr>
+        <w:t xml:space="preserve">Table 2c — Diebold-Mariano tests for 2022 crisis period. *** p&lt;0.001.</w:t>
+      </w:r>
+    </w:p>
+    <w:p>
+      <w:pPr>
+        <w:spacing w:after="120" w:before="120"/>
+      </w:pPr>
+      <w:r>
+        <w:rPr>
+          <w:rFonts w:ascii="Calibri" w:cs="Calibri" w:eastAsia="Calibri" w:hAnsi="Calibri"/>
+          <w:color w:val="000000"/>
+          <w:sz w:val="24"/>
+          <w:szCs w:val="24"/>
+        </w:rPr>
+        <w:t xml:space="preserve"/>
+      </w:r>
+    </w:p>
+    <w:p>
+      <w:pPr>
+        <w:spacing w:after="100" w:before="100" w:line="276" w:lineRule="auto"/>
+        <w:jc w:val="both"/>
+      </w:pPr>
+      <w:r>
+        <w:rPr>
+          <w:rFonts w:ascii="Calibri" w:cs="Calibri" w:eastAsia="Calibri" w:hAnsi="Calibri"/>
+          <w:b w:val="false"/>
+          <w:bCs w:val="false"/>
+          <w:i w:val="false"/>
+          <w:iCs w:val="false"/>
+          <w:color w:val="000000"/>
+          <w:sz w:val="24"/>
+          <w:szCs w:val="24"/>
+        </w:rPr>
+        <w:t xml:space="preserve">Three key findings emerge from the 2022 validation. First, all models degrade sharply relative to the stable-period results — MAE roughly quadruples, reflecting the extreme price environment. Second, and critically, weather features become highly significant in 2022 (DM = -13.27, p &lt; 0.001): Model C reduces MAE by 0.73 EUR/MWh over Model B, reversing the non-significant result from the stable period. Third, the XGBoost performance gap widens dramatically in the crisis regime (MAE 76.32 vs 66.55 EUR/MWh for RF), suggesting that boosting's sequential residual-fitting is especially vulnerable to the outlier prices of 2022.</w:t>
+      </w:r>
+    </w:p>
+    <w:p>
+      <w:pPr>
+        <w:spacing w:after="120" w:before="280"/>
+      </w:pPr>
+      <w:r>
+        <w:rPr>
+          <w:rFonts w:ascii="Calibri" w:cs="Calibri" w:eastAsia="Calibri" w:hAnsi="Calibri"/>
+          <w:b/>
+          <w:bCs/>
+          <w:color w:val="000000"/>
+          <w:sz w:val="28"/>
+          <w:szCs w:val="28"/>
+        </w:rPr>
+        <w:t xml:space="preserve">4.8 Explanation of the Central Result</w:t>
       </w:r>
     </w:p>
     <w:p>
@@ -10935,7 +15144,7 @@
           <w:sz w:val="28"/>
           <w:szCs w:val="28"/>
         </w:rPr>
-        <w:t xml:space="preserve">6.1 The Central Finding: Weather Is Not Significant</w:t>
+        <w:t xml:space="preserve">6.1 The Central Finding: Weather Is Regime-Dependent</w:t>
       </w:r>
     </w:p>
     <w:p>
@@ -10954,7 +15163,7 @@
           <w:sz w:val="24"/>
           <w:szCs w:val="24"/>
         </w:rPr>
-        <w:t xml:space="preserve">The non-significance of weather features (p = 0.572, DM test) is the thesis's primary empirical contribution. This result runs counter to the intuitive expectation that temperature, wind, and solar radiation — which directly drive electricity demand and renewable generation supply — should be informative for price prediction.</w:t>
+        <w:t xml:space="preserve">The central empirical finding of this thesis has two parts. In the stable 2024-25 market regime, weather features do not significantly improve forecast accuracy (DM test p = 0.572). However, during the 2022 energy crisis, weather features become highly significant (DM = -13.27, p &lt; 0.001), reducing MAE by 0.73 EUR/MWh over the fundamentals-only model. The marginal value of meteorological variables is therefore not a fixed property of the French market, but depends on the prevailing market regime.</w:t>
       </w:r>
     </w:p>
     <w:p>
@@ -10989,7 +15198,7 @@
           <w:sz w:val="24"/>
           <w:szCs w:val="24"/>
         </w:rPr>
-        <w:t xml:space="preserve">We argue that the apparent paradox resolves once we recognise that weather information is already embedded in other features:</w:t>
+        <w:t xml:space="preserve">In stable market conditions, weather information is already embedded in other features through three channels:</w:t>
       </w:r>
     </w:p>
     <w:p>
@@ -11008,7 +15217,7 @@
           <w:sz w:val="24"/>
           <w:szCs w:val="24"/>
         </w:rPr>
-        <w:t xml:space="preserve">Load forecast as a temperature proxy: RTE's published load forecast already incorporates temperature forecasts. Including this feature implicitly conditions on temperature-adjusted demand, making the raw temperature variable redundant.</w:t>
+        <w:t xml:space="preserve">Load forecast as a temperature proxy: RTE's published load forecast already incorporates temperature forecasts. The correlation between HDD and the RTE load forecast exceeds r &gt; 0.60. Including this feature implicitly conditions on temperature-adjusted demand, making the raw temperature variable redundant.</w:t>
       </w:r>
     </w:p>
     <w:p>
@@ -11046,7 +15255,7 @@
           <w:sz w:val="24"/>
           <w:szCs w:val="24"/>
         </w:rPr>
-        <w:t xml:space="preserve">Nuclear availability dominance: the nuclear availability ratio explains a disproportionate share of price variance in France. With this feature included, residual variance is already low, leaving little room for weather variables to contribute.</w:t>
+        <w:t xml:space="preserve">Nuclear availability dominance: the nuclear availability ratio explains a disproportionate share of price variance in France. With this feature included, residual variance is already low, leaving little room for weather variables to contribute independently.</w:t>
       </w:r>
     </w:p>
     <w:p>
@@ -11062,7 +15271,7 @@
           <w:sz w:val="26"/>
           <w:szCs w:val="26"/>
         </w:rPr>
-        <w:t xml:space="preserve">6.1.2 Implications for Forecasting Practice</w:t>
+        <w:t xml:space="preserve">6.1.2 Why the Crisis Breaks Redundancy</w:t>
       </w:r>
     </w:p>
     <w:p>
@@ -11081,58 +15290,7 @@
           <w:sz w:val="24"/>
           <w:szCs w:val="24"/>
         </w:rPr>
-        <w:t xml:space="preserve">Building a rich fundamental model that includes cross-border flows, fuel prices, and nuclear availability may be sufficient to capture the weather signal implicitly in the French market. The additional cost and complexity of integrating real-time weather forecasts may not be justified, provided that these fundamentals are available. This result may not generalise to markets with higher renewable penetration, such as Germany, where the direct impact of weather on supply is less likely to be captured by fuel prices or load forecasts alone.</w:t>
-      </w:r>
-    </w:p>
-    <w:p>
-      <w:pPr>
-        <w:spacing w:after="120" w:before="280"/>
-      </w:pPr>
-      <w:r>
-        <w:rPr>
-          <w:rFonts w:ascii="Calibri" w:cs="Calibri" w:eastAsia="Calibri" w:hAnsi="Calibri"/>
-          <w:b/>
-          <w:bCs/>
-          <w:color w:val="000000"/>
-          <w:sz w:val="28"/>
-          <w:szCs w:val="28"/>
-        </w:rPr>
-        <w:t xml:space="preserve">6.2 XGBoost Underperformance</w:t>
-      </w:r>
-    </w:p>
-    <w:p>
-      <w:pPr>
-        <w:spacing w:after="100" w:before="100" w:line="276" w:lineRule="auto"/>
-        <w:jc w:val="both"/>
-      </w:pPr>
-      <w:r>
-        <w:rPr>
-          <w:rFonts w:ascii="Calibri" w:cs="Calibri" w:eastAsia="Calibri" w:hAnsi="Calibri"/>
-          <w:b w:val="false"/>
-          <w:bCs w:val="false"/>
-          <w:i w:val="false"/>
-          <w:iCs w:val="false"/>
-          <w:color w:val="000000"/>
-          <w:sz w:val="24"/>
-          <w:szCs w:val="24"/>
-        </w:rPr>
-        <w:t xml:space="preserve">XGBoost's sequential boosting mechanism may be more susceptible to the extreme price observations present in the training set (2022 crisis prices above 1,000 EUR/MWh). Each boosting iteration gives elevated weight to poorly-fitted observations; in the presence of genuine outliers driven by extraordinary events, this can lead to overfitting to the crisis regime at the expense of normal-market performance. Systematic hyperparameter optimisation using Bayesian search with a temporal validation strategy could close or reverse the performance gap.</w:t>
-      </w:r>
-    </w:p>
-    <w:p>
-      <w:pPr>
-        <w:spacing w:after="120" w:before="280"/>
-      </w:pPr>
-      <w:r>
-        <w:rPr>
-          <w:rFonts w:ascii="Calibri" w:cs="Calibri" w:eastAsia="Calibri" w:hAnsi="Calibri"/>
-          <w:b/>
-          <w:bCs/>
-          <w:color w:val="000000"/>
-          <w:sz w:val="28"/>
-          <w:szCs w:val="28"/>
-        </w:rPr>
-        <w:t xml:space="preserve">6.3 Limitations</w:t>
+        <w:t xml:space="preserve">The 2022 energy crisis disrupted all three redundancy channels, making raw meteorological variables directly informative for the first time:</w:t>
       </w:r>
     </w:p>
     <w:p>
@@ -11151,7 +15309,7 @@
           <w:sz w:val="24"/>
           <w:szCs w:val="24"/>
         </w:rPr>
-        <w:t xml:space="preserve">Static model: both models are trained once on 2018-2024 data. In production, periodic retraining (monthly or quarterly) would be needed to adapt to structural market changes.</w:t>
+        <w:t xml:space="preserve">Decoupling of TTF and local temperature: Russian gas curtailments drove TTF prices based on geopolitical supply factors, not European heating demand. TTF lost its weather signal — rising regardless of temperatures. The indirect weather channel through gas prices was severed, and raw temperature became directly informative about demand-driven price pressure.</w:t>
       </w:r>
     </w:p>
     <w:p>
@@ -11170,7 +15328,7 @@
           <w:sz w:val="24"/>
           <w:szCs w:val="24"/>
         </w:rPr>
-        <w:t xml:space="preserve">Price spike forecasting: both models systematically underestimate extreme price events (above 200 EUR/MWh). A two-stage model (spike classifier + regression) or quantile regression could improve performance in the tails.</w:t>
+        <w:t xml:space="preserve">Nuclear constraint amplification: with nuclear availability falling to approximately 40% (versus the typical 70-75%), there was no generation buffer to absorb demand shocks. A cold spell that would normally be absorbed by the flexible reserve forced dispatch of expensive gas and oil peaker units. This non-linear amplification made the temperature-to-price channel directly visible and statistically detectable.</w:t>
       </w:r>
     </w:p>
     <w:p>
@@ -11189,7 +15347,93 @@
           <w:sz w:val="24"/>
           <w:szCs w:val="24"/>
         </w:rPr>
-        <w:t xml:space="preserve">Negative price handling: the French market has growing frequency of negative prices in spring-summer; the models may not fully capture dynamics below zero.</w:t>
+        <w:t xml:space="preserve">Higher signal-to-noise ratio: the extreme price levels of 2022 produced larger absolute prediction errors across all models. Even a modest MAE improvement of 0.73 EUR/MWh (attributable to weather features) becomes statistically detectable by the DM test against this high-variance background.</w:t>
+      </w:r>
+    </w:p>
+    <w:p>
+      <w:pPr>
+        <w:spacing w:after="100" w:before="200"/>
+      </w:pPr>
+      <w:r>
+        <w:rPr>
+          <w:rFonts w:ascii="Calibri" w:cs="Calibri" w:eastAsia="Calibri" w:hAnsi="Calibri"/>
+          <w:b/>
+          <w:bCs/>
+          <w:color w:val="000000"/>
+          <w:sz w:val="26"/>
+          <w:szCs w:val="26"/>
+        </w:rPr>
+        <w:t xml:space="preserve">6.1.3 Implications</w:t>
+      </w:r>
+    </w:p>
+    <w:p>
+      <w:pPr>
+        <w:spacing w:after="100" w:before="100" w:line="276" w:lineRule="auto"/>
+        <w:jc w:val="both"/>
+      </w:pPr>
+      <w:r>
+        <w:rPr>
+          <w:rFonts w:ascii="Calibri" w:cs="Calibri" w:eastAsia="Calibri" w:hAnsi="Calibri"/>
+          <w:b w:val="false"/>
+          <w:bCs w:val="false"/>
+          <w:i w:val="false"/>
+          <w:iCs w:val="false"/>
+          <w:color w:val="000000"/>
+          <w:sz w:val="24"/>
+          <w:szCs w:val="24"/>
+        </w:rPr>
+        <w:t xml:space="preserve">These findings carry practical implications at three levels. For stable market conditions (the base case): fundamental models incorporating load forecast, fuel prices, nuclear availability, and cross-border flows are sufficient. The additional cost and operational complexity of integrating real-time weather forecasts is not statistically justified. For crisis market conditions: weather features provide significant incremental value and should be retained. We recommend a regime-switching approach triggered by observable indicators — specifically, nuclear availability ratio falling below 0.55 or TTF volatility exceeding historical norms — that activates the full weather feature set. For cross-market applicability: these results are specific to the French market. In Germany, where renewable penetration exceeds 50%, the direct supply-side impact of wind and solar on prices is unlikely to be fully captured by fuel prices or load forecasts, and weather features are expected to be significant even in stable regimes.</w:t>
+      </w:r>
+    </w:p>
+    <w:p>
+      <w:pPr>
+        <w:spacing w:after="120" w:before="280"/>
+      </w:pPr>
+      <w:r>
+        <w:rPr>
+          <w:rFonts w:ascii="Calibri" w:cs="Calibri" w:eastAsia="Calibri" w:hAnsi="Calibri"/>
+          <w:b/>
+          <w:bCs/>
+          <w:color w:val="000000"/>
+          <w:sz w:val="28"/>
+          <w:szCs w:val="28"/>
+        </w:rPr>
+        <w:t xml:space="preserve">6.2 XGBoost Underperformance</w:t>
+      </w:r>
+    </w:p>
+    <w:p>
+      <w:pPr>
+        <w:spacing w:after="100" w:before="100" w:line="276" w:lineRule="auto"/>
+        <w:jc w:val="both"/>
+      </w:pPr>
+      <w:r>
+        <w:rPr>
+          <w:rFonts w:ascii="Calibri" w:cs="Calibri" w:eastAsia="Calibri" w:hAnsi="Calibri"/>
+          <w:b w:val="false"/>
+          <w:bCs w:val="false"/>
+          <w:i w:val="false"/>
+          <w:iCs w:val="false"/>
+          <w:color w:val="000000"/>
+          <w:sz w:val="24"/>
+          <w:szCs w:val="24"/>
+        </w:rPr>
+        <w:t xml:space="preserve">XGBoost's sequential boosting mechanism appears more susceptible to the extreme price observations in the training set (2022 crisis prices above 1,000 EUR/MWh). Each boosting iteration gives elevated weight to poorly-fitted observations; in the presence of genuine outliers driven by extraordinary events, this can lead to overfitting to the crisis regime at the expense of normal-market performance. This pattern is confirmed by the 2022 validation experiment, where the XGBoost performance gap widens dramatically (MAE 76.32 vs 66.55 EUR/MWh for RF). Systematic hyperparameter optimisation using Bayesian search with a temporal validation strategy could close or reverse the performance gap in the stable period.</w:t>
+      </w:r>
+    </w:p>
+    <w:p>
+      <w:pPr>
+        <w:spacing w:after="120" w:before="280"/>
+      </w:pPr>
+      <w:r>
+        <w:rPr>
+          <w:rFonts w:ascii="Calibri" w:cs="Calibri" w:eastAsia="Calibri" w:hAnsi="Calibri"/>
+          <w:b/>
+          <w:bCs/>
+          <w:color w:val="000000"/>
+          <w:sz w:val="28"/>
+          <w:szCs w:val="28"/>
+        </w:rPr>
+        <w:t xml:space="preserve">6.3 Limitations</w:t>
       </w:r>
     </w:p>
     <w:p>
@@ -11208,7 +15452,7 @@
           <w:sz w:val="24"/>
           <w:szCs w:val="24"/>
         </w:rPr>
-        <w:t xml:space="preserve">Single test period: 12 months of one market regime. A rolling out-of-sample evaluation over multiple years would provide more robust assessment.</w:t>
+        <w:t xml:space="preserve">Static model: both models are trained once on 2018-2024 data. In production, periodic retraining (monthly or quarterly) would be needed to adapt to structural market changes.</w:t>
       </w:r>
     </w:p>
     <w:p>
@@ -11227,6 +15471,82 @@
           <w:sz w:val="24"/>
           <w:szCs w:val="24"/>
         </w:rPr>
+        <w:t xml:space="preserve">Price spike forecasting: both models systematically underestimate extreme price events (above 200 EUR/MWh). A two-stage model (spike classifier + regression) or quantile regression could improve performance in the tails.</w:t>
+      </w:r>
+    </w:p>
+    <w:p>
+      <w:pPr>
+        <w:pStyle w:val="ListParagraph"/>
+        <w:numPr>
+          <w:ilvl w:val="0"/>
+          <w:numId w:val="2"/>
+        </w:numPr>
+        <w:spacing w:after="80" w:before="80"/>
+      </w:pPr>
+      <w:r>
+        <w:rPr>
+          <w:rFonts w:ascii="Calibri" w:cs="Calibri" w:eastAsia="Calibri" w:hAnsi="Calibri"/>
+          <w:color w:val="000000"/>
+          <w:sz w:val="24"/>
+          <w:szCs w:val="24"/>
+        </w:rPr>
+        <w:t xml:space="preserve">Negative price handling: the French market has growing frequency of negative prices in spring-summer; the models may not fully capture dynamics below zero.</w:t>
+      </w:r>
+    </w:p>
+    <w:p>
+      <w:pPr>
+        <w:pStyle w:val="ListParagraph"/>
+        <w:numPr>
+          <w:ilvl w:val="0"/>
+          <w:numId w:val="2"/>
+        </w:numPr>
+        <w:spacing w:after="80" w:before="80"/>
+      </w:pPr>
+      <w:r>
+        <w:rPr>
+          <w:rFonts w:ascii="Calibri" w:cs="Calibri" w:eastAsia="Calibri" w:hAnsi="Calibri"/>
+          <w:color w:val="000000"/>
+          <w:sz w:val="24"/>
+          <w:szCs w:val="24"/>
+        </w:rPr>
+        <w:t xml:space="preserve">Single primary test period: 12 months of one market regime. The 2022 crisis validation partially addresses this, but a rolling out-of-sample evaluation over multiple years would provide more robust assessment.</w:t>
+      </w:r>
+    </w:p>
+    <w:p>
+      <w:pPr>
+        <w:pStyle w:val="ListParagraph"/>
+        <w:numPr>
+          <w:ilvl w:val="0"/>
+          <w:numId w:val="2"/>
+        </w:numPr>
+        <w:spacing w:after="80" w:before="80"/>
+      </w:pPr>
+      <w:r>
+        <w:rPr>
+          <w:rFonts w:ascii="Calibri" w:cs="Calibri" w:eastAsia="Calibri" w:hAnsi="Calibri"/>
+          <w:color w:val="000000"/>
+          <w:sz w:val="24"/>
+          <w:szCs w:val="24"/>
+        </w:rPr>
+        <w:t xml:space="preserve">Missing EU ETS carbon allowances: European carbon allowance prices (EUA) are not included in the feature set despite their theoretical relevance to generation costs for gas and coal plants. This is acknowledged as a data limitation; EUA inclusion is left for future work.</w:t>
+      </w:r>
+    </w:p>
+    <w:p>
+      <w:pPr>
+        <w:pStyle w:val="ListParagraph"/>
+        <w:numPr>
+          <w:ilvl w:val="0"/>
+          <w:numId w:val="2"/>
+        </w:numPr>
+        <w:spacing w:after="80" w:before="80"/>
+      </w:pPr>
+      <w:r>
+        <w:rPr>
+          <w:rFonts w:ascii="Calibri" w:cs="Calibri" w:eastAsia="Calibri" w:hAnsi="Calibri"/>
+          <w:color w:val="000000"/>
+          <w:sz w:val="24"/>
+          <w:szCs w:val="24"/>
+        </w:rPr>
         <w:t xml:space="preserve">Perfect execution assumed in backtest: no slippage, no partial fills, 1 MW position size throughout.</w:t>
       </w:r>
     </w:p>
@@ -11436,7 +15756,7 @@
           <w:sz w:val="24"/>
           <w:szCs w:val="24"/>
         </w:rPr>
-        <w:t xml:space="preserve">Second, weather features do not significantly improve forecast accuracy in the French market (DM test p = 0.572). The information redundancy hypothesis — that load forecast, TTF gas price, and nuclear availability already implicitly encode the relevant meteorological information — explains this surprising result. This is the thesis's primary empirical contribution.</w:t>
+        <w:t xml:space="preserve">Second, the role of weather is regime-dependent. In the stable 2024-25 period, weather features are not statistically significant (DM test p = 0.572): load forecast, TTF gas price, and nuclear availability already implicitly encode the meteorological signal. In the 2022 energy crisis, however, weather features become highly significant (DM = -13.27, p &lt; 0.001), reducing MAE by 0.73 EUR/MWh. The Russian gas supply crisis decoupled TTF from local temperature, nuclear constraints removed the demand-absorption buffer, and the resulting non-linearities made the temperature-to-price channel visible. The marginal value of weather features is therefore regime-dependent — the thesis's primary empirical contribution.</w:t>
       </w:r>
     </w:p>
     <w:p>
@@ -11528,7 +15848,7 @@
           <w:sz w:val="24"/>
           <w:szCs w:val="24"/>
         </w:rPr>
-        <w:t xml:space="preserve">Prioritise fundamental features (load forecast, fuel prices, nuclear availability, cross-border flows) over raw weather variables. Given the ablation result, model development effort is better spent improving fundamental data quality.</w:t>
+        <w:t xml:space="preserve">Prioritise fundamental features (load forecast, fuel prices, nuclear availability, cross-border flows) in stable market regimes — the ablation study confirms weather adds no significant value. Retain weather feature capability for crisis regimes (low nuclear availability, high TTF volatility), where weather becomes significantly informative. A regime-switching trigger based on nuclear availability ratio and TTF volatility is recommended.</w:t>
       </w:r>
     </w:p>
     <w:p>
@@ -11601,7 +15921,7 @@
           <w:sz w:val="24"/>
           <w:szCs w:val="24"/>
         </w:rPr>
-        <w:t xml:space="preserve">The finding that weather is non-significant in the French day-ahead market reflects a broader insight about information aggregation in commodity markets: when market prices (TTF gas) and operational forecasts (RTE load forecast) already incorporate weather expectations, raw meteorological variables become redundant from a statistical standpoint. This principle — that feature selection should account for information already embedded in price-based variables — is likely applicable beyond the electricity market to other commodity forecasting problems.</w:t>
+        <w:t xml:space="preserve">The finding that weather is regime-dependent in the French day-ahead market reflects a broader insight about information aggregation in commodity markets: in normal conditions, market prices (TTF gas) and operational forecasts (RTE load forecast) already incorporate weather expectations, rendering raw meteorological variables statistically redundant. But when extraordinary supply shocks decouple these indirect channels — as occurred during the 2022 Russian gas curtailments — the direct weather signal re-emerges. This principle — that the marginal value of any feature depends on what indirect channels are still functioning — is likely applicable beyond the electricity market to other commodity forecasting problems subject to structural regime changes.</w:t>
       </w:r>
     </w:p>
     <w:p>

</xml_diff>

<commit_message>
update outputs: APA style, AI note, acknowledgements, abstract fix
- Thesis_FR_Power_Prices.docx: add Acknowledgements section with AI transparency note,
  fix abstract (remove EU ETS carbon allowances), update keywords
- Thesis_FR_Power_Prices.pdf: recompiled with apalike bibliography style
- Thesis_FR_Power_Prices_Without_Code.pdf: recompiled with apalike bibliography style
</commit_message>
<xml_diff>
--- a/outputs/Thesis_FR_Power_Prices.docx
+++ b/outputs/Thesis_FR_Power_Prices.docx
@@ -262,8 +262,6 @@
       <w:r>
         <w:br/>
         <w:t xml:space="preserve"/>
-      </w:r>
-      <w:r>
         <w:br w:type="page"/>
       </w:r>
     </w:p>
@@ -299,7 +297,7 @@
           <w:sz w:val="24"/>
           <w:szCs w:val="24"/>
         </w:rPr>
-        <w:t xml:space="preserve">This thesis investigates whether weather variables significantly improve day-ahead electricity price forecasting for the French market (EPEX SPOT France) using machine learning models. We build a comprehensive dataset spanning January 2018 to April 2025, combining hourly price and generation data from the ENTSO-E Transparency Platform with ERA5 reanalysis weather data, cross-border flow data, and fuel price series (TTF natural gas, ARA coal, EU ETS carbon allowances).</w:t>
+        <w:t xml:space="preserve">This thesis investigates whether weather variables significantly improve day-ahead electricity price forecasting for the French market (EPEX SPOT France) using machine learning models. We build a comprehensive dataset spanning January 2018 to April 2025, combining hourly price and generation data from the ENTSO-E Transparency Platform with ERA5 reanalysis weather data, cross-border flow data, and fuel price series (TTF natural gas, ARA coal).</w:t>
       </w:r>
     </w:p>
     <w:p>
@@ -370,14 +368,69 @@
           <w:sz w:val="24"/>
           <w:szCs w:val="24"/>
         </w:rPr>
-        <w:t xml:space="preserve">Keywords: electricity price forecasting, day-ahead market, EPEX SPOT France, Random Forest, XGBoost, weather features, Diebold-Mariano test, feature engineering, trading backtest.</w:t>
+        <w:t xml:space="preserve">Keywords: electricity price forecasting, day-ahead market, EPEX SPOT France, Random Forest, XGBoost, weather features, Diebold-Mariano test, information redundancy, 2022 energy crisis, trading backtest.</w:t>
       </w:r>
     </w:p>
     <w:p>
       <w:r>
         <w:br/>
         <w:t xml:space="preserve"/>
-      </w:r>
+        <w:br w:type="page"/>
+      </w:r>
+    </w:p>
+    <w:p>
+      <w:pPr>
+        <w:spacing w:after="160" w:before="400"/>
+      </w:pPr>
+      <w:r>
+        <w:rPr>
+          <w:rFonts w:ascii="Calibri" w:cs="Calibri" w:eastAsia="Calibri" w:hAnsi="Calibri"/>
+          <w:b/>
+          <w:bCs/>
+          <w:color w:val="000000"/>
+          <w:sz w:val="32"/>
+          <w:szCs w:val="32"/>
+        </w:rPr>
+        <w:t xml:space="preserve">Acknowledgements</w:t>
+      </w:r>
+    </w:p>
+    <w:p>
+      <w:pPr>
+        <w:spacing w:after="100" w:before="100" w:line="276" w:lineRule="auto"/>
+        <w:jc w:val="both"/>
+      </w:pPr>
+      <w:r>
+        <w:rPr>
+          <w:rFonts w:ascii="Calibri" w:cs="Calibri" w:eastAsia="Calibri" w:hAnsi="Calibri"/>
+          <w:b w:val="false"/>
+          <w:bCs w:val="false"/>
+          <w:color w:val="000000"/>
+          <w:sz w:val="24"/>
+          <w:szCs w:val="24"/>
+        </w:rPr>
+        <w:t xml:space="preserve">We would like to thank the EDHEC MSc Data Analysis &amp; AI faculty for their guidance throughout this project. We are grateful to RTE (Réseau de Transport d’Électricité) and ENTSO-E for making electricity market data publicly available through the Transparency Platform, and to the Copernicus Climate Change Service for providing open access to ERA5 reanalysis data.</w:t>
+      </w:r>
+    </w:p>
+    <w:p>
+      <w:pPr>
+        <w:spacing w:after="100" w:before="100" w:line="276" w:lineRule="auto"/>
+        <w:jc w:val="both"/>
+      </w:pPr>
+      <w:r>
+        <w:rPr>
+          <w:rFonts w:ascii="Calibri" w:cs="Calibri" w:eastAsia="Calibri" w:hAnsi="Calibri"/>
+          <w:b w:val="false"/>
+          <w:bCs w:val="false"/>
+          <w:i/>
+          <w:iCs/>
+          <w:color w:val="000000"/>
+          <w:sz w:val="24"/>
+          <w:szCs w:val="24"/>
+        </w:rPr>
+        <w:t xml:space="preserve">Transparency note on AI tools: This thesis was developed with assistance from AI language model tools (Claude, Anthropic) for writing support, literature structuring, and code review. All analytical decisions, model choices, experimental design, and interpretations of results are the authors’ own.</w:t>
+      </w:r>
+    </w:p>
+    <w:p>
       <w:r>
         <w:br w:type="page"/>
       </w:r>
@@ -771,8 +824,6 @@
       <w:r>
         <w:br/>
         <w:t xml:space="preserve"/>
-      </w:r>
-      <w:r>
         <w:br w:type="page"/>
       </w:r>
     </w:p>
@@ -1158,8 +1209,6 @@
       <w:r>
         <w:br/>
         <w:t xml:space="preserve"/>
-      </w:r>
-      <w:r>
         <w:br w:type="page"/>
       </w:r>
     </w:p>
@@ -4812,8 +4861,6 @@
       <w:r>
         <w:br/>
         <w:t xml:space="preserve"/>
-      </w:r>
-      <w:r>
         <w:br w:type="page"/>
       </w:r>
     </w:p>
@@ -9434,8 +9481,6 @@
       <w:r>
         <w:br/>
         <w:t xml:space="preserve"/>
-      </w:r>
-      <w:r>
         <w:br w:type="page"/>
       </w:r>
     </w:p>
@@ -15110,8 +15155,6 @@
       <w:r>
         <w:br/>
         <w:t xml:space="preserve"/>
-      </w:r>
-      <w:r>
         <w:br w:type="page"/>
       </w:r>
     </w:p>
@@ -15665,8 +15708,6 @@
       <w:r>
         <w:br/>
         <w:t xml:space="preserve"/>
-      </w:r>
-      <w:r>
         <w:br w:type="page"/>
       </w:r>
     </w:p>
@@ -15982,8 +16023,6 @@
       <w:r>
         <w:br/>
         <w:t xml:space="preserve"/>
-      </w:r>
-      <w:r>
         <w:br w:type="page"/>
       </w:r>
     </w:p>

</xml_diff>